<commit_message>
Geschichte 8: Raster an Gruppenpuzzle angepasst (Anzahl, Bildung, Vorrechte, Pflichten, Mitbestimmung)
Co-Authored-By: Claude Sonnet 5.5 <noreply@anthropic.com>
Claude-Session: https://claude.ai/code/session_01CtRuNVyt8v9M882BKEmgNb
</commit_message>
<xml_diff>
--- a/Geschichte_8/Absolutismus_Wiederholung/Tafelskript_Absolutismus_Wiederholung.docx
+++ b/Geschichte_8/Absolutismus_Wiederholung/Tafelskript_Absolutismus_Wiederholung.docx
@@ -4461,7 +4461,7 @@
                 <w:sz w:val="21"/>
                 <w:szCs w:val="21"/>
               </w:rPr>
-              <w:t xml:space="preserve">Fragen der Reihe nach: Wie heißen die drei Stände? Wie viel Prozent der Bevölkerung? Welche Rechte, welche Pflichten? Durften die Stände mitbestimmen?</w:t>
+              <w:t xml:space="preserve">Fragen der Reihe nach: Wie heißen die drei Stände? Wie viel Prozent der Bevölkerung? Welche Bildung, welche Vorrechte, welche Pflichten? Durften die Stände mitbestimmen?</w:t>
             </w:r>
           </w:p>
           <w:p>
@@ -4557,7 +4557,7 @@
                 </w:tcPr>
                 <w:tbl>
                   <w:tblPr>
-                    <w:tblW w:type="dxa" w:w="8100"/>
+                    <w:tblW w:type="dxa" w:w="8166"/>
                     <w:tblBorders>
                       <w:top w:val="single" w:color="auto" w:sz="4"/>
                       <w:left w:val="single" w:color="auto" w:sz="4"/>
@@ -4568,11 +4568,12 @@
                     </w:tblBorders>
                   </w:tblPr>
                   <w:tblGrid>
-                    <w:gridCol w:w="1150"/>
-                    <w:gridCol w:w="850"/>
-                    <w:gridCol w:w="2100"/>
-                    <w:gridCol w:w="2100"/>
-                    <w:gridCol w:w="1900"/>
+                    <w:gridCol w:w="1000"/>
+                    <w:gridCol w:w="800"/>
+                    <w:gridCol w:w="1350"/>
+                    <w:gridCol w:w="1800"/>
+                    <w:gridCol w:w="1750"/>
+                    <w:gridCol w:w="1466"/>
                   </w:tblGrid>
                   <w:tr>
                     <w:trPr>
@@ -4581,7 +4582,7 @@
                     </w:trPr>
                     <w:tc>
                       <w:tcPr>
-                        <w:tcW w:type="dxa" w:w="1150"/>
+                        <w:tcW w:type="dxa" w:w="1000"/>
                         <w:tcBorders>
                           <w:top w:val="single" w:color="B9C6E8" w:sz="6"/>
                           <w:left w:val="single" w:color="B9C6E8" w:sz="6"/>
@@ -4608,8 +4609,8 @@
                             <w:b/>
                             <w:bCs/>
                             <w:color w:val="FFFFFF"/>
-                            <w:sz w:val="18"/>
-                            <w:szCs w:val="18"/>
+                            <w:sz w:val="15"/>
+                            <w:szCs w:val="15"/>
                           </w:rPr>
                           <w:t xml:space="preserve">Stand</w:t>
                         </w:r>
@@ -4617,7 +4618,7 @@
                     </w:tc>
                     <w:tc>
                       <w:tcPr>
-                        <w:tcW w:type="dxa" w:w="850"/>
+                        <w:tcW w:type="dxa" w:w="800"/>
                         <w:tcBorders>
                           <w:top w:val="single" w:color="B9C6E8" w:sz="6"/>
                           <w:left w:val="single" w:color="B9C6E8" w:sz="6"/>
@@ -4644,16 +4645,16 @@
                             <w:b/>
                             <w:bCs/>
                             <w:color w:val="FFFFFF"/>
-                            <w:sz w:val="18"/>
-                            <w:szCs w:val="18"/>
+                            <w:sz w:val="15"/>
+                            <w:szCs w:val="15"/>
                           </w:rPr>
-                          <w:t xml:space="preserve">Anteil</w:t>
+                          <w:t xml:space="preserve">Anzahl</w:t>
                         </w:r>
                       </w:p>
                     </w:tc>
                     <w:tc>
                       <w:tcPr>
-                        <w:tcW w:type="dxa" w:w="2100"/>
+                        <w:tcW w:type="dxa" w:w="1350"/>
                         <w:tcBorders>
                           <w:top w:val="single" w:color="B9C6E8" w:sz="6"/>
                           <w:left w:val="single" w:color="B9C6E8" w:sz="6"/>
@@ -4680,16 +4681,16 @@
                             <w:b/>
                             <w:bCs/>
                             <w:color w:val="FFFFFF"/>
-                            <w:sz w:val="18"/>
-                            <w:szCs w:val="18"/>
+                            <w:sz w:val="15"/>
+                            <w:szCs w:val="15"/>
                           </w:rPr>
-                          <w:t xml:space="preserve">Rechte</w:t>
+                          <w:t xml:space="preserve">Bildung</w:t>
                         </w:r>
                       </w:p>
                     </w:tc>
                     <w:tc>
                       <w:tcPr>
-                        <w:tcW w:type="dxa" w:w="2100"/>
+                        <w:tcW w:type="dxa" w:w="1800"/>
                         <w:tcBorders>
                           <w:top w:val="single" w:color="B9C6E8" w:sz="6"/>
                           <w:left w:val="single" w:color="B9C6E8" w:sz="6"/>
@@ -4716,16 +4717,16 @@
                             <w:b/>
                             <w:bCs/>
                             <w:color w:val="FFFFFF"/>
-                            <w:sz w:val="18"/>
-                            <w:szCs w:val="18"/>
+                            <w:sz w:val="15"/>
+                            <w:szCs w:val="15"/>
                           </w:rPr>
-                          <w:t xml:space="preserve">Pflichten</w:t>
+                          <w:t xml:space="preserve">Vorrechte</w:t>
                         </w:r>
                       </w:p>
                     </w:tc>
                     <w:tc>
                       <w:tcPr>
-                        <w:tcW w:type="dxa" w:w="1900"/>
+                        <w:tcW w:type="dxa" w:w="1750"/>
                         <w:tcBorders>
                           <w:top w:val="single" w:color="B9C6E8" w:sz="6"/>
                           <w:left w:val="single" w:color="B9C6E8" w:sz="6"/>
@@ -4752,8 +4753,44 @@
                             <w:b/>
                             <w:bCs/>
                             <w:color w:val="FFFFFF"/>
-                            <w:sz w:val="18"/>
-                            <w:szCs w:val="18"/>
+                            <w:sz w:val="15"/>
+                            <w:szCs w:val="15"/>
+                          </w:rPr>
+                          <w:t xml:space="preserve">Pflichten</w:t>
+                        </w:r>
+                      </w:p>
+                    </w:tc>
+                    <w:tc>
+                      <w:tcPr>
+                        <w:tcW w:type="dxa" w:w="1466"/>
+                        <w:tcBorders>
+                          <w:top w:val="single" w:color="B9C6E8" w:sz="6"/>
+                          <w:left w:val="single" w:color="B9C6E8" w:sz="6"/>
+                          <w:bottom w:val="single" w:color="B9C6E8" w:sz="6"/>
+                          <w:right w:val="single" w:color="B9C6E8" w:sz="6"/>
+                        </w:tcBorders>
+                        <w:shd w:fill="3D4A3F" w:color="auto" w:val="clear"/>
+                        <w:tcMar>
+                          <w:top w:type="dxa" w:w="60"/>
+                          <w:left w:type="dxa" w:w="100"/>
+                          <w:bottom w:type="dxa" w:w="60"/>
+                          <w:right w:type="dxa" w:w="100"/>
+                        </w:tcMar>
+                        <w:vAlign w:val="center"/>
+                      </w:tcPr>
+                      <w:p>
+                        <w:pPr>
+                          <w:spacing w:after="0" w:before="0"/>
+                          <w:jc w:val="center"/>
+                        </w:pPr>
+                        <w:r>
+                          <w:rPr>
+                            <w:rFonts w:ascii="Calibri" w:cs="Calibri" w:eastAsia="Calibri" w:hAnsi="Calibri"/>
+                            <w:b/>
+                            <w:bCs/>
+                            <w:color w:val="FFFFFF"/>
+                            <w:sz w:val="15"/>
+                            <w:szCs w:val="15"/>
                           </w:rPr>
                           <w:t xml:space="preserve">Mitbestimmung</w:t>
                         </w:r>
@@ -4767,7 +4804,7 @@
                     </w:trPr>
                     <w:tc>
                       <w:tcPr>
-                        <w:tcW w:type="dxa" w:w="1150"/>
+                        <w:tcW w:type="dxa" w:w="1000"/>
                         <w:tcBorders>
                           <w:top w:val="single" w:color="B9C6E8" w:sz="6"/>
                           <w:left w:val="single" w:color="B9C6E8" w:sz="6"/>
@@ -4803,7 +4840,7 @@
                     </w:tc>
                     <w:tc>
                       <w:tcPr>
-                        <w:tcW w:type="dxa" w:w="850"/>
+                        <w:tcW w:type="dxa" w:w="800"/>
                         <w:tcBorders>
                           <w:top w:val="single" w:color="B9C6E8" w:sz="6"/>
                           <w:left w:val="single" w:color="B9C6E8" w:sz="6"/>
@@ -4837,7 +4874,41 @@
                     </w:tc>
                     <w:tc>
                       <w:tcPr>
-                        <w:tcW w:type="dxa" w:w="2100"/>
+                        <w:tcW w:type="dxa" w:w="1350"/>
+                        <w:tcBorders>
+                          <w:top w:val="single" w:color="B9C6E8" w:sz="6"/>
+                          <w:left w:val="single" w:color="B9C6E8" w:sz="6"/>
+                          <w:bottom w:val="single" w:color="B9C6E8" w:sz="6"/>
+                          <w:right w:val="single" w:color="B9C6E8" w:sz="6"/>
+                        </w:tcBorders>
+                        <w:tcMar>
+                          <w:top w:type="dxa" w:w="60"/>
+                          <w:left w:type="dxa" w:w="100"/>
+                          <w:bottom w:type="dxa" w:w="60"/>
+                          <w:right w:type="dxa" w:w="100"/>
+                        </w:tcMar>
+                        <w:vAlign w:val="center"/>
+                      </w:tcPr>
+                      <w:p>
+                        <w:pPr>
+                          <w:spacing w:after="0" w:before="0"/>
+                        </w:pPr>
+                        <w:r>
+                          <w:rPr>
+                            <w:rFonts w:ascii="Calibri" w:cs="Calibri" w:eastAsia="Calibri" w:hAnsi="Calibri"/>
+                            <w:b w:val="false"/>
+                            <w:bCs w:val="false"/>
+                            <w:color w:val="000000"/>
+                            <w:sz w:val="17"/>
+                            <w:szCs w:val="17"/>
+                          </w:rPr>
+                          <w:t xml:space="preserve">meist hoch: Lesen und Schreiben, Schulen, Universitäten</w:t>
+                        </w:r>
+                      </w:p>
+                    </w:tc>
+                    <w:tc>
+                      <w:tcPr>
+                        <w:tcW w:type="dxa" w:w="1800"/>
                         <w:tcBorders>
                           <w:top w:val="single" w:color="B9C6E8" w:sz="6"/>
                           <w:left w:val="single" w:color="B9C6E8" w:sz="6"/>
@@ -4871,7 +4942,7 @@
                     </w:tc>
                     <w:tc>
                       <w:tcPr>
-                        <w:tcW w:type="dxa" w:w="2100"/>
+                        <w:tcW w:type="dxa" w:w="1750"/>
                         <w:tcBorders>
                           <w:top w:val="single" w:color="B9C6E8" w:sz="6"/>
                           <w:left w:val="single" w:color="B9C6E8" w:sz="6"/>
@@ -4905,7 +4976,7 @@
                     </w:tc>
                     <w:tc>
                       <w:tcPr>
-                        <w:tcW w:type="dxa" w:w="1900"/>
+                        <w:tcW w:type="dxa" w:w="1466"/>
                         <w:tcBorders>
                           <w:top w:val="single" w:color="B9C6E8" w:sz="6"/>
                           <w:left w:val="single" w:color="B9C6E8" w:sz="6"/>
@@ -4933,7 +5004,7 @@
                             <w:sz w:val="17"/>
                             <w:szCs w:val="17"/>
                           </w:rPr>
-                          <w:t xml:space="preserve">Generalstände (je Stand 1 Stimme) – unter Ludwig XIV. nicht einberufen</w:t>
+                          <w:t xml:space="preserve">Generalstände (1 Stimme je Stand), nicht einberufen</w:t>
                         </w:r>
                       </w:p>
                     </w:tc>
@@ -4945,7 +5016,7 @@
                     </w:trPr>
                     <w:tc>
                       <w:tcPr>
-                        <w:tcW w:type="dxa" w:w="1150"/>
+                        <w:tcW w:type="dxa" w:w="1000"/>
                         <w:tcBorders>
                           <w:top w:val="single" w:color="B9C6E8" w:sz="6"/>
                           <w:left w:val="single" w:color="B9C6E8" w:sz="6"/>
@@ -4981,7 +5052,7 @@
                     </w:tc>
                     <w:tc>
                       <w:tcPr>
-                        <w:tcW w:type="dxa" w:w="850"/>
+                        <w:tcW w:type="dxa" w:w="800"/>
                         <w:tcBorders>
                           <w:top w:val="single" w:color="B9C6E8" w:sz="6"/>
                           <w:left w:val="single" w:color="B9C6E8" w:sz="6"/>
@@ -5015,7 +5086,41 @@
                     </w:tc>
                     <w:tc>
                       <w:tcPr>
-                        <w:tcW w:type="dxa" w:w="2100"/>
+                        <w:tcW w:type="dxa" w:w="1350"/>
+                        <w:tcBorders>
+                          <w:top w:val="single" w:color="B9C6E8" w:sz="6"/>
+                          <w:left w:val="single" w:color="B9C6E8" w:sz="6"/>
+                          <w:bottom w:val="single" w:color="B9C6E8" w:sz="6"/>
+                          <w:right w:val="single" w:color="B9C6E8" w:sz="6"/>
+                        </w:tcBorders>
+                        <w:tcMar>
+                          <w:top w:type="dxa" w:w="60"/>
+                          <w:left w:type="dxa" w:w="100"/>
+                          <w:bottom w:type="dxa" w:w="60"/>
+                          <w:right w:type="dxa" w:w="100"/>
+                        </w:tcMar>
+                        <w:vAlign w:val="center"/>
+                      </w:tcPr>
+                      <w:p>
+                        <w:pPr>
+                          <w:spacing w:after="0" w:before="0"/>
+                        </w:pPr>
+                        <w:r>
+                          <w:rPr>
+                            <w:rFonts w:ascii="Calibri" w:cs="Calibri" w:eastAsia="Calibri" w:hAnsi="Calibri"/>
+                            <w:b w:val="false"/>
+                            <w:bCs w:val="false"/>
+                            <w:color w:val="000000"/>
+                            <w:sz w:val="17"/>
+                            <w:szCs w:val="17"/>
+                          </w:rPr>
+                          <w:t xml:space="preserve">Hauslehrer, höfische und militärische Bildung</w:t>
+                        </w:r>
+                      </w:p>
+                    </w:tc>
+                    <w:tc>
+                      <w:tcPr>
+                        <w:tcW w:type="dxa" w:w="1800"/>
                         <w:tcBorders>
                           <w:top w:val="single" w:color="B9C6E8" w:sz="6"/>
                           <w:left w:val="single" w:color="B9C6E8" w:sz="6"/>
@@ -5049,7 +5154,7 @@
                     </w:tc>
                     <w:tc>
                       <w:tcPr>
-                        <w:tcW w:type="dxa" w:w="2100"/>
+                        <w:tcW w:type="dxa" w:w="1750"/>
                         <w:tcBorders>
                           <w:top w:val="single" w:color="B9C6E8" w:sz="6"/>
                           <w:left w:val="single" w:color="B9C6E8" w:sz="6"/>
@@ -5083,7 +5188,7 @@
                     </w:tc>
                     <w:tc>
                       <w:tcPr>
-                        <w:tcW w:type="dxa" w:w="1900"/>
+                        <w:tcW w:type="dxa" w:w="1466"/>
                         <w:tcBorders>
                           <w:top w:val="single" w:color="B9C6E8" w:sz="6"/>
                           <w:left w:val="single" w:color="B9C6E8" w:sz="6"/>
@@ -5111,7 +5216,7 @@
                             <w:sz w:val="17"/>
                             <w:szCs w:val="17"/>
                           </w:rPr>
-                          <w:t xml:space="preserve">wie Klerus: auf dem Papier Generalstände, praktisch keine</w:t>
+                          <w:t xml:space="preserve">wie Klerus: praktisch keine</w:t>
                         </w:r>
                       </w:p>
                     </w:tc>
@@ -5123,7 +5228,7 @@
                     </w:trPr>
                     <w:tc>
                       <w:tcPr>
-                        <w:tcW w:type="dxa" w:w="1150"/>
+                        <w:tcW w:type="dxa" w:w="1000"/>
                         <w:tcBorders>
                           <w:top w:val="single" w:color="B9C6E8" w:sz="6"/>
                           <w:left w:val="single" w:color="B9C6E8" w:sz="6"/>
@@ -5159,7 +5264,7 @@
                     </w:tc>
                     <w:tc>
                       <w:tcPr>
-                        <w:tcW w:type="dxa" w:w="850"/>
+                        <w:tcW w:type="dxa" w:w="800"/>
                         <w:tcBorders>
                           <w:top w:val="single" w:color="B9C6E8" w:sz="6"/>
                           <w:left w:val="single" w:color="B9C6E8" w:sz="6"/>
@@ -5193,7 +5298,41 @@
                     </w:tc>
                     <w:tc>
                       <w:tcPr>
-                        <w:tcW w:type="dxa" w:w="2100"/>
+                        <w:tcW w:type="dxa" w:w="1350"/>
+                        <w:tcBorders>
+                          <w:top w:val="single" w:color="B9C6E8" w:sz="6"/>
+                          <w:left w:val="single" w:color="B9C6E8" w:sz="6"/>
+                          <w:bottom w:val="single" w:color="B9C6E8" w:sz="6"/>
+                          <w:right w:val="single" w:color="B9C6E8" w:sz="6"/>
+                        </w:tcBorders>
+                        <w:tcMar>
+                          <w:top w:type="dxa" w:w="60"/>
+                          <w:left w:type="dxa" w:w="100"/>
+                          <w:bottom w:type="dxa" w:w="60"/>
+                          <w:right w:type="dxa" w:w="100"/>
+                        </w:tcMar>
+                        <w:vAlign w:val="center"/>
+                      </w:tcPr>
+                      <w:p>
+                        <w:pPr>
+                          <w:spacing w:after="0" w:before="0"/>
+                        </w:pPr>
+                        <w:r>
+                          <w:rPr>
+                            <w:rFonts w:ascii="Calibri" w:cs="Calibri" w:eastAsia="Calibri" w:hAnsi="Calibri"/>
+                            <w:b w:val="false"/>
+                            <w:bCs w:val="false"/>
+                            <w:color w:val="000000"/>
+                            <w:sz w:val="17"/>
+                            <w:szCs w:val="17"/>
+                          </w:rPr>
+                          <w:t xml:space="preserve">Bürger: teils Schule und Lehre; Bauern: meist kaum Schulbildung</w:t>
+                        </w:r>
+                      </w:p>
+                    </w:tc>
+                    <w:tc>
+                      <w:tcPr>
+                        <w:tcW w:type="dxa" w:w="1800"/>
                         <w:tcBorders>
                           <w:top w:val="single" w:color="B9C6E8" w:sz="6"/>
                           <w:left w:val="single" w:color="B9C6E8" w:sz="6"/>
@@ -5227,7 +5366,7 @@
                     </w:tc>
                     <w:tc>
                       <w:tcPr>
-                        <w:tcW w:type="dxa" w:w="2100"/>
+                        <w:tcW w:type="dxa" w:w="1750"/>
                         <w:tcBorders>
                           <w:top w:val="single" w:color="B9C6E8" w:sz="6"/>
                           <w:left w:val="single" w:color="B9C6E8" w:sz="6"/>
@@ -5261,7 +5400,7 @@
                     </w:tc>
                     <w:tc>
                       <w:tcPr>
-                        <w:tcW w:type="dxa" w:w="1900"/>
+                        <w:tcW w:type="dxa" w:w="1466"/>
                         <w:tcBorders>
                           <w:top w:val="single" w:color="B9C6E8" w:sz="6"/>
                           <w:left w:val="single" w:color="B9C6E8" w:sz="6"/>
@@ -5289,7 +5428,7 @@
                             <w:sz w:val="17"/>
                             <w:szCs w:val="17"/>
                           </w:rPr>
-                          <w:t xml:space="preserve">formal 1 Stimme gegen 2 (immer überstimmt); praktisch keine</w:t>
+                          <w:t xml:space="preserve">1 Stimme gegen 2, überstimmt; praktisch keine</w:t>
                         </w:r>
                       </w:p>
                     </w:tc>
@@ -5335,7 +5474,7 @@
                 <w:sz w:val="19"/>
                 <w:szCs w:val="19"/>
               </w:rPr>
-              <w:t xml:space="preserve">Zahlen für Frankreich vor 1789. Wurden im Unterricht andere Werte oder Begriffe genutzt, die Tabelle entsprechend anpassen.</w:t>
+              <w:t xml:space="preserve">Zahlen für Frankreich vor 1789. Das Raster entspricht dem Gruppenpuzzle (Anzahl, Bildung, Vorrechte, Pflichten); die Spalte Mitbestimmung ist neu, weil sie im Test vorkommt. Inhalte mit den Gruppenpuzzle-Texten abgleichen und anpassen.</w:t>
             </w:r>
           </w:p>
         </w:tc>
@@ -7012,7 +7151,7 @@
                 <w:sz w:val="20"/>
                 <w:szCs w:val="20"/>
               </w:rPr>
-              <w:t xml:space="preserve">Ständegesellschaft: Stand, Anteil, Rechte, Pflichten, Mitbestimmung</w:t>
+              <w:t xml:space="preserve">Ständegesellschaft: Stand, Anzahl, Bildung, Vorrechte, Pflichten, Mitbestimmung</w:t>
             </w:r>
           </w:p>
         </w:tc>

</xml_diff>

<commit_message>
Geschichte 8: Stände-Inhalte aus den Gruppenpuzzle-Texten übernommen
Co-Authored-By: Claude Sonnet 5.5 <noreply@anthropic.com>
Claude-Session: https://claude.ai/code/session_01CtRuNVyt8v9M882BKEmgNb
</commit_message>
<xml_diff>
--- a/Geschichte_8/Absolutismus_Wiederholung/Tafelskript_Absolutismus_Wiederholung.docx
+++ b/Geschichte_8/Absolutismus_Wiederholung/Tafelskript_Absolutismus_Wiederholung.docx
@@ -3915,7 +3915,7 @@
                 <w:sz w:val="19"/>
                 <w:szCs w:val="19"/>
               </w:rPr>
-              <w:t xml:space="preserve">1 absoluter · 2 Beamte · 3 Intendanten · 4 Steuerfreiheit · 5 Versailles · 6 Merkantilismus · 7 Zölle · 8 Gottesgnadentum · 9 Glaube · 10 stehendes · 11 400.000 · 12 Drittel. Nicht passend: Söldner (Ludwig verzichtete auf sie), Generalstände (wurden nicht einberufen).</w:t>
+              <w:t xml:space="preserve">1 absoluter · 2 Beamte · 3 Intendanten · 4 Steuerfreiheit · 5 Versailles · 6 Merkantilismus · 7 Zölle · 8 Gottesgnadentum · 9 Glaube · 10 stehendes · 11 400.000 · 12 Drittel. Nicht passend: Söldner (Ludwig verzichtete auf sie), Parlament (im Absolutismus kann niemand den König stoppen).</w:t>
             </w:r>
           </w:p>
         </w:tc>
@@ -4461,7 +4461,7 @@
                 <w:sz w:val="21"/>
                 <w:szCs w:val="21"/>
               </w:rPr>
-              <w:t xml:space="preserve">Fragen der Reihe nach: Wie heißen die drei Stände? Wie viel Prozent der Bevölkerung? Welche Bildung, welche Vorrechte, welche Pflichten? Durften die Stände mitbestimmen?</w:t>
+              <w:t xml:space="preserve">Fragen der Reihe nach: Wie heißen die drei Stände? Wie viele Menschen, ungefähr wie viel Prozent? Welche Bildung, welche Vorrechte, welche Pflichten? Durften die Stände mitbestimmen?</w:t>
             </w:r>
           </w:p>
           <w:p>
@@ -4868,7 +4868,7 @@
                             <w:sz w:val="17"/>
                             <w:szCs w:val="17"/>
                           </w:rPr>
-                          <w:t xml:space="preserve">ca. 1 %</w:t>
+                          <w:t xml:space="preserve">ca. 150 000</w:t>
                         </w:r>
                       </w:p>
                     </w:tc>
@@ -4902,7 +4902,7 @@
                             <w:sz w:val="17"/>
                             <w:szCs w:val="17"/>
                           </w:rPr>
-                          <w:t xml:space="preserve">meist hoch: Lesen und Schreiben, Schulen, Universitäten</w:t>
+                          <w:t xml:space="preserve">meist sehr gebildet, fast alle können lesen und schreiben</w:t>
                         </w:r>
                       </w:p>
                     </w:tc>
@@ -4936,7 +4936,7 @@
                             <w:sz w:val="17"/>
                             <w:szCs w:val="17"/>
                           </w:rPr>
-                          <w:t xml:space="preserve">Steuerfreiheit · Zehnt (Abgabe der Bauern) · eigene Gerichte · Landbesitz</w:t>
+                          <w:t xml:space="preserve">keine Steuern · eigene Gerichte · vom Wehrdienst befreit · Kirchenzehnt (10 % vom Einkommen der Bauern und Bürger)</w:t>
                         </w:r>
                       </w:p>
                     </w:tc>
@@ -4970,7 +4970,7 @@
                             <w:sz w:val="17"/>
                             <w:szCs w:val="17"/>
                           </w:rPr>
-                          <w:t xml:space="preserve">Gottesdienst und Seelsorge · Schulen · Armen- und Krankenpflege</w:t>
+                          <w:t xml:space="preserve">Fürsorge für die Armen</w:t>
                         </w:r>
                       </w:p>
                     </w:tc>
@@ -5004,7 +5004,7 @@
                             <w:sz w:val="17"/>
                             <w:szCs w:val="17"/>
                           </w:rPr>
-                          <w:t xml:space="preserve">Generalstände (1 Stimme je Stand), nicht einberufen</w:t>
+                          <w:t xml:space="preserve">im Text nicht genannt</w:t>
                         </w:r>
                       </w:p>
                     </w:tc>
@@ -5080,7 +5080,7 @@
                             <w:sz w:val="17"/>
                             <w:szCs w:val="17"/>
                           </w:rPr>
-                          <w:t xml:space="preserve">ca. 2 %</w:t>
+                          <w:t xml:space="preserve">ca. 500 000</w:t>
                         </w:r>
                       </w:p>
                     </w:tc>
@@ -5114,7 +5114,7 @@
                             <w:sz w:val="17"/>
                             <w:szCs w:val="17"/>
                           </w:rPr>
-                          <w:t xml:space="preserve">Hauslehrer, höfische und militärische Bildung</w:t>
+                          <w:t xml:space="preserve">sehr gebildet, Kinder besuchen die Schule</w:t>
                         </w:r>
                       </w:p>
                     </w:tc>
@@ -5148,7 +5148,7 @@
                             <w:sz w:val="17"/>
                             <w:szCs w:val="17"/>
                           </w:rPr>
-                          <w:t xml:space="preserve">Steuerfreiheit · Jagdrecht · hohe Ämter und Offiziersstellen · Abgaben der Bauern</w:t>
+                          <w:t xml:space="preserve">keine Steuern · alleiniges Jagdrecht · ranghohe Posten in der Armee · bestimmt das politische Geschehen</w:t>
                         </w:r>
                       </w:p>
                     </w:tc>
@@ -5182,7 +5182,7 @@
                             <w:sz w:val="17"/>
                             <w:szCs w:val="17"/>
                           </w:rPr>
-                          <w:t xml:space="preserve">Kriegsdienst für den König · Schutz des Landes · Anwesenheit am Hof</w:t>
+                          <w:t xml:space="preserve">verwaltende Aufgaben · ehrenhaftes Verhalten</w:t>
                         </w:r>
                       </w:p>
                     </w:tc>
@@ -5216,7 +5216,7 @@
                             <w:sz w:val="17"/>
                             <w:szCs w:val="17"/>
                           </w:rPr>
-                          <w:t xml:space="preserve">wie Klerus: praktisch keine</w:t>
+                          <w:t xml:space="preserve">ja, bestimmt das politische Geschehen</w:t>
                         </w:r>
                       </w:p>
                     </w:tc>
@@ -5292,7 +5292,7 @@
                             <w:sz w:val="17"/>
                             <w:szCs w:val="17"/>
                           </w:rPr>
-                          <w:t xml:space="preserve">ca. 97 %</w:t>
+                          <w:t xml:space="preserve">ca. 20 000 000</w:t>
                         </w:r>
                       </w:p>
                     </w:tc>
@@ -5326,7 +5326,7 @@
                             <w:sz w:val="17"/>
                             <w:szCs w:val="17"/>
                           </w:rPr>
-                          <w:t xml:space="preserve">Bürger: teils Schule und Lehre; Bauern: meist kaum Schulbildung</w:t>
+                          <w:t xml:space="preserve">nur wenige können lesen und schreiben</w:t>
                         </w:r>
                       </w:p>
                     </w:tc>
@@ -5360,7 +5360,7 @@
                             <w:sz w:val="17"/>
                             <w:szCs w:val="17"/>
                           </w:rPr>
-                          <w:t xml:space="preserve">keine Privilegien (Bürger: Handel, Bildung; Bauern: Land bewirtschaften)</w:t>
+                          <w:t xml:space="preserve">keine; kaum Aufstiegsmöglichkeit, man wird in den Stand hineingeboren</w:t>
                         </w:r>
                       </w:p>
                     </w:tc>
@@ -5394,7 +5394,7 @@
                             <w:sz w:val="17"/>
                             <w:szCs w:val="17"/>
                           </w:rPr>
-                          <w:t xml:space="preserve">Steuern · Abgaben an Kirche und Grundherren · Frondienste · Arbeit für alle</w:t>
+                          <w:t xml:space="preserve">Steuern und hohe Abgaben · Pachtgebühren an Grundherren · im Krieg Soldaten stellen</w:t>
                         </w:r>
                       </w:p>
                     </w:tc>
@@ -5428,7 +5428,7 @@
                             <w:sz w:val="17"/>
                             <w:szCs w:val="17"/>
                           </w:rPr>
-                          <w:t xml:space="preserve">1 Stimme gegen 2, überstimmt; praktisch keine</w:t>
+                          <w:t xml:space="preserve">ausgeschlossen</w:t>
                         </w:r>
                       </w:p>
                     </w:tc>
@@ -5474,7 +5474,7 @@
                 <w:sz w:val="19"/>
                 <w:szCs w:val="19"/>
               </w:rPr>
-              <w:t xml:space="preserve">Zahlen für Frankreich vor 1789. Das Raster entspricht dem Gruppenpuzzle (Anzahl, Bildung, Vorrechte, Pflichten); die Spalte Mitbestimmung ist neu, weil sie im Test vorkommt. Inhalte mit den Gruppenpuzzle-Texten abgleichen und anpassen.</w:t>
+              <w:t xml:space="preserve">Alle Angaben stammen aus den Gruppenpuzzle-Texten (Klerus, Adel, Bauern und Bürger). Die Texte nennen zur Mitbestimmung des Klerus nichts; hier ggf. ergänzen. Umrechnung der Zahlen: Klerus unter 1 %, Adel ca. 2–3 %, Dritter Stand ca. 97 %.</w:t>
             </w:r>
           </w:p>
         </w:tc>
@@ -5711,7 +5711,21 @@
                       <w:sz w:val="22"/>
                       <w:szCs w:val="22"/>
                     </w:rPr>
-                    <w:t xml:space="preserve">In der Ständegesellschaft gehört jeder Mensch durch Geburt zu einem von drei Ständen: Klerus (ca. 1 %), Adel (ca. 2 %) und Dritter Stand (ca. 97 %). Rechte und Pflichten sind ungleich verteilt. Im Absolutismus hatten die Stände keine Mitbestimmung.</w:t>
+                    <w:t xml:space="preserve">In der Ständegesellschaft gehört jeder Mensch durch Geburt zu einem von drei Ständen: Klerus (ca. 150 000), Adel (ca. 500 000) und Dritter Stand (ca. 20 000 000). Klerus und Adel haben Vorrechte. Der Dritte Stand zahlt Steuern und Abgaben und ist von der politischen Mitbestimmung ausgeschlossen.</w:t>
+                  </w:r>
+                </w:p>
+                <w:p>
+                  <w:pPr>
+                    <w:spacing w:after="50" w:before="0"/>
+                  </w:pPr>
+                  <w:r>
+                    <w:rPr>
+                      <w:rFonts w:ascii="Cambria" w:cs="Cambria" w:eastAsia="Cambria" w:hAnsi="Cambria"/>
+                      <w:color w:val="5B6B8C"/>
+                      <w:sz w:val="20"/>
+                      <w:szCs w:val="20"/>
+                    </w:rPr>
+                    <w:t xml:space="preserve">Beispiel: Adel: alleiniges Jagdrecht · Klerus: Kirchenzehnt · Dritter Stand: hohe Abgaben.</w:t>
                   </w:r>
                 </w:p>
                 <w:p>
@@ -5739,7 +5753,7 @@
                       <w:sz w:val="20"/>
                       <w:szCs w:val="20"/>
                     </w:rPr>
-                    <w:t xml:space="preserve">Test: Wer zahlt Steuern, wer hat Privilegien?</w:t>
+                    <w:t xml:space="preserve">Test: Wer zahlt, wer ist ausgeschlossen? Wenige haben die Vorrechte, viele tragen die Last.</w:t>
                   </w:r>
                 </w:p>
               </w:tc>
@@ -6214,7 +6228,7 @@
                 <w:sz w:val="19"/>
                 <w:szCs w:val="19"/>
               </w:rPr>
-              <w:t xml:space="preserve">Beispiele: „… als Adeliger privilegiert, weil ich keine Steuern zahlen muss und jagen darf. Dafür muss ich im Krieg dienen und am Hof erscheinen.“ · „… als Bauer ausgenutzt, weil ich Steuern, Abgaben und Frondienste leisten muss, aber keine Privilegien und keine Mitbestimmung habe.“</w:t>
+              <w:t xml:space="preserve">Beispiele: „… als Adeliger privilegiert, weil ich keine Steuern zahlen muss und allein jagen darf. Dafür muss ich mich ehrenhaft verhalten und Verwaltungsaufgaben übernehmen.“ · „… als Bauer ausgenutzt, weil ich Steuern, hohe Abgaben und Pachtgebühren zahlen muss und von der Mitbestimmung ausgeschlossen bin.“</w:t>
             </w:r>
           </w:p>
         </w:tc>
@@ -6386,7 +6400,7 @@
                 <w:sz w:val="21"/>
                 <w:szCs w:val="21"/>
               </w:rPr>
-              <w:t xml:space="preserve">Typische Fehler: Adel zahlt Steuern · Klerus leistet Kriegsdienst · Dritter Stand hat Privilegien.</w:t>
+              <w:t xml:space="preserve">Typische Fehler: Adel zahlt Steuern · Klerus leistet Wehrdienst (ist befreit) · Dritter Stand hat Vorrechte.</w:t>
             </w:r>
           </w:p>
           <w:p>

</xml_diff>

<commit_message>
Geschichte 8: Einstieg Wahr oder falsch, Zeiten angepasst
Co-Authored-By: Claude Sonnet 5.5 <noreply@anthropic.com>
Claude-Session: https://claude.ai/code/session_01CtRuNVyt8v9M882BKEmgNb
</commit_message>
<xml_diff>
--- a/Geschichte_8/Absolutismus_Wiederholung/Tafelskript_Absolutismus_Wiederholung.docx
+++ b/Geschichte_8/Absolutismus_Wiederholung/Tafelskript_Absolutismus_Wiederholung.docx
@@ -442,7 +442,7 @@
                 <w:sz w:val="20"/>
                 <w:szCs w:val="20"/>
               </w:rPr>
-              <w:t xml:space="preserve">9</w:t>
+              <w:t xml:space="preserve">4</w:t>
             </w:r>
           </w:p>
         </w:tc>
@@ -476,7 +476,7 @@
                 <w:sz w:val="20"/>
                 <w:szCs w:val="20"/>
               </w:rPr>
-              <w:t xml:space="preserve">1  Absolutismus: Merksatz 1 + Ü1</w:t>
+              <w:t xml:space="preserve">1  Einstieg: Wahr oder falsch?</w:t>
             </w:r>
           </w:p>
         </w:tc>
@@ -510,7 +510,7 @@
                 <w:sz w:val="20"/>
                 <w:szCs w:val="20"/>
               </w:rPr>
-              <w:t xml:space="preserve">Folie 3–4</w:t>
+              <w:t xml:space="preserve">Folie 3</w:t>
             </w:r>
           </w:p>
         </w:tc>
@@ -544,7 +544,7 @@
                 <w:sz w:val="20"/>
                 <w:szCs w:val="20"/>
               </w:rPr>
-              <w:t xml:space="preserve">abschreiben, allein, Tafel</w:t>
+              <w:t xml:space="preserve">mündlich, gemeinsam</w:t>
             </w:r>
           </w:p>
         </w:tc>
@@ -584,7 +584,7 @@
                 <w:sz w:val="20"/>
                 <w:szCs w:val="20"/>
               </w:rPr>
-              <w:t xml:space="preserve">12</w:t>
+              <w:t xml:space="preserve">7</w:t>
             </w:r>
           </w:p>
         </w:tc>
@@ -618,7 +618,7 @@
                 <w:sz w:val="20"/>
                 <w:szCs w:val="20"/>
               </w:rPr>
-              <w:t xml:space="preserve">2  Fünf Säulen: Merksatz 2 + Lückentext (Ü2)</w:t>
+              <w:t xml:space="preserve">2  Absolutismus: Merksatz 1 + Ü1</w:t>
             </w:r>
           </w:p>
         </w:tc>
@@ -652,7 +652,7 @@
                 <w:sz w:val="20"/>
                 <w:szCs w:val="20"/>
               </w:rPr>
-              <w:t xml:space="preserve">Folie 5–6, Arbeitsblatt</w:t>
+              <w:t xml:space="preserve">Folie 4–5</w:t>
             </w:r>
           </w:p>
         </w:tc>
@@ -686,7 +686,7 @@
                 <w:sz w:val="20"/>
                 <w:szCs w:val="20"/>
               </w:rPr>
-              <w:t xml:space="preserve">abschreiben, allein, Kontrolle</w:t>
+              <w:t xml:space="preserve">abschreiben, allein, Tafel</w:t>
             </w:r>
           </w:p>
         </w:tc>
@@ -726,7 +726,7 @@
                 <w:sz w:val="20"/>
                 <w:szCs w:val="20"/>
               </w:rPr>
-              <w:t xml:space="preserve">10</w:t>
+              <w:t xml:space="preserve">11</w:t>
             </w:r>
           </w:p>
         </w:tc>
@@ -760,7 +760,7 @@
                 <w:sz w:val="20"/>
                 <w:szCs w:val="20"/>
               </w:rPr>
-              <w:t xml:space="preserve">3  Ständegesellschaft: Tabelle (Ü3) + Merksatz 3</w:t>
+              <w:t xml:space="preserve">3  Fünf Säulen: Merksatz 2 + Lückentext (Ü2)</w:t>
             </w:r>
           </w:p>
         </w:tc>
@@ -794,7 +794,7 @@
                 <w:sz w:val="20"/>
                 <w:szCs w:val="20"/>
               </w:rPr>
-              <w:t xml:space="preserve">Folie 7–8, Tafelbild</w:t>
+              <w:t xml:space="preserve">Folie 6–7, Arbeitsblatt</w:t>
             </w:r>
           </w:p>
         </w:tc>
@@ -828,7 +828,7 @@
                 <w:sz w:val="20"/>
                 <w:szCs w:val="20"/>
               </w:rPr>
-              <w:t xml:space="preserve">gemeinsam, abschreiben</w:t>
+              <w:t xml:space="preserve">abschreiben, allein, Kontrolle</w:t>
             </w:r>
           </w:p>
         </w:tc>
@@ -902,7 +902,7 @@
                 <w:sz w:val="20"/>
                 <w:szCs w:val="20"/>
               </w:rPr>
-              <w:t xml:space="preserve">4  „Im Absolutismus fühle ich mich …“ (Ü4)</w:t>
+              <w:t xml:space="preserve">4  Ständegesellschaft: Tabelle (Ü3) + Merksatz 3</w:t>
             </w:r>
           </w:p>
         </w:tc>
@@ -936,7 +936,7 @@
                 <w:sz w:val="20"/>
                 <w:szCs w:val="20"/>
               </w:rPr>
-              <w:t xml:space="preserve">Folie 9–10</w:t>
+              <w:t xml:space="preserve">Folie 8–9, Tafelbild</w:t>
             </w:r>
           </w:p>
         </w:tc>
@@ -970,7 +970,7 @@
                 <w:sz w:val="20"/>
                 <w:szCs w:val="20"/>
               </w:rPr>
-              <w:t xml:space="preserve">allein, Kontrolle</w:t>
+              <w:t xml:space="preserve">gemeinsam, abschreiben</w:t>
             </w:r>
           </w:p>
         </w:tc>
@@ -1010,7 +1010,7 @@
                 <w:sz w:val="20"/>
                 <w:szCs w:val="20"/>
               </w:rPr>
-              <w:t xml:space="preserve">2</w:t>
+              <w:t xml:space="preserve">9</w:t>
             </w:r>
           </w:p>
         </w:tc>
@@ -1044,7 +1044,7 @@
                 <w:sz w:val="20"/>
                 <w:szCs w:val="20"/>
               </w:rPr>
-              <w:t xml:space="preserve">5  Lernliste und Test</w:t>
+              <w:t xml:space="preserve">5  „Im Absolutismus fühle ich mich …“ (Ü4)</w:t>
             </w:r>
           </w:p>
         </w:tc>
@@ -1078,7 +1078,149 @@
                 <w:sz w:val="20"/>
                 <w:szCs w:val="20"/>
               </w:rPr>
-              <w:t xml:space="preserve">Folie 11</w:t>
+              <w:t xml:space="preserve">Folie 10–11</w:t>
+            </w:r>
+          </w:p>
+        </w:tc>
+        <w:tc>
+          <w:tcPr>
+            <w:tcW w:type="dxa" w:w="2806"/>
+            <w:tcBorders>
+              <w:top w:val="single" w:color="B9C6E8" w:sz="6"/>
+              <w:left w:val="single" w:color="B9C6E8" w:sz="6"/>
+              <w:bottom w:val="single" w:color="B9C6E8" w:sz="6"/>
+              <w:right w:val="single" w:color="B9C6E8" w:sz="6"/>
+            </w:tcBorders>
+            <w:tcMar>
+              <w:top w:type="dxa" w:w="60"/>
+              <w:left w:type="dxa" w:w="100"/>
+              <w:bottom w:type="dxa" w:w="60"/>
+              <w:right w:type="dxa" w:w="100"/>
+            </w:tcMar>
+            <w:vAlign w:val="center"/>
+          </w:tcPr>
+          <w:p>
+            <w:pPr>
+              <w:spacing w:after="0" w:before="0"/>
+            </w:pPr>
+            <w:r>
+              <w:rPr>
+                <w:rFonts w:ascii="Calibri" w:cs="Calibri" w:eastAsia="Calibri" w:hAnsi="Calibri"/>
+                <w:b w:val="false"/>
+                <w:bCs w:val="false"/>
+                <w:color w:val="000000"/>
+                <w:sz w:val="20"/>
+                <w:szCs w:val="20"/>
+              </w:rPr>
+              <w:t xml:space="preserve">allein, Kontrolle</w:t>
+            </w:r>
+          </w:p>
+        </w:tc>
+      </w:tr>
+      <w:tr>
+        <w:trPr>
+          <w:cantSplit/>
+          <w:trHeight w:val="340" w:hRule="atLeast"/>
+        </w:trPr>
+        <w:tc>
+          <w:tcPr>
+            <w:tcW w:type="dxa" w:w="900"/>
+            <w:tcBorders>
+              <w:top w:val="single" w:color="B9C6E8" w:sz="6"/>
+              <w:left w:val="single" w:color="B9C6E8" w:sz="6"/>
+              <w:bottom w:val="single" w:color="B9C6E8" w:sz="6"/>
+              <w:right w:val="single" w:color="B9C6E8" w:sz="6"/>
+            </w:tcBorders>
+            <w:tcMar>
+              <w:top w:type="dxa" w:w="60"/>
+              <w:left w:type="dxa" w:w="100"/>
+              <w:bottom w:type="dxa" w:w="60"/>
+              <w:right w:type="dxa" w:w="100"/>
+            </w:tcMar>
+            <w:vAlign w:val="center"/>
+          </w:tcPr>
+          <w:p>
+            <w:pPr>
+              <w:spacing w:after="0" w:before="0"/>
+            </w:pPr>
+            <w:r>
+              <w:rPr>
+                <w:rFonts w:ascii="Calibri" w:cs="Calibri" w:eastAsia="Calibri" w:hAnsi="Calibri"/>
+                <w:b/>
+                <w:bCs/>
+                <w:color w:val="000000"/>
+                <w:sz w:val="20"/>
+                <w:szCs w:val="20"/>
+              </w:rPr>
+              <w:t xml:space="preserve">2</w:t>
+            </w:r>
+          </w:p>
+        </w:tc>
+        <w:tc>
+          <w:tcPr>
+            <w:tcW w:type="dxa" w:w="4400"/>
+            <w:tcBorders>
+              <w:top w:val="single" w:color="B9C6E8" w:sz="6"/>
+              <w:left w:val="single" w:color="B9C6E8" w:sz="6"/>
+              <w:bottom w:val="single" w:color="B9C6E8" w:sz="6"/>
+              <w:right w:val="single" w:color="B9C6E8" w:sz="6"/>
+            </w:tcBorders>
+            <w:tcMar>
+              <w:top w:type="dxa" w:w="60"/>
+              <w:left w:type="dxa" w:w="100"/>
+              <w:bottom w:type="dxa" w:w="60"/>
+              <w:right w:type="dxa" w:w="100"/>
+            </w:tcMar>
+            <w:vAlign w:val="center"/>
+          </w:tcPr>
+          <w:p>
+            <w:pPr>
+              <w:spacing w:after="0" w:before="0"/>
+            </w:pPr>
+            <w:r>
+              <w:rPr>
+                <w:rFonts w:ascii="Calibri" w:cs="Calibri" w:eastAsia="Calibri" w:hAnsi="Calibri"/>
+                <w:b/>
+                <w:bCs/>
+                <w:color w:val="000000"/>
+                <w:sz w:val="20"/>
+                <w:szCs w:val="20"/>
+              </w:rPr>
+              <w:t xml:space="preserve">6  Lernliste und Test</w:t>
+            </w:r>
+          </w:p>
+        </w:tc>
+        <w:tc>
+          <w:tcPr>
+            <w:tcW w:type="dxa" w:w="2100"/>
+            <w:tcBorders>
+              <w:top w:val="single" w:color="B9C6E8" w:sz="6"/>
+              <w:left w:val="single" w:color="B9C6E8" w:sz="6"/>
+              <w:bottom w:val="single" w:color="B9C6E8" w:sz="6"/>
+              <w:right w:val="single" w:color="B9C6E8" w:sz="6"/>
+            </w:tcBorders>
+            <w:tcMar>
+              <w:top w:type="dxa" w:w="60"/>
+              <w:left w:type="dxa" w:w="100"/>
+              <w:bottom w:type="dxa" w:w="60"/>
+              <w:right w:type="dxa" w:w="100"/>
+            </w:tcMar>
+            <w:vAlign w:val="center"/>
+          </w:tcPr>
+          <w:p>
+            <w:pPr>
+              <w:spacing w:after="0" w:before="0"/>
+            </w:pPr>
+            <w:r>
+              <w:rPr>
+                <w:rFonts w:ascii="Calibri" w:cs="Calibri" w:eastAsia="Calibri" w:hAnsi="Calibri"/>
+                <w:b w:val="false"/>
+                <w:bCs w:val="false"/>
+                <w:color w:val="000000"/>
+                <w:sz w:val="20"/>
+                <w:szCs w:val="20"/>
+              </w:rPr>
+              <w:t xml:space="preserve">Folie 12</w:t>
             </w:r>
           </w:p>
         </w:tc>
@@ -1131,7 +1273,7 @@
           <w:sz w:val="21"/>
           <w:szCs w:val="21"/>
         </w:rPr>
-        <w:t xml:space="preserve">Zeitpuffer: Wird es knapp, die Kontrolle zu Ü1 auf zwei Sätze kürzen und bei Ü4 nur zwei Schüler vorlesen lassen. Gibt es eine Doppelstunde, Ü3 als Partnerquiz verlängern.</w:t>
+        <w:t xml:space="preserve">Zeitpuffer: Wird es knapp, die Kontrolle zu Ü1 auf zwei Sätze kürzen (schon eingeplant) und bei Ü4 nur zwei Schüler vorlesen lassen. Gibt es eine Doppelstunde, Ü3 als Partnerquiz verlängern.</w:t>
       </w:r>
     </w:p>
     <w:p>
@@ -1881,6 +2023,378 @@
           <w:sz w:val="28"/>
           <w:szCs w:val="28"/>
         </w:rPr>
+        <w:t xml:space="preserve">Einstieg: Wahr oder falsch?</w:t>
+      </w:r>
+      <w:r>
+        <w:rPr>
+          <w:rFonts w:ascii="Calibri" w:cs="Calibri" w:eastAsia="Calibri" w:hAnsi="Calibri"/>
+          <w:b/>
+          <w:bCs/>
+          <w:color w:val="C77C12"/>
+          <w:sz w:val="20"/>
+          <w:szCs w:val="20"/>
+        </w:rPr>
+        <w:t xml:space="preserve">   4 Min.</w:t>
+      </w:r>
+    </w:p>
+    <w:tbl>
+      <w:tblPr>
+        <w:tblW w:type="dxa" w:w="10206"/>
+        <w:tblBorders>
+          <w:top w:val="single" w:color="auto" w:sz="4"/>
+          <w:left w:val="single" w:color="auto" w:sz="4"/>
+          <w:bottom w:val="single" w:color="auto" w:sz="4"/>
+          <w:right w:val="single" w:color="auto" w:sz="4"/>
+          <w:insideH w:val="single" w:color="auto" w:sz="4"/>
+          <w:insideV w:val="single" w:color="auto" w:sz="4"/>
+        </w:tblBorders>
+      </w:tblPr>
+      <w:tblGrid>
+        <w:gridCol w:w="1700"/>
+        <w:gridCol w:w="8506"/>
+      </w:tblGrid>
+      <w:tr>
+        <w:trPr>
+          <w:cantSplit/>
+        </w:trPr>
+        <w:tc>
+          <w:tcPr>
+            <w:tcW w:type="dxa" w:w="1700"/>
+            <w:tcBorders>
+              <w:top w:val="single" w:color="D5DDEE" w:sz="6"/>
+              <w:left w:val="single" w:color="D5DDEE" w:sz="6"/>
+              <w:bottom w:val="single" w:color="D5DDEE" w:sz="6"/>
+              <w:right w:val="single" w:color="D5DDEE" w:sz="6"/>
+            </w:tcBorders>
+            <w:shd w:fill="F4F7FD" w:color="auto" w:val="clear"/>
+            <w:tcMar>
+              <w:top w:type="dxa" w:w="100"/>
+              <w:left w:type="dxa" w:w="100"/>
+              <w:bottom w:type="dxa" w:w="100"/>
+              <w:right w:type="dxa" w:w="100"/>
+            </w:tcMar>
+            <w:vAlign w:val="top"/>
+          </w:tcPr>
+          <w:p>
+            <w:pPr>
+              <w:spacing w:after="10" w:before="0"/>
+            </w:pPr>
+            <w:r>
+              <w:rPr>
+                <w:rFonts w:ascii="Calibri" w:cs="Calibri" w:eastAsia="Calibri" w:hAnsi="Calibri"/>
+                <w:color w:val="5B6B8C"/>
+                <w:sz w:val="16"/>
+                <w:szCs w:val="16"/>
+              </w:rPr>
+              <w:t xml:space="preserve">Klasse</w:t>
+            </w:r>
+          </w:p>
+          <w:p>
+            <w:pPr>
+              <w:spacing w:after="0" w:before="0"/>
+            </w:pPr>
+            <w:r>
+              <w:rPr>
+                <w:rFonts w:ascii="Calibri" w:cs="Calibri" w:eastAsia="Calibri" w:hAnsi="Calibri"/>
+                <w:b/>
+                <w:bCs/>
+                <w:color w:val="1E2761"/>
+                <w:sz w:val="20"/>
+                <w:szCs w:val="20"/>
+              </w:rPr>
+              <w:t xml:space="preserve">macht mündlich mit</w:t>
+            </w:r>
+          </w:p>
+        </w:tc>
+        <w:tc>
+          <w:tcPr>
+            <w:tcW w:type="dxa" w:w="8506"/>
+            <w:tcBorders>
+              <w:top w:val="single" w:color="D5DDEE" w:sz="6"/>
+              <w:left w:val="single" w:color="D5DDEE" w:sz="6"/>
+              <w:bottom w:val="single" w:color="D5DDEE" w:sz="6"/>
+              <w:right w:val="single" w:color="D5DDEE" w:sz="6"/>
+            </w:tcBorders>
+            <w:tcMar>
+              <w:top w:type="dxa" w:w="100"/>
+              <w:left w:type="dxa" w:w="160"/>
+              <w:bottom w:type="dxa" w:w="100"/>
+              <w:right w:type="dxa" w:w="100"/>
+            </w:tcMar>
+            <w:vAlign w:val="top"/>
+          </w:tcPr>
+          <w:p>
+            <w:pPr>
+              <w:spacing w:after="60" w:before="0"/>
+            </w:pPr>
+            <w:r>
+              <w:rPr>
+                <w:rFonts w:ascii="Calibri" w:cs="Calibri" w:eastAsia="Calibri" w:hAnsi="Calibri"/>
+                <w:b/>
+                <w:bCs/>
+                <w:color w:val="D9534F"/>
+                <w:sz w:val="20"/>
+                <w:szCs w:val="20"/>
+              </w:rPr>
+              <w:t xml:space="preserve">Ansage: </w:t>
+            </w:r>
+            <w:r>
+              <w:rPr>
+                <w:rFonts w:ascii="Calibri" w:cs="Calibri" w:eastAsia="Calibri" w:hAnsi="Calibri"/>
+                <w:i/>
+                <w:iCs/>
+                <w:color w:val="000000"/>
+                <w:sz w:val="21"/>
+                <w:szCs w:val="21"/>
+              </w:rPr>
+              <w:t xml:space="preserve">„Stifte liegen. Ihr schreibt noch nichts auf. Entscheidet still: wahr oder falsch? Dann meldet ihr euch und begründet.“</w:t>
+            </w:r>
+          </w:p>
+          <w:p>
+            <w:pPr>
+              <w:spacing w:after="50" w:before="0"/>
+            </w:pPr>
+            <w:r>
+              <w:rPr>
+                <w:rFonts w:ascii="Calibri" w:cs="Calibri" w:eastAsia="Calibri" w:hAnsi="Calibri"/>
+                <w:color w:val="000000"/>
+                <w:sz w:val="21"/>
+                <w:szCs w:val="21"/>
+              </w:rPr>
+              <w:t xml:space="preserve">Die vier Behauptungen stehen auf Folie 3 (oder vorher an der Tafel). Pro Behauptung eine Antwort mit Begründung, bei „falsch“ wird die Aussage verbessert.</w:t>
+            </w:r>
+          </w:p>
+          <w:p>
+            <w:pPr>
+              <w:spacing w:after="50" w:before="0"/>
+            </w:pPr>
+            <w:r>
+              <w:rPr>
+                <w:rFonts w:ascii="Calibri" w:cs="Calibri" w:eastAsia="Calibri" w:hAnsi="Calibri"/>
+                <w:color w:val="000000"/>
+                <w:sz w:val="21"/>
+                <w:szCs w:val="21"/>
+              </w:rPr>
+              <w:t xml:space="preserve">Die Antworten zeigen, was schon sitzt. Nicht ausführlich erklären: Was unsicher ist, kommt in den folgenden Phasen.</w:t>
+            </w:r>
+          </w:p>
+          <w:tbl>
+            <w:tblPr>
+              <w:tblW w:type="dxa" w:w="8166"/>
+              <w:tblBorders>
+                <w:top w:val="single" w:color="auto" w:sz="4"/>
+                <w:left w:val="single" w:color="auto" w:sz="4"/>
+                <w:bottom w:val="single" w:color="auto" w:sz="4"/>
+                <w:right w:val="single" w:color="auto" w:sz="4"/>
+                <w:insideH w:val="single" w:color="auto" w:sz="4"/>
+                <w:insideV w:val="single" w:color="auto" w:sz="4"/>
+              </w:tblBorders>
+            </w:tblPr>
+            <w:tblGrid>
+              <w:gridCol w:w="8166"/>
+            </w:tblGrid>
+            <w:tr>
+              <w:trPr>
+                <w:cantSplit/>
+              </w:trPr>
+              <w:tc>
+                <w:tcPr>
+                  <w:tcW w:type="dxa" w:w="8166"/>
+                  <w:tcBorders>
+                    <w:top w:val="single" w:color="3D4A3F" w:sz="12"/>
+                    <w:left w:val="single" w:color="3D4A3F" w:sz="12"/>
+                    <w:bottom w:val="single" w:color="3D4A3F" w:sz="12"/>
+                    <w:right w:val="single" w:color="3D4A3F" w:sz="12"/>
+                  </w:tcBorders>
+                  <w:shd w:fill="3D4A3F" w:color="auto" w:val="clear"/>
+                  <w:tcMar>
+                    <w:top w:type="dxa" w:w="30"/>
+                    <w:left w:type="dxa" w:w="100"/>
+                    <w:bottom w:type="dxa" w:w="30"/>
+                    <w:right w:type="dxa" w:w="100"/>
+                  </w:tcMar>
+                  <w:vAlign w:val="center"/>
+                </w:tcPr>
+                <w:p>
+                  <w:pPr>
+                    <w:spacing w:after="0" w:before="0"/>
+                  </w:pPr>
+                  <w:r>
+                    <w:rPr>
+                      <w:rFonts w:ascii="Calibri" w:cs="Calibri" w:eastAsia="Calibri" w:hAnsi="Calibri"/>
+                      <w:b/>
+                      <w:bCs/>
+                      <w:color w:val="FFFFFF"/>
+                      <w:sz w:val="16"/>
+                      <w:szCs w:val="16"/>
+                    </w:rPr>
+                    <w:t xml:space="preserve">TAFEL · Mitte · Behauptungen</w:t>
+                  </w:r>
+                </w:p>
+              </w:tc>
+            </w:tr>
+            <w:tr>
+              <w:trPr>
+                <w:cantSplit/>
+              </w:trPr>
+              <w:tc>
+                <w:tcPr>
+                  <w:tcW w:type="dxa" w:w="8166"/>
+                  <w:tcBorders>
+                    <w:top w:val="single" w:color="3D4A3F" w:sz="12"/>
+                    <w:left w:val="single" w:color="3D4A3F" w:sz="12"/>
+                    <w:bottom w:val="single" w:color="3D4A3F" w:sz="12"/>
+                    <w:right w:val="single" w:color="3D4A3F" w:sz="12"/>
+                  </w:tcBorders>
+                  <w:shd w:fill="F3F6F1" w:color="auto" w:val="clear"/>
+                  <w:tcMar>
+                    <w:top w:type="dxa" w:w="100"/>
+                    <w:left w:type="dxa" w:w="160"/>
+                    <w:bottom w:type="dxa" w:w="100"/>
+                    <w:right w:type="dxa" w:w="100"/>
+                  </w:tcMar>
+                  <w:vAlign w:val="center"/>
+                </w:tcPr>
+                <w:p>
+                  <w:pPr>
+                    <w:spacing w:after="30" w:before="0"/>
+                  </w:pPr>
+                  <w:r>
+                    <w:rPr>
+                      <w:rFonts w:ascii="Cambria" w:cs="Cambria" w:eastAsia="Cambria" w:hAnsi="Cambria"/>
+                      <w:color w:val="000000"/>
+                      <w:sz w:val="22"/>
+                      <w:szCs w:val="22"/>
+                    </w:rPr>
+                    <w:t xml:space="preserve">1  Der Dritte Stand war mit Abstand der größte Stand.</w:t>
+                  </w:r>
+                </w:p>
+                <w:p>
+                  <w:pPr>
+                    <w:spacing w:after="30" w:before="0"/>
+                  </w:pPr>
+                  <w:r>
+                    <w:rPr>
+                      <w:rFonts w:ascii="Cambria" w:cs="Cambria" w:eastAsia="Cambria" w:hAnsi="Cambria"/>
+                      <w:color w:val="000000"/>
+                      <w:sz w:val="22"/>
+                      <w:szCs w:val="22"/>
+                    </w:rPr>
+                    <w:t xml:space="preserve">2  Der Adel musste hohe Steuern an den König zahlen.</w:t>
+                  </w:r>
+                </w:p>
+                <w:p>
+                  <w:pPr>
+                    <w:spacing w:after="30" w:before="0"/>
+                  </w:pPr>
+                  <w:r>
+                    <w:rPr>
+                      <w:rFonts w:ascii="Cambria" w:cs="Cambria" w:eastAsia="Cambria" w:hAnsi="Cambria"/>
+                      <w:color w:val="000000"/>
+                      <w:sz w:val="22"/>
+                      <w:szCs w:val="22"/>
+                    </w:rPr>
+                    <w:t xml:space="preserve">3  Ludwig XIV. verzichtete auf Söldner und baute ein stehendes Heer auf.</w:t>
+                  </w:r>
+                </w:p>
+                <w:p>
+                  <w:pPr>
+                    <w:spacing w:after="0" w:before="0"/>
+                  </w:pPr>
+                  <w:r>
+                    <w:rPr>
+                      <w:rFonts w:ascii="Cambria" w:cs="Cambria" w:eastAsia="Cambria" w:hAnsi="Cambria"/>
+                      <w:color w:val="000000"/>
+                      <w:sz w:val="22"/>
+                      <w:szCs w:val="22"/>
+                    </w:rPr>
+                    <w:t xml:space="preserve">4  Ludwig XIV. erlaubte den Protestanten die freie Religionsausübung.</w:t>
+                  </w:r>
+                </w:p>
+              </w:tc>
+            </w:tr>
+          </w:tbl>
+          <w:p>
+            <w:pPr>
+              <w:spacing w:after="20" w:before="0"/>
+            </w:pPr>
+            <w:r>
+              <w:rPr>
+                <w:rFonts w:ascii="Calibri" w:cs="Calibri" w:eastAsia="Calibri" w:hAnsi="Calibri"/>
+                <w:color w:val="000000"/>
+                <w:sz w:val="22"/>
+                <w:szCs w:val="22"/>
+              </w:rPr>
+              <w:t xml:space="preserve"/>
+            </w:r>
+          </w:p>
+          <w:p>
+            <w:pPr>
+              <w:spacing w:after="0" w:before="0"/>
+            </w:pPr>
+            <w:r>
+              <w:rPr>
+                <w:rFonts w:ascii="Calibri" w:cs="Calibri" w:eastAsia="Calibri" w:hAnsi="Calibri"/>
+                <w:b/>
+                <w:bCs/>
+                <w:color w:val="5B6B8C"/>
+                <w:sz w:val="19"/>
+                <w:szCs w:val="19"/>
+              </w:rPr>
+              <w:t xml:space="preserve">Lösung: </w:t>
+            </w:r>
+            <w:r>
+              <w:rPr>
+                <w:rFonts w:ascii="Calibri" w:cs="Calibri" w:eastAsia="Calibri" w:hAnsi="Calibri"/>
+                <w:color w:val="5B6B8C"/>
+                <w:sz w:val="19"/>
+                <w:szCs w:val="19"/>
+              </w:rPr>
+              <w:t xml:space="preserve">1 wahr (ca. 20 Millionen von gut 20,6 Millionen) · 2 falsch: Der Adel musste keine Steuern zahlen (Vorrecht) · 3 wahr (Säule Heer) · 4 falsch: 1685 beendete er die religiöse Toleranz, ein König, ein Glaube (Säule Religion).</w:t>
+            </w:r>
+          </w:p>
+        </w:tc>
+      </w:tr>
+    </w:tbl>
+    <w:p>
+      <w:pPr>
+        <w:spacing w:after="40" w:before="0"/>
+      </w:pPr>
+      <w:r>
+        <w:rPr>
+          <w:rFonts w:ascii="Calibri" w:cs="Calibri" w:eastAsia="Calibri" w:hAnsi="Calibri"/>
+          <w:color w:val="000000"/>
+          <w:sz w:val="22"/>
+          <w:szCs w:val="22"/>
+        </w:rPr>
+        <w:t xml:space="preserve"/>
+      </w:r>
+    </w:p>
+    <w:p>
+      <w:pPr>
+        <w:keepNext/>
+        <w:spacing w:after="100" w:before="200"/>
+      </w:pPr>
+      <w:r>
+        <w:rPr>
+          <w:rFonts w:ascii="Cambria" w:cs="Cambria" w:eastAsia="Cambria" w:hAnsi="Cambria"/>
+          <w:b/>
+          <w:bCs/>
+          <w:color w:val="D9534F"/>
+          <w:sz w:val="28"/>
+          <w:szCs w:val="28"/>
+        </w:rPr>
+        <w:t xml:space="preserve">2  </w:t>
+      </w:r>
+      <w:r>
+        <w:rPr>
+          <w:rFonts w:ascii="Cambria" w:cs="Cambria" w:eastAsia="Cambria" w:hAnsi="Cambria"/>
+          <w:b/>
+          <w:bCs/>
+          <w:color w:val="1E2761"/>
+          <w:sz w:val="28"/>
+          <w:szCs w:val="28"/>
+        </w:rPr>
         <w:t xml:space="preserve">Absolutismus</w:t>
       </w:r>
       <w:r>
@@ -1892,7 +2406,7 @@
           <w:sz w:val="20"/>
           <w:szCs w:val="20"/>
         </w:rPr>
-        <w:t xml:space="preserve">   9 Min.</w:t>
+        <w:t xml:space="preserve">   7 Min.</w:t>
       </w:r>
     </w:p>
     <w:tbl>
@@ -3076,7 +3590,7 @@
           <w:sz w:val="28"/>
           <w:szCs w:val="28"/>
         </w:rPr>
-        <w:t xml:space="preserve">2  </w:t>
+        <w:t xml:space="preserve">3  </w:t>
       </w:r>
       <w:r>
         <w:rPr>
@@ -3098,7 +3612,7 @@
           <w:sz w:val="20"/>
           <w:szCs w:val="20"/>
         </w:rPr>
-        <w:t xml:space="preserve">   12 Min.</w:t>
+        <w:t xml:space="preserve">   11 Min.</w:t>
       </w:r>
     </w:p>
     <w:tbl>
@@ -4298,7 +4812,7 @@
           <w:sz w:val="28"/>
           <w:szCs w:val="28"/>
         </w:rPr>
-        <w:t xml:space="preserve">3  </w:t>
+        <w:t xml:space="preserve">4  </w:t>
       </w:r>
       <w:r>
         <w:rPr>
@@ -5804,7 +6318,7 @@
           <w:sz w:val="28"/>
           <w:szCs w:val="28"/>
         </w:rPr>
-        <w:t xml:space="preserve">4  </w:t>
+        <w:t xml:space="preserve">5  </w:t>
       </w:r>
       <w:r>
         <w:rPr>
@@ -5826,7 +6340,7 @@
           <w:sz w:val="20"/>
           <w:szCs w:val="20"/>
         </w:rPr>
-        <w:t xml:space="preserve">   10 Min.</w:t>
+        <w:t xml:space="preserve">   9 Min.</w:t>
       </w:r>
     </w:p>
     <w:tbl>
@@ -6603,7 +7117,7 @@
           <w:sz w:val="28"/>
           <w:szCs w:val="28"/>
         </w:rPr>
-        <w:t xml:space="preserve">5  </w:t>
+        <w:t xml:space="preserve">6  </w:t>
       </w:r>
       <w:r>
         <w:rPr>
@@ -6752,7 +7266,7 @@
                 <w:sz w:val="21"/>
                 <w:szCs w:val="21"/>
               </w:rPr>
-              <w:t xml:space="preserve">Folie 11 zeigen, Testtermin noch einmal nennen, Fragen zum Test beantworten.</w:t>
+              <w:t xml:space="preserve">Folie 12 zeigen, Testtermin noch einmal nennen, Fragen zum Test beantworten.</w:t>
             </w:r>
           </w:p>
         </w:tc>

</xml_diff>

<commit_message>
Geschichte 8: Säulen zuerst, dann Wahr oder falsch und Rest
Co-Authored-By: Claude Sonnet 5.5 <noreply@anthropic.com>
Claude-Session: https://claude.ai/code/session_01CtRuNVyt8v9M882BKEmgNb
</commit_message>
<xml_diff>
--- a/Geschichte_8/Absolutismus_Wiederholung/Tafelskript_Absolutismus_Wiederholung.docx
+++ b/Geschichte_8/Absolutismus_Wiederholung/Tafelskript_Absolutismus_Wiederholung.docx
@@ -442,7 +442,7 @@
                 <w:sz w:val="20"/>
                 <w:szCs w:val="20"/>
               </w:rPr>
-              <w:t xml:space="preserve">4</w:t>
+              <w:t xml:space="preserve">11</w:t>
             </w:r>
           </w:p>
         </w:tc>
@@ -476,7 +476,7 @@
                 <w:sz w:val="20"/>
                 <w:szCs w:val="20"/>
               </w:rPr>
-              <w:t xml:space="preserve">1  Einstieg: Wahr oder falsch?</w:t>
+              <w:t xml:space="preserve">1  Fünf Säulen: Merksatz 1 + Lückentext (Ü1)</w:t>
             </w:r>
           </w:p>
         </w:tc>
@@ -510,7 +510,7 @@
                 <w:sz w:val="20"/>
                 <w:szCs w:val="20"/>
               </w:rPr>
-              <w:t xml:space="preserve">Folie 3</w:t>
+              <w:t xml:space="preserve">Folie 3–4, Arbeitsblatt</w:t>
             </w:r>
           </w:p>
         </w:tc>
@@ -544,7 +544,7 @@
                 <w:sz w:val="20"/>
                 <w:szCs w:val="20"/>
               </w:rPr>
-              <w:t xml:space="preserve">mündlich, gemeinsam</w:t>
+              <w:t xml:space="preserve">abschreiben, allein, Kontrolle</w:t>
             </w:r>
           </w:p>
         </w:tc>
@@ -584,7 +584,7 @@
                 <w:sz w:val="20"/>
                 <w:szCs w:val="20"/>
               </w:rPr>
-              <w:t xml:space="preserve">7</w:t>
+              <w:t xml:space="preserve">4</w:t>
             </w:r>
           </w:p>
         </w:tc>
@@ -618,7 +618,7 @@
                 <w:sz w:val="20"/>
                 <w:szCs w:val="20"/>
               </w:rPr>
-              <w:t xml:space="preserve">2  Absolutismus: Merksatz 1 + Ü1</w:t>
+              <w:t xml:space="preserve">2  Wahr oder falsch?</w:t>
             </w:r>
           </w:p>
         </w:tc>
@@ -652,7 +652,7 @@
                 <w:sz w:val="20"/>
                 <w:szCs w:val="20"/>
               </w:rPr>
-              <w:t xml:space="preserve">Folie 4–5</w:t>
+              <w:t xml:space="preserve">Folie 5</w:t>
             </w:r>
           </w:p>
         </w:tc>
@@ -686,7 +686,7 @@
                 <w:sz w:val="20"/>
                 <w:szCs w:val="20"/>
               </w:rPr>
-              <w:t xml:space="preserve">abschreiben, allein, Tafel</w:t>
+              <w:t xml:space="preserve">mündlich, gemeinsam</w:t>
             </w:r>
           </w:p>
         </w:tc>
@@ -726,7 +726,7 @@
                 <w:sz w:val="20"/>
                 <w:szCs w:val="20"/>
               </w:rPr>
-              <w:t xml:space="preserve">11</w:t>
+              <w:t xml:space="preserve">7</w:t>
             </w:r>
           </w:p>
         </w:tc>
@@ -760,7 +760,7 @@
                 <w:sz w:val="20"/>
                 <w:szCs w:val="20"/>
               </w:rPr>
-              <w:t xml:space="preserve">3  Fünf Säulen: Merksatz 2 + Lückentext (Ü2)</w:t>
+              <w:t xml:space="preserve">3  Absolutismus: Merksatz 2 + Ü2</w:t>
             </w:r>
           </w:p>
         </w:tc>
@@ -794,7 +794,7 @@
                 <w:sz w:val="20"/>
                 <w:szCs w:val="20"/>
               </w:rPr>
-              <w:t xml:space="preserve">Folie 6–7, Arbeitsblatt</w:t>
+              <w:t xml:space="preserve">Folie 6–7</w:t>
             </w:r>
           </w:p>
         </w:tc>
@@ -828,7 +828,7 @@
                 <w:sz w:val="20"/>
                 <w:szCs w:val="20"/>
               </w:rPr>
-              <w:t xml:space="preserve">abschreiben, allein, Kontrolle</w:t>
+              <w:t xml:space="preserve">abschreiben, allein, Tafel</w:t>
             </w:r>
           </w:p>
         </w:tc>
@@ -1273,7 +1273,7 @@
           <w:sz w:val="21"/>
           <w:szCs w:val="21"/>
         </w:rPr>
-        <w:t xml:space="preserve">Zeitpuffer: Wird es knapp, die Kontrolle zu Ü1 auf zwei Sätze kürzen (schon eingeplant) und bei Ü4 nur zwei Schüler vorlesen lassen. Gibt es eine Doppelstunde, Ü3 als Partnerquiz verlängern.</w:t>
+        <w:t xml:space="preserve">Zeitpuffer: Wird es knapp, die Kontrolle zu Ü2 auf zwei Sätze kürzen (schon eingeplant) und bei Ü4 nur zwei Schüler vorlesen lassen. Gibt es eine Doppelstunde, Ü3 als Partnerquiz verlängern.</w:t>
       </w:r>
     </w:p>
     <w:p>
@@ -2013,6 +2013,1228 @@
           <w:szCs w:val="28"/>
         </w:rPr>
         <w:t xml:space="preserve">1  </w:t>
+      </w:r>
+      <w:r>
+        <w:rPr>
+          <w:rFonts w:ascii="Cambria" w:cs="Cambria" w:eastAsia="Cambria" w:hAnsi="Cambria"/>
+          <w:b/>
+          <w:bCs/>
+          <w:color w:val="1E2761"/>
+          <w:sz w:val="28"/>
+          <w:szCs w:val="28"/>
+        </w:rPr>
+        <w:t xml:space="preserve">Die fünf Säulen</w:t>
+      </w:r>
+      <w:r>
+        <w:rPr>
+          <w:rFonts w:ascii="Calibri" w:cs="Calibri" w:eastAsia="Calibri" w:hAnsi="Calibri"/>
+          <w:b/>
+          <w:bCs/>
+          <w:color w:val="C77C12"/>
+          <w:sz w:val="20"/>
+          <w:szCs w:val="20"/>
+        </w:rPr>
+        <w:t xml:space="preserve">   11 Min.</w:t>
+      </w:r>
+    </w:p>
+    <w:tbl>
+      <w:tblPr>
+        <w:tblW w:type="dxa" w:w="10206"/>
+        <w:tblBorders>
+          <w:top w:val="single" w:color="auto" w:sz="4"/>
+          <w:left w:val="single" w:color="auto" w:sz="4"/>
+          <w:bottom w:val="single" w:color="auto" w:sz="4"/>
+          <w:right w:val="single" w:color="auto" w:sz="4"/>
+          <w:insideH w:val="single" w:color="auto" w:sz="4"/>
+          <w:insideV w:val="single" w:color="auto" w:sz="4"/>
+        </w:tblBorders>
+      </w:tblPr>
+      <w:tblGrid>
+        <w:gridCol w:w="1700"/>
+        <w:gridCol w:w="8506"/>
+      </w:tblGrid>
+      <w:tr>
+        <w:trPr>
+          <w:cantSplit/>
+        </w:trPr>
+        <w:tc>
+          <w:tcPr>
+            <w:tcW w:type="dxa" w:w="1700"/>
+            <w:tcBorders>
+              <w:top w:val="single" w:color="D5DDEE" w:sz="6"/>
+              <w:left w:val="single" w:color="D5DDEE" w:sz="6"/>
+              <w:bottom w:val="single" w:color="D5DDEE" w:sz="6"/>
+              <w:right w:val="single" w:color="D5DDEE" w:sz="6"/>
+            </w:tcBorders>
+            <w:shd w:fill="F4F7FD" w:color="auto" w:val="clear"/>
+            <w:tcMar>
+              <w:top w:type="dxa" w:w="100"/>
+              <w:left w:type="dxa" w:w="100"/>
+              <w:bottom w:type="dxa" w:w="100"/>
+              <w:right w:type="dxa" w:w="100"/>
+            </w:tcMar>
+            <w:vAlign w:val="top"/>
+          </w:tcPr>
+          <w:p>
+            <w:pPr>
+              <w:spacing w:after="10" w:before="0"/>
+            </w:pPr>
+            <w:r>
+              <w:rPr>
+                <w:rFonts w:ascii="Calibri" w:cs="Calibri" w:eastAsia="Calibri" w:hAnsi="Calibri"/>
+                <w:color w:val="5B6B8C"/>
+                <w:sz w:val="16"/>
+                <w:szCs w:val="16"/>
+              </w:rPr>
+              <w:t xml:space="preserve">Klasse</w:t>
+            </w:r>
+          </w:p>
+          <w:p>
+            <w:pPr>
+              <w:spacing w:after="0" w:before="0"/>
+            </w:pPr>
+            <w:r>
+              <w:rPr>
+                <w:rFonts w:ascii="Calibri" w:cs="Calibri" w:eastAsia="Calibri" w:hAnsi="Calibri"/>
+                <w:b/>
+                <w:bCs/>
+                <w:color w:val="1E2761"/>
+                <w:sz w:val="20"/>
+                <w:szCs w:val="20"/>
+              </w:rPr>
+              <w:t xml:space="preserve">schreibt ab</w:t>
+            </w:r>
+          </w:p>
+        </w:tc>
+        <w:tc>
+          <w:tcPr>
+            <w:tcW w:type="dxa" w:w="8506"/>
+            <w:tcBorders>
+              <w:top w:val="single" w:color="D5DDEE" w:sz="6"/>
+              <w:left w:val="single" w:color="D5DDEE" w:sz="6"/>
+              <w:bottom w:val="single" w:color="D5DDEE" w:sz="6"/>
+              <w:right w:val="single" w:color="D5DDEE" w:sz="6"/>
+            </w:tcBorders>
+            <w:tcMar>
+              <w:top w:type="dxa" w:w="100"/>
+              <w:left w:type="dxa" w:w="160"/>
+              <w:bottom w:type="dxa" w:w="100"/>
+              <w:right w:type="dxa" w:w="100"/>
+            </w:tcMar>
+            <w:vAlign w:val="top"/>
+          </w:tcPr>
+          <w:p>
+            <w:pPr>
+              <w:spacing w:after="60" w:before="0"/>
+            </w:pPr>
+            <w:r>
+              <w:rPr>
+                <w:rFonts w:ascii="Calibri" w:cs="Calibri" w:eastAsia="Calibri" w:hAnsi="Calibri"/>
+                <w:b/>
+                <w:bCs/>
+                <w:color w:val="D9534F"/>
+                <w:sz w:val="20"/>
+                <w:szCs w:val="20"/>
+              </w:rPr>
+              <w:t xml:space="preserve">Ansage: </w:t>
+            </w:r>
+            <w:r>
+              <w:rPr>
+                <w:rFonts w:ascii="Calibri" w:cs="Calibri" w:eastAsia="Calibri" w:hAnsi="Calibri"/>
+                <w:i/>
+                <w:iCs/>
+                <w:color w:val="000000"/>
+                <w:sz w:val="21"/>
+                <w:szCs w:val="21"/>
+              </w:rPr>
+              <w:t xml:space="preserve">„Jetzt schreibt ihr von der Folie ab: Merksatz 1. Rahmt ihn rot ein.“</w:t>
+            </w:r>
+          </w:p>
+          <w:p>
+            <w:pPr>
+              <w:spacing w:after="50" w:before="0"/>
+            </w:pPr>
+            <w:r>
+              <w:rPr>
+                <w:rFonts w:ascii="Calibri" w:cs="Calibri" w:eastAsia="Calibri" w:hAnsi="Calibri"/>
+                <w:color w:val="000000"/>
+                <w:sz w:val="21"/>
+                <w:szCs w:val="21"/>
+              </w:rPr>
+              <w:t xml:space="preserve">Kurz fragen: Wer hat welche Säule im Gruppenpuzzle bearbeitet? (Stärkt das Wiedererkennen.)</w:t>
+            </w:r>
+          </w:p>
+          <w:tbl>
+            <w:tblPr>
+              <w:tblW w:type="dxa" w:w="8166"/>
+              <w:tblBorders>
+                <w:top w:val="single" w:color="auto" w:sz="4"/>
+                <w:left w:val="single" w:color="auto" w:sz="4"/>
+                <w:bottom w:val="single" w:color="auto" w:sz="4"/>
+                <w:right w:val="single" w:color="auto" w:sz="4"/>
+                <w:insideH w:val="single" w:color="auto" w:sz="4"/>
+                <w:insideV w:val="single" w:color="auto" w:sz="4"/>
+              </w:tblBorders>
+            </w:tblPr>
+            <w:tblGrid>
+              <w:gridCol w:w="8166"/>
+            </w:tblGrid>
+            <w:tr>
+              <w:trPr>
+                <w:cantSplit/>
+              </w:trPr>
+              <w:tc>
+                <w:tcPr>
+                  <w:tcW w:type="dxa" w:w="8166"/>
+                  <w:tcBorders>
+                    <w:top w:val="single" w:color="1E2761" w:sz="12"/>
+                    <w:left w:val="single" w:color="1E2761" w:sz="12"/>
+                    <w:bottom w:val="single" w:color="1E2761" w:sz="12"/>
+                    <w:right w:val="single" w:color="1E2761" w:sz="12"/>
+                  </w:tcBorders>
+                  <w:shd w:fill="1E2761" w:color="auto" w:val="clear"/>
+                  <w:tcMar>
+                    <w:top w:type="dxa" w:w="30"/>
+                    <w:left w:type="dxa" w:w="100"/>
+                    <w:bottom w:type="dxa" w:w="30"/>
+                    <w:right w:type="dxa" w:w="100"/>
+                  </w:tcMar>
+                  <w:vAlign w:val="center"/>
+                </w:tcPr>
+                <w:p>
+                  <w:pPr>
+                    <w:spacing w:after="0" w:before="0"/>
+                  </w:pPr>
+                  <w:r>
+                    <w:rPr>
+                      <w:rFonts w:ascii="Calibri" w:cs="Calibri" w:eastAsia="Calibri" w:hAnsi="Calibri"/>
+                      <w:b/>
+                      <w:bCs/>
+                      <w:color w:val="FFFFFF"/>
+                      <w:sz w:val="16"/>
+                      <w:szCs w:val="16"/>
+                    </w:rPr>
+                    <w:t xml:space="preserve">FOLIE · Merksatz 1 – abschreiben, rot umrahmen</w:t>
+                  </w:r>
+                </w:p>
+              </w:tc>
+            </w:tr>
+            <w:tr>
+              <w:trPr>
+                <w:cantSplit/>
+              </w:trPr>
+              <w:tc>
+                <w:tcPr>
+                  <w:tcW w:type="dxa" w:w="8166"/>
+                  <w:tcBorders>
+                    <w:top w:val="single" w:color="1E2761" w:sz="12"/>
+                    <w:left w:val="single" w:color="1E2761" w:sz="12"/>
+                    <w:bottom w:val="single" w:color="1E2761" w:sz="12"/>
+                    <w:right w:val="single" w:color="1E2761" w:sz="12"/>
+                  </w:tcBorders>
+                  <w:shd w:fill="F4F7FD" w:color="auto" w:val="clear"/>
+                  <w:tcMar>
+                    <w:top w:type="dxa" w:w="100"/>
+                    <w:left w:type="dxa" w:w="160"/>
+                    <w:bottom w:type="dxa" w:w="100"/>
+                    <w:right w:type="dxa" w:w="100"/>
+                  </w:tcMar>
+                  <w:vAlign w:val="center"/>
+                </w:tcPr>
+                <w:p>
+                  <w:pPr>
+                    <w:spacing w:after="40" w:before="0"/>
+                  </w:pPr>
+                  <w:r>
+                    <w:rPr>
+                      <w:rFonts w:ascii="Cambria" w:cs="Cambria" w:eastAsia="Cambria" w:hAnsi="Cambria"/>
+                      <w:b/>
+                      <w:bCs/>
+                      <w:color w:val="D9534F"/>
+                      <w:sz w:val="22"/>
+                      <w:szCs w:val="22"/>
+                    </w:rPr>
+                    <w:t xml:space="preserve">Die fünf Säulen des Absolutismus</w:t>
+                  </w:r>
+                </w:p>
+                <w:p>
+                  <w:pPr>
+                    <w:spacing w:after="50" w:before="0"/>
+                  </w:pPr>
+                  <w:r>
+                    <w:rPr>
+                      <w:rFonts w:ascii="Cambria" w:cs="Cambria" w:eastAsia="Cambria" w:hAnsi="Cambria"/>
+                      <w:color w:val="000000"/>
+                      <w:sz w:val="22"/>
+                      <w:szCs w:val="22"/>
+                    </w:rPr>
+                    <w:t xml:space="preserve">Ludwig XIV. sicherte seine Macht auf fünf Säulen: 1 Verwaltung und Justiz · 2 Adel und Hof von Versailles · 3 Wirtschaft (Merkantilismus) · 4 Religion (Gottesgnadentum) · 5 Heer (stehendes Heer).</w:t>
+                  </w:r>
+                </w:p>
+                <w:p>
+                  <w:pPr>
+                    <w:spacing w:after="50" w:before="0"/>
+                  </w:pPr>
+                  <w:r>
+                    <w:rPr>
+                      <w:rFonts w:ascii="Cambria" w:cs="Cambria" w:eastAsia="Cambria" w:hAnsi="Cambria"/>
+                      <w:color w:val="5B6B8C"/>
+                      <w:sz w:val="20"/>
+                      <w:szCs w:val="20"/>
+                    </w:rPr>
+                    <w:t xml:space="preserve">Wofür? Im Test nennen und erklären.</w:t>
+                  </w:r>
+                </w:p>
+                <w:p>
+                  <w:pPr>
+                    <w:spacing w:after="0" w:before="0"/>
+                  </w:pPr>
+                  <w:r>
+                    <w:rPr>
+                      <w:rFonts w:ascii="Cambria" w:cs="Cambria" w:eastAsia="Cambria" w:hAnsi="Cambria"/>
+                      <w:color w:val="5B6B8C"/>
+                      <w:sz w:val="20"/>
+                      <w:szCs w:val="20"/>
+                    </w:rPr>
+                    <w:t xml:space="preserve">Test: Was sichert der König damit?</w:t>
+                  </w:r>
+                </w:p>
+              </w:tc>
+            </w:tr>
+          </w:tbl>
+          <w:p>
+            <w:pPr>
+              <w:spacing w:after="20" w:before="0"/>
+            </w:pPr>
+            <w:r>
+              <w:rPr>
+                <w:rFonts w:ascii="Calibri" w:cs="Calibri" w:eastAsia="Calibri" w:hAnsi="Calibri"/>
+                <w:color w:val="000000"/>
+                <w:sz w:val="22"/>
+                <w:szCs w:val="22"/>
+              </w:rPr>
+              <w:t xml:space="preserve"/>
+            </w:r>
+          </w:p>
+        </w:tc>
+      </w:tr>
+    </w:tbl>
+    <w:p>
+      <w:pPr>
+        <w:spacing w:after="40" w:before="0"/>
+      </w:pPr>
+      <w:r>
+        <w:rPr>
+          <w:rFonts w:ascii="Calibri" w:cs="Calibri" w:eastAsia="Calibri" w:hAnsi="Calibri"/>
+          <w:color w:val="000000"/>
+          <w:sz w:val="22"/>
+          <w:szCs w:val="22"/>
+        </w:rPr>
+        <w:t xml:space="preserve"/>
+      </w:r>
+    </w:p>
+    <w:tbl>
+      <w:tblPr>
+        <w:tblW w:type="dxa" w:w="10206"/>
+        <w:tblBorders>
+          <w:top w:val="single" w:color="auto" w:sz="4"/>
+          <w:left w:val="single" w:color="auto" w:sz="4"/>
+          <w:bottom w:val="single" w:color="auto" w:sz="4"/>
+          <w:right w:val="single" w:color="auto" w:sz="4"/>
+          <w:insideH w:val="single" w:color="auto" w:sz="4"/>
+          <w:insideV w:val="single" w:color="auto" w:sz="4"/>
+        </w:tblBorders>
+      </w:tblPr>
+      <w:tblGrid>
+        <w:gridCol w:w="1700"/>
+        <w:gridCol w:w="8506"/>
+      </w:tblGrid>
+      <w:tr>
+        <w:trPr>
+          <w:cantSplit/>
+        </w:trPr>
+        <w:tc>
+          <w:tcPr>
+            <w:tcW w:type="dxa" w:w="1700"/>
+            <w:tcBorders>
+              <w:top w:val="single" w:color="D5DDEE" w:sz="6"/>
+              <w:left w:val="single" w:color="D5DDEE" w:sz="6"/>
+              <w:bottom w:val="single" w:color="D5DDEE" w:sz="6"/>
+              <w:right w:val="single" w:color="D5DDEE" w:sz="6"/>
+            </w:tcBorders>
+            <w:shd w:fill="F4F7FD" w:color="auto" w:val="clear"/>
+            <w:tcMar>
+              <w:top w:type="dxa" w:w="100"/>
+              <w:left w:type="dxa" w:w="100"/>
+              <w:bottom w:type="dxa" w:w="100"/>
+              <w:right w:type="dxa" w:w="100"/>
+            </w:tcMar>
+            <w:vAlign w:val="top"/>
+          </w:tcPr>
+          <w:p>
+            <w:pPr>
+              <w:spacing w:after="10" w:before="0"/>
+            </w:pPr>
+            <w:r>
+              <w:rPr>
+                <w:rFonts w:ascii="Calibri" w:cs="Calibri" w:eastAsia="Calibri" w:hAnsi="Calibri"/>
+                <w:color w:val="5B6B8C"/>
+                <w:sz w:val="16"/>
+                <w:szCs w:val="16"/>
+              </w:rPr>
+              <w:t xml:space="preserve">Klasse</w:t>
+            </w:r>
+          </w:p>
+          <w:p>
+            <w:pPr>
+              <w:spacing w:after="0" w:before="0"/>
+            </w:pPr>
+            <w:r>
+              <w:rPr>
+                <w:rFonts w:ascii="Calibri" w:cs="Calibri" w:eastAsia="Calibri" w:hAnsi="Calibri"/>
+                <w:b/>
+                <w:bCs/>
+                <w:color w:val="1E2761"/>
+                <w:sz w:val="20"/>
+                <w:szCs w:val="20"/>
+              </w:rPr>
+              <w:t xml:space="preserve">arbeitet allein</w:t>
+            </w:r>
+          </w:p>
+        </w:tc>
+        <w:tc>
+          <w:tcPr>
+            <w:tcW w:type="dxa" w:w="8506"/>
+            <w:tcBorders>
+              <w:top w:val="single" w:color="D5DDEE" w:sz="6"/>
+              <w:left w:val="single" w:color="D5DDEE" w:sz="6"/>
+              <w:bottom w:val="single" w:color="D5DDEE" w:sz="6"/>
+              <w:right w:val="single" w:color="D5DDEE" w:sz="6"/>
+            </w:tcBorders>
+            <w:tcMar>
+              <w:top w:type="dxa" w:w="100"/>
+              <w:left w:type="dxa" w:w="160"/>
+              <w:bottom w:type="dxa" w:w="100"/>
+              <w:right w:type="dxa" w:w="100"/>
+            </w:tcMar>
+            <w:vAlign w:val="top"/>
+          </w:tcPr>
+          <w:p>
+            <w:pPr>
+              <w:spacing w:after="60" w:before="0"/>
+            </w:pPr>
+            <w:r>
+              <w:rPr>
+                <w:rFonts w:ascii="Calibri" w:cs="Calibri" w:eastAsia="Calibri" w:hAnsi="Calibri"/>
+                <w:b/>
+                <w:bCs/>
+                <w:color w:val="D9534F"/>
+                <w:sz w:val="20"/>
+                <w:szCs w:val="20"/>
+              </w:rPr>
+              <w:t xml:space="preserve">Ansage: </w:t>
+            </w:r>
+            <w:r>
+              <w:rPr>
+                <w:rFonts w:ascii="Calibri" w:cs="Calibri" w:eastAsia="Calibri" w:hAnsi="Calibri"/>
+                <w:i/>
+                <w:iCs/>
+                <w:color w:val="000000"/>
+                <w:sz w:val="21"/>
+                <w:szCs w:val="21"/>
+              </w:rPr>
+              <w:t xml:space="preserve">„Ich teile das Arbeitsblatt aus. Jetzt arbeitet ihr allein. Die Aufgabe steht rechts.“</w:t>
+            </w:r>
+          </w:p>
+          <w:p>
+            <w:pPr>
+              <w:spacing w:after="50" w:before="0"/>
+            </w:pPr>
+            <w:r>
+              <w:rPr>
+                <w:rFonts w:ascii="Calibri" w:cs="Calibri" w:eastAsia="Calibri" w:hAnsi="Calibri"/>
+                <w:color w:val="000000"/>
+                <w:sz w:val="21"/>
+                <w:szCs w:val="21"/>
+              </w:rPr>
+              <w:t xml:space="preserve">Schnelle: ★-Aufgabe auf dem Arbeitsblatt (wichtigste Säule in einem Satz begründen).</w:t>
+            </w:r>
+          </w:p>
+          <w:tbl>
+            <w:tblPr>
+              <w:tblW w:type="dxa" w:w="8166"/>
+              <w:tblBorders>
+                <w:top w:val="single" w:color="auto" w:sz="4"/>
+                <w:left w:val="single" w:color="auto" w:sz="4"/>
+                <w:bottom w:val="single" w:color="auto" w:sz="4"/>
+                <w:right w:val="single" w:color="auto" w:sz="4"/>
+                <w:insideH w:val="single" w:color="auto" w:sz="4"/>
+                <w:insideV w:val="single" w:color="auto" w:sz="4"/>
+              </w:tblBorders>
+            </w:tblPr>
+            <w:tblGrid>
+              <w:gridCol w:w="8166"/>
+            </w:tblGrid>
+            <w:tr>
+              <w:trPr>
+                <w:cantSplit/>
+              </w:trPr>
+              <w:tc>
+                <w:tcPr>
+                  <w:tcW w:type="dxa" w:w="8166"/>
+                  <w:tcBorders>
+                    <w:top w:val="single" w:color="3D4A3F" w:sz="12"/>
+                    <w:left w:val="single" w:color="3D4A3F" w:sz="12"/>
+                    <w:bottom w:val="single" w:color="3D4A3F" w:sz="12"/>
+                    <w:right w:val="single" w:color="3D4A3F" w:sz="12"/>
+                  </w:tcBorders>
+                  <w:shd w:fill="3D4A3F" w:color="auto" w:val="clear"/>
+                  <w:tcMar>
+                    <w:top w:type="dxa" w:w="30"/>
+                    <w:left w:type="dxa" w:w="100"/>
+                    <w:bottom w:type="dxa" w:w="30"/>
+                    <w:right w:type="dxa" w:w="100"/>
+                  </w:tcMar>
+                  <w:vAlign w:val="center"/>
+                </w:tcPr>
+                <w:p>
+                  <w:pPr>
+                    <w:spacing w:after="0" w:before="0"/>
+                  </w:pPr>
+                  <w:r>
+                    <w:rPr>
+                      <w:rFonts w:ascii="Calibri" w:cs="Calibri" w:eastAsia="Calibri" w:hAnsi="Calibri"/>
+                      <w:b/>
+                      <w:bCs/>
+                      <w:color w:val="FFFFFF"/>
+                      <w:sz w:val="16"/>
+                      <w:szCs w:val="16"/>
+                    </w:rPr>
+                    <w:t xml:space="preserve">TAFEL · rechts · Ü1 Lückentext: Die fünf Säulen</w:t>
+                  </w:r>
+                </w:p>
+              </w:tc>
+            </w:tr>
+            <w:tr>
+              <w:trPr>
+                <w:cantSplit/>
+              </w:trPr>
+              <w:tc>
+                <w:tcPr>
+                  <w:tcW w:type="dxa" w:w="8166"/>
+                  <w:tcBorders>
+                    <w:top w:val="single" w:color="3D4A3F" w:sz="12"/>
+                    <w:left w:val="single" w:color="3D4A3F" w:sz="12"/>
+                    <w:bottom w:val="single" w:color="3D4A3F" w:sz="12"/>
+                    <w:right w:val="single" w:color="3D4A3F" w:sz="12"/>
+                  </w:tcBorders>
+                  <w:shd w:fill="F3F6F1" w:color="auto" w:val="clear"/>
+                  <w:tcMar>
+                    <w:top w:type="dxa" w:w="100"/>
+                    <w:left w:type="dxa" w:w="160"/>
+                    <w:bottom w:type="dxa" w:w="100"/>
+                    <w:right w:type="dxa" w:w="100"/>
+                  </w:tcMar>
+                  <w:vAlign w:val="center"/>
+                </w:tcPr>
+                <w:p>
+                  <w:pPr>
+                    <w:spacing w:after="30" w:before="0"/>
+                  </w:pPr>
+                  <w:r>
+                    <w:rPr>
+                      <w:rFonts w:ascii="Calibri" w:cs="Calibri" w:eastAsia="Calibri" w:hAnsi="Calibri"/>
+                      <w:b/>
+                      <w:bCs/>
+                      <w:color w:val="1E2761"/>
+                      <w:sz w:val="21"/>
+                      <w:szCs w:val="21"/>
+                    </w:rPr>
+                    <w:t xml:space="preserve">1. </w:t>
+                  </w:r>
+                  <w:r>
+                    <w:rPr>
+                      <w:rFonts w:ascii="Calibri" w:cs="Calibri" w:eastAsia="Calibri" w:hAnsi="Calibri"/>
+                      <w:b/>
+                      <w:bCs/>
+                      <w:color w:val="1E2761"/>
+                      <w:sz w:val="21"/>
+                      <w:szCs w:val="21"/>
+                    </w:rPr>
+                    <w:t xml:space="preserve">Schreibe Ü1 oben auf das Arbeitsblatt.</w:t>
+                  </w:r>
+                </w:p>
+                <w:p>
+                  <w:pPr>
+                    <w:spacing w:after="30" w:before="0"/>
+                  </w:pPr>
+                  <w:r>
+                    <w:rPr>
+                      <w:rFonts w:ascii="Calibri" w:cs="Calibri" w:eastAsia="Calibri" w:hAnsi="Calibri"/>
+                      <w:b/>
+                      <w:bCs/>
+                      <w:color w:val="1E2761"/>
+                      <w:sz w:val="21"/>
+                      <w:szCs w:val="21"/>
+                    </w:rPr>
+                    <w:t xml:space="preserve">2. </w:t>
+                  </w:r>
+                  <w:r>
+                    <w:rPr>
+                      <w:rFonts w:ascii="Calibri" w:cs="Calibri" w:eastAsia="Calibri" w:hAnsi="Calibri"/>
+                      <w:b/>
+                      <w:bCs/>
+                      <w:color w:val="1E2761"/>
+                      <w:sz w:val="21"/>
+                      <w:szCs w:val="21"/>
+                    </w:rPr>
+                    <w:t xml:space="preserve">Lies den Text einmal ganz. Ergänze die 12 Lücken mit dem Wortspeicher.</w:t>
+                  </w:r>
+                </w:p>
+                <w:p>
+                  <w:pPr>
+                    <w:spacing w:after="30" w:before="0"/>
+                  </w:pPr>
+                  <w:r>
+                    <w:rPr>
+                      <w:rFonts w:ascii="Calibri" w:cs="Calibri" w:eastAsia="Calibri" w:hAnsi="Calibri"/>
+                      <w:b/>
+                      <w:bCs/>
+                      <w:color w:val="1E2761"/>
+                      <w:sz w:val="21"/>
+                      <w:szCs w:val="21"/>
+                    </w:rPr>
+                    <w:t xml:space="preserve">3. </w:t>
+                  </w:r>
+                  <w:r>
+                    <w:rPr>
+                      <w:rFonts w:ascii="Calibri" w:cs="Calibri" w:eastAsia="Calibri" w:hAnsi="Calibri"/>
+                      <w:b/>
+                      <w:bCs/>
+                      <w:color w:val="1E2761"/>
+                      <w:sz w:val="21"/>
+                      <w:szCs w:val="21"/>
+                    </w:rPr>
+                    <w:t xml:space="preserve">Streiche jedes benutzte Wort durch. Zwei Wörter passen nicht.</w:t>
+                  </w:r>
+                </w:p>
+                <w:p>
+                  <w:pPr>
+                    <w:spacing w:after="30" w:before="0"/>
+                  </w:pPr>
+                  <w:r>
+                    <w:rPr>
+                      <w:rFonts w:ascii="Calibri" w:cs="Calibri" w:eastAsia="Calibri" w:hAnsi="Calibri"/>
+                      <w:color w:val="000000"/>
+                      <w:sz w:val="22"/>
+                      <w:szCs w:val="22"/>
+                    </w:rPr>
+                    <w:t xml:space="preserve"/>
+                  </w:r>
+                </w:p>
+                <w:p>
+                  <w:pPr>
+                    <w:spacing w:after="0" w:before="0"/>
+                  </w:pPr>
+                  <w:r>
+                    <w:rPr>
+                      <w:rFonts w:ascii="Calibri" w:cs="Calibri" w:eastAsia="Calibri" w:hAnsi="Calibri"/>
+                      <w:b/>
+                      <w:bCs/>
+                      <w:color w:val="3D4A3F"/>
+                      <w:sz w:val="19"/>
+                      <w:szCs w:val="19"/>
+                    </w:rPr>
+                    <w:t xml:space="preserve">Zeit: </w:t>
+                  </w:r>
+                  <w:r>
+                    <w:rPr>
+                      <w:rFonts w:ascii="Calibri" w:cs="Calibri" w:eastAsia="Calibri" w:hAnsi="Calibri"/>
+                      <w:color w:val="3D4A3F"/>
+                      <w:sz w:val="19"/>
+                      <w:szCs w:val="19"/>
+                    </w:rPr>
+                    <w:t xml:space="preserve">6 Minuten · allein · leise</w:t>
+                  </w:r>
+                  <w:r>
+                    <w:rPr>
+                      <w:rFonts w:ascii="Calibri" w:cs="Calibri" w:eastAsia="Calibri" w:hAnsi="Calibri"/>
+                      <w:i/>
+                      <w:iCs/>
+                      <w:color w:val="3D4A3F"/>
+                      <w:sz w:val="19"/>
+                      <w:szCs w:val="19"/>
+                    </w:rPr>
+                    <w:t xml:space="preserve">     Fertig? Stift hinlegen und noch einmal durchlesen.</w:t>
+                  </w:r>
+                </w:p>
+              </w:tc>
+            </w:tr>
+          </w:tbl>
+          <w:p>
+            <w:pPr>
+              <w:spacing w:after="20" w:before="0"/>
+            </w:pPr>
+            <w:r>
+              <w:rPr>
+                <w:rFonts w:ascii="Calibri" w:cs="Calibri" w:eastAsia="Calibri" w:hAnsi="Calibri"/>
+                <w:color w:val="000000"/>
+                <w:sz w:val="22"/>
+                <w:szCs w:val="22"/>
+              </w:rPr>
+              <w:t xml:space="preserve"/>
+            </w:r>
+          </w:p>
+        </w:tc>
+      </w:tr>
+    </w:tbl>
+    <w:p>
+      <w:pPr>
+        <w:spacing w:after="40" w:before="0"/>
+      </w:pPr>
+      <w:r>
+        <w:rPr>
+          <w:rFonts w:ascii="Calibri" w:cs="Calibri" w:eastAsia="Calibri" w:hAnsi="Calibri"/>
+          <w:color w:val="000000"/>
+          <w:sz w:val="22"/>
+          <w:szCs w:val="22"/>
+        </w:rPr>
+        <w:t xml:space="preserve"/>
+      </w:r>
+    </w:p>
+    <w:tbl>
+      <w:tblPr>
+        <w:tblW w:type="dxa" w:w="10206"/>
+        <w:tblBorders>
+          <w:top w:val="single" w:color="auto" w:sz="4"/>
+          <w:left w:val="single" w:color="auto" w:sz="4"/>
+          <w:bottom w:val="single" w:color="auto" w:sz="4"/>
+          <w:right w:val="single" w:color="auto" w:sz="4"/>
+          <w:insideH w:val="single" w:color="auto" w:sz="4"/>
+          <w:insideV w:val="single" w:color="auto" w:sz="4"/>
+        </w:tblBorders>
+      </w:tblPr>
+      <w:tblGrid>
+        <w:gridCol w:w="1700"/>
+        <w:gridCol w:w="8506"/>
+      </w:tblGrid>
+      <w:tr>
+        <w:trPr>
+          <w:cantSplit/>
+        </w:trPr>
+        <w:tc>
+          <w:tcPr>
+            <w:tcW w:type="dxa" w:w="1700"/>
+            <w:tcBorders>
+              <w:top w:val="single" w:color="D5DDEE" w:sz="6"/>
+              <w:left w:val="single" w:color="D5DDEE" w:sz="6"/>
+              <w:bottom w:val="single" w:color="D5DDEE" w:sz="6"/>
+              <w:right w:val="single" w:color="D5DDEE" w:sz="6"/>
+            </w:tcBorders>
+            <w:shd w:fill="F4F7FD" w:color="auto" w:val="clear"/>
+            <w:tcMar>
+              <w:top w:type="dxa" w:w="100"/>
+              <w:left w:type="dxa" w:w="100"/>
+              <w:bottom w:type="dxa" w:w="100"/>
+              <w:right w:type="dxa" w:w="100"/>
+            </w:tcMar>
+            <w:vAlign w:val="top"/>
+          </w:tcPr>
+          <w:p>
+            <w:pPr>
+              <w:spacing w:after="10" w:before="0"/>
+            </w:pPr>
+            <w:r>
+              <w:rPr>
+                <w:rFonts w:ascii="Calibri" w:cs="Calibri" w:eastAsia="Calibri" w:hAnsi="Calibri"/>
+                <w:color w:val="5B6B8C"/>
+                <w:sz w:val="16"/>
+                <w:szCs w:val="16"/>
+              </w:rPr>
+              <w:t xml:space="preserve">Klasse</w:t>
+            </w:r>
+          </w:p>
+          <w:p>
+            <w:pPr>
+              <w:spacing w:after="0" w:before="0"/>
+            </w:pPr>
+            <w:r>
+              <w:rPr>
+                <w:rFonts w:ascii="Calibri" w:cs="Calibri" w:eastAsia="Calibri" w:hAnsi="Calibri"/>
+                <w:b/>
+                <w:bCs/>
+                <w:color w:val="1E2761"/>
+                <w:sz w:val="20"/>
+                <w:szCs w:val="20"/>
+              </w:rPr>
+              <w:t xml:space="preserve">kommt an die Tafel</w:t>
+            </w:r>
+          </w:p>
+        </w:tc>
+        <w:tc>
+          <w:tcPr>
+            <w:tcW w:type="dxa" w:w="8506"/>
+            <w:tcBorders>
+              <w:top w:val="single" w:color="D5DDEE" w:sz="6"/>
+              <w:left w:val="single" w:color="D5DDEE" w:sz="6"/>
+              <w:bottom w:val="single" w:color="D5DDEE" w:sz="6"/>
+              <w:right w:val="single" w:color="D5DDEE" w:sz="6"/>
+            </w:tcBorders>
+            <w:tcMar>
+              <w:top w:type="dxa" w:w="100"/>
+              <w:left w:type="dxa" w:w="160"/>
+              <w:bottom w:type="dxa" w:w="100"/>
+              <w:right w:type="dxa" w:w="100"/>
+            </w:tcMar>
+            <w:vAlign w:val="top"/>
+          </w:tcPr>
+          <w:p>
+            <w:pPr>
+              <w:spacing w:after="60" w:before="0"/>
+            </w:pPr>
+            <w:r>
+              <w:rPr>
+                <w:rFonts w:ascii="Calibri" w:cs="Calibri" w:eastAsia="Calibri" w:hAnsi="Calibri"/>
+                <w:b/>
+                <w:bCs/>
+                <w:color w:val="D9534F"/>
+                <w:sz w:val="20"/>
+                <w:szCs w:val="20"/>
+              </w:rPr>
+              <w:t xml:space="preserve">Ansage: </w:t>
+            </w:r>
+            <w:r>
+              <w:rPr>
+                <w:rFonts w:ascii="Calibri" w:cs="Calibri" w:eastAsia="Calibri" w:hAnsi="Calibri"/>
+                <w:i/>
+                <w:iCs/>
+                <w:color w:val="000000"/>
+                <w:sz w:val="21"/>
+                <w:szCs w:val="21"/>
+              </w:rPr>
+              <w:t xml:space="preserve">„Wer drankommt, liest einen Absatz vor. Alle prüfen mit. … Vergleicht und verbessert mit Grün.“</w:t>
+            </w:r>
+          </w:p>
+          <w:p>
+            <w:pPr>
+              <w:spacing w:after="50" w:before="0"/>
+            </w:pPr>
+            <w:r>
+              <w:rPr>
+                <w:rFonts w:ascii="Calibri" w:cs="Calibri" w:eastAsia="Calibri" w:hAnsi="Calibri"/>
+                <w:color w:val="000000"/>
+                <w:sz w:val="21"/>
+                <w:szCs w:val="21"/>
+              </w:rPr>
+              <w:t xml:space="preserve">Pro Säule eine Schülerin oder einen Schüler den Absatz vorlesen lassen. Bei Fehlern nach der Begründung fragen: „Welche Stelle im Text spricht dagegen?“</w:t>
+            </w:r>
+          </w:p>
+          <w:p>
+            <w:pPr>
+              <w:spacing w:after="0" w:before="0"/>
+            </w:pPr>
+            <w:r>
+              <w:rPr>
+                <w:rFonts w:ascii="Calibri" w:cs="Calibri" w:eastAsia="Calibri" w:hAnsi="Calibri"/>
+                <w:b/>
+                <w:bCs/>
+                <w:color w:val="5B6B8C"/>
+                <w:sz w:val="19"/>
+                <w:szCs w:val="19"/>
+              </w:rPr>
+              <w:t xml:space="preserve">Lösung: </w:t>
+            </w:r>
+            <w:r>
+              <w:rPr>
+                <w:rFonts w:ascii="Calibri" w:cs="Calibri" w:eastAsia="Calibri" w:hAnsi="Calibri"/>
+                <w:color w:val="5B6B8C"/>
+                <w:sz w:val="19"/>
+                <w:szCs w:val="19"/>
+              </w:rPr>
+              <w:t xml:space="preserve">1 absoluter · 2 Beamte · 3 Intendanten · 4 Steuerfreiheit · 5 Versailles · 6 Merkantilismus · 7 Zölle · 8 Gottesgnadentum · 9 Glaube · 10 stehendes · 11 400.000 · 12 Drittel. Nicht passend: Söldner (Ludwig verzichtete auf sie), Parlament (im Absolutismus kann niemand den König stoppen).</w:t>
+            </w:r>
+          </w:p>
+        </w:tc>
+      </w:tr>
+    </w:tbl>
+    <w:p>
+      <w:pPr>
+        <w:spacing w:after="40" w:before="0"/>
+      </w:pPr>
+      <w:r>
+        <w:rPr>
+          <w:rFonts w:ascii="Calibri" w:cs="Calibri" w:eastAsia="Calibri" w:hAnsi="Calibri"/>
+          <w:color w:val="000000"/>
+          <w:sz w:val="22"/>
+          <w:szCs w:val="22"/>
+        </w:rPr>
+        <w:t xml:space="preserve"/>
+      </w:r>
+    </w:p>
+    <w:tbl>
+      <w:tblPr>
+        <w:tblW w:type="dxa" w:w="10206"/>
+        <w:tblBorders>
+          <w:top w:val="single" w:color="auto" w:sz="4"/>
+          <w:left w:val="single" w:color="auto" w:sz="4"/>
+          <w:bottom w:val="single" w:color="auto" w:sz="4"/>
+          <w:right w:val="single" w:color="auto" w:sz="4"/>
+          <w:insideH w:val="single" w:color="auto" w:sz="4"/>
+          <w:insideV w:val="single" w:color="auto" w:sz="4"/>
+        </w:tblBorders>
+      </w:tblPr>
+      <w:tblGrid>
+        <w:gridCol w:w="1700"/>
+        <w:gridCol w:w="8506"/>
+      </w:tblGrid>
+      <w:tr>
+        <w:trPr>
+          <w:cantSplit/>
+        </w:trPr>
+        <w:tc>
+          <w:tcPr>
+            <w:tcW w:type="dxa" w:w="1700"/>
+            <w:tcBorders>
+              <w:top w:val="single" w:color="D5DDEE" w:sz="6"/>
+              <w:left w:val="single" w:color="D5DDEE" w:sz="6"/>
+              <w:bottom w:val="single" w:color="D5DDEE" w:sz="6"/>
+              <w:right w:val="single" w:color="D5DDEE" w:sz="6"/>
+            </w:tcBorders>
+            <w:shd w:fill="F4F7FD" w:color="auto" w:val="clear"/>
+            <w:tcMar>
+              <w:top w:type="dxa" w:w="100"/>
+              <w:left w:type="dxa" w:w="100"/>
+              <w:bottom w:type="dxa" w:w="100"/>
+              <w:right w:type="dxa" w:w="100"/>
+            </w:tcMar>
+            <w:vAlign w:val="top"/>
+          </w:tcPr>
+          <w:p>
+            <w:pPr>
+              <w:spacing w:after="10" w:before="0"/>
+            </w:pPr>
+            <w:r>
+              <w:rPr>
+                <w:rFonts w:ascii="Calibri" w:cs="Calibri" w:eastAsia="Calibri" w:hAnsi="Calibri"/>
+                <w:color w:val="5B6B8C"/>
+                <w:sz w:val="16"/>
+                <w:szCs w:val="16"/>
+              </w:rPr>
+              <w:t xml:space="preserve">Klasse</w:t>
+            </w:r>
+          </w:p>
+          <w:p>
+            <w:pPr>
+              <w:spacing w:after="0" w:before="0"/>
+            </w:pPr>
+            <w:r>
+              <w:rPr>
+                <w:rFonts w:ascii="Calibri" w:cs="Calibri" w:eastAsia="Calibri" w:hAnsi="Calibri"/>
+                <w:b/>
+                <w:bCs/>
+                <w:color w:val="1E2761"/>
+                <w:sz w:val="20"/>
+                <w:szCs w:val="20"/>
+              </w:rPr>
+              <w:t xml:space="preserve">macht mündlich mit</w:t>
+            </w:r>
+          </w:p>
+        </w:tc>
+        <w:tc>
+          <w:tcPr>
+            <w:tcW w:type="dxa" w:w="8506"/>
+            <w:tcBorders>
+              <w:top w:val="single" w:color="D5DDEE" w:sz="6"/>
+              <w:left w:val="single" w:color="D5DDEE" w:sz="6"/>
+              <w:bottom w:val="single" w:color="D5DDEE" w:sz="6"/>
+              <w:right w:val="single" w:color="D5DDEE" w:sz="6"/>
+            </w:tcBorders>
+            <w:tcMar>
+              <w:top w:type="dxa" w:w="100"/>
+              <w:left w:type="dxa" w:w="160"/>
+              <w:bottom w:type="dxa" w:w="100"/>
+              <w:right w:type="dxa" w:w="100"/>
+            </w:tcMar>
+            <w:vAlign w:val="top"/>
+          </w:tcPr>
+          <w:p>
+            <w:pPr>
+              <w:spacing w:after="60" w:before="0"/>
+            </w:pPr>
+            <w:r>
+              <w:rPr>
+                <w:rFonts w:ascii="Calibri" w:cs="Calibri" w:eastAsia="Calibri" w:hAnsi="Calibri"/>
+                <w:b/>
+                <w:bCs/>
+                <w:color w:val="D9534F"/>
+                <w:sz w:val="20"/>
+                <w:szCs w:val="20"/>
+              </w:rPr>
+              <w:t xml:space="preserve">Ansage: </w:t>
+            </w:r>
+            <w:r>
+              <w:rPr>
+                <w:rFonts w:ascii="Calibri" w:cs="Calibri" w:eastAsia="Calibri" w:hAnsi="Calibri"/>
+                <w:i/>
+                <w:iCs/>
+                <w:color w:val="000000"/>
+                <w:sz w:val="21"/>
+                <w:szCs w:val="21"/>
+              </w:rPr>
+              <w:t xml:space="preserve">„Meldet euch. Ihr schreibt noch nichts auf. Was sichert der König mit jeder Säule?“</w:t>
+            </w:r>
+          </w:p>
+          <w:p>
+            <w:pPr>
+              <w:spacing w:after="50" w:before="0"/>
+            </w:pPr>
+            <w:r>
+              <w:rPr>
+                <w:rFonts w:ascii="Calibri" w:cs="Calibri" w:eastAsia="Calibri" w:hAnsi="Calibri"/>
+                <w:color w:val="000000"/>
+                <w:sz w:val="21"/>
+                <w:szCs w:val="21"/>
+              </w:rPr>
+              <w:t xml:space="preserve">Das Tafelbild entsteht gemeinsam, nicht abzeichnen (steht schon im Merksatz und im Lückentext):</w:t>
+            </w:r>
+          </w:p>
+          <w:tbl>
+            <w:tblPr>
+              <w:tblW w:type="dxa" w:w="8166"/>
+              <w:tblBorders>
+                <w:top w:val="single" w:color="auto" w:sz="4"/>
+                <w:left w:val="single" w:color="auto" w:sz="4"/>
+                <w:bottom w:val="single" w:color="auto" w:sz="4"/>
+                <w:right w:val="single" w:color="auto" w:sz="4"/>
+                <w:insideH w:val="single" w:color="auto" w:sz="4"/>
+                <w:insideV w:val="single" w:color="auto" w:sz="4"/>
+              </w:tblBorders>
+            </w:tblPr>
+            <w:tblGrid>
+              <w:gridCol w:w="8166"/>
+            </w:tblGrid>
+            <w:tr>
+              <w:trPr>
+                <w:cantSplit/>
+              </w:trPr>
+              <w:tc>
+                <w:tcPr>
+                  <w:tcW w:type="dxa" w:w="8166"/>
+                  <w:tcBorders>
+                    <w:top w:val="single" w:color="3D4A3F" w:sz="12"/>
+                    <w:left w:val="single" w:color="3D4A3F" w:sz="12"/>
+                    <w:bottom w:val="single" w:color="3D4A3F" w:sz="12"/>
+                    <w:right w:val="single" w:color="3D4A3F" w:sz="12"/>
+                  </w:tcBorders>
+                  <w:shd w:fill="3D4A3F" w:color="auto" w:val="clear"/>
+                  <w:tcMar>
+                    <w:top w:type="dxa" w:w="30"/>
+                    <w:left w:type="dxa" w:w="100"/>
+                    <w:bottom w:type="dxa" w:w="30"/>
+                    <w:right w:type="dxa" w:w="100"/>
+                  </w:tcMar>
+                  <w:vAlign w:val="center"/>
+                </w:tcPr>
+                <w:p>
+                  <w:pPr>
+                    <w:spacing w:after="0" w:before="0"/>
+                  </w:pPr>
+                  <w:r>
+                    <w:rPr>
+                      <w:rFonts w:ascii="Calibri" w:cs="Calibri" w:eastAsia="Calibri" w:hAnsi="Calibri"/>
+                      <w:b/>
+                      <w:bCs/>
+                      <w:color w:val="FFFFFF"/>
+                      <w:sz w:val="16"/>
+                      <w:szCs w:val="16"/>
+                    </w:rPr>
+                    <w:t xml:space="preserve">TAFEL · Mitte · Säulen-Tafelbild</w:t>
+                  </w:r>
+                </w:p>
+              </w:tc>
+            </w:tr>
+            <w:tr>
+              <w:trPr>
+                <w:cantSplit/>
+              </w:trPr>
+              <w:tc>
+                <w:tcPr>
+                  <w:tcW w:type="dxa" w:w="8166"/>
+                  <w:tcBorders>
+                    <w:top w:val="single" w:color="3D4A3F" w:sz="12"/>
+                    <w:left w:val="single" w:color="3D4A3F" w:sz="12"/>
+                    <w:bottom w:val="single" w:color="3D4A3F" w:sz="12"/>
+                    <w:right w:val="single" w:color="3D4A3F" w:sz="12"/>
+                  </w:tcBorders>
+                  <w:shd w:fill="F3F6F1" w:color="auto" w:val="clear"/>
+                  <w:tcMar>
+                    <w:top w:type="dxa" w:w="100"/>
+                    <w:left w:type="dxa" w:w="160"/>
+                    <w:bottom w:type="dxa" w:w="100"/>
+                    <w:right w:type="dxa" w:w="100"/>
+                  </w:tcMar>
+                  <w:vAlign w:val="center"/>
+                </w:tcPr>
+                <w:p>
+                  <w:pPr>
+                    <w:spacing w:after="30" w:before="0"/>
+                  </w:pPr>
+                  <w:r>
+                    <w:rPr>
+                      <w:rFonts w:ascii="Cambria" w:cs="Cambria" w:eastAsia="Cambria" w:hAnsi="Cambria"/>
+                      <w:b/>
+                      <w:bCs/>
+                      <w:color w:val="1E2761"/>
+                      <w:sz w:val="22"/>
+                      <w:szCs w:val="22"/>
+                    </w:rPr>
+                    <w:t xml:space="preserve">Dach:  Absolute Herrschaft Ludwigs XIV.</w:t>
+                  </w:r>
+                </w:p>
+                <w:p>
+                  <w:pPr>
+                    <w:spacing w:after="30" w:before="0"/>
+                  </w:pPr>
+                  <w:r>
+                    <w:rPr>
+                      <w:rFonts w:ascii="Cambria" w:cs="Cambria" w:eastAsia="Cambria" w:hAnsi="Cambria"/>
+                      <w:color w:val="000000"/>
+                      <w:sz w:val="22"/>
+                      <w:szCs w:val="22"/>
+                    </w:rPr>
+                    <w:t xml:space="preserve">Säule 1 Verwaltung/Justiz  →  Kontrolle über das Land</w:t>
+                  </w:r>
+                </w:p>
+                <w:p>
+                  <w:pPr>
+                    <w:spacing w:after="30" w:before="0"/>
+                  </w:pPr>
+                  <w:r>
+                    <w:rPr>
+                      <w:rFonts w:ascii="Cambria" w:cs="Cambria" w:eastAsia="Cambria" w:hAnsi="Cambria"/>
+                      <w:color w:val="000000"/>
+                      <w:sz w:val="22"/>
+                      <w:szCs w:val="22"/>
+                    </w:rPr>
+                    <w:t xml:space="preserve">Säule 2 Adel/Hof  →  kein adeliger Widerstand</w:t>
+                  </w:r>
+                </w:p>
+                <w:p>
+                  <w:pPr>
+                    <w:spacing w:after="30" w:before="0"/>
+                  </w:pPr>
+                  <w:r>
+                    <w:rPr>
+                      <w:rFonts w:ascii="Cambria" w:cs="Cambria" w:eastAsia="Cambria" w:hAnsi="Cambria"/>
+                      <w:color w:val="000000"/>
+                      <w:sz w:val="22"/>
+                      <w:szCs w:val="22"/>
+                    </w:rPr>
+                    <w:t xml:space="preserve">Säule 3 Wirtschaft  →  Geld für Hof, Beamte und Heer</w:t>
+                  </w:r>
+                </w:p>
+                <w:p>
+                  <w:pPr>
+                    <w:spacing w:after="30" w:before="0"/>
+                  </w:pPr>
+                  <w:r>
+                    <w:rPr>
+                      <w:rFonts w:ascii="Cambria" w:cs="Cambria" w:eastAsia="Cambria" w:hAnsi="Cambria"/>
+                      <w:color w:val="000000"/>
+                      <w:sz w:val="22"/>
+                      <w:szCs w:val="22"/>
+                    </w:rPr>
+                    <w:t xml:space="preserve">Säule 4 Religion  →  Herrschaft von Gott gewollt, ein Glaube</w:t>
+                  </w:r>
+                </w:p>
+                <w:p>
+                  <w:pPr>
+                    <w:spacing w:after="0" w:before="0"/>
+                  </w:pPr>
+                  <w:r>
+                    <w:rPr>
+                      <w:rFonts w:ascii="Cambria" w:cs="Cambria" w:eastAsia="Cambria" w:hAnsi="Cambria"/>
+                      <w:color w:val="000000"/>
+                      <w:sz w:val="22"/>
+                      <w:szCs w:val="22"/>
+                    </w:rPr>
+                    <w:t xml:space="preserve">Säule 5 Heer  →  Macht nach innen und außen durchsetzen</w:t>
+                  </w:r>
+                </w:p>
+              </w:tc>
+            </w:tr>
+          </w:tbl>
+          <w:p>
+            <w:pPr>
+              <w:spacing w:after="20" w:before="0"/>
+            </w:pPr>
+            <w:r>
+              <w:rPr>
+                <w:rFonts w:ascii="Calibri" w:cs="Calibri" w:eastAsia="Calibri" w:hAnsi="Calibri"/>
+                <w:color w:val="000000"/>
+                <w:sz w:val="22"/>
+                <w:szCs w:val="22"/>
+              </w:rPr>
+              <w:t xml:space="preserve"/>
+            </w:r>
+          </w:p>
+          <w:p>
+            <w:pPr>
+              <w:spacing w:after="0" w:before="0"/>
+            </w:pPr>
+            <w:r>
+              <w:rPr>
+                <w:rFonts w:ascii="Calibri" w:cs="Calibri" w:eastAsia="Calibri" w:hAnsi="Calibri"/>
+                <w:b/>
+                <w:bCs/>
+                <w:color w:val="5B6B8C"/>
+                <w:sz w:val="19"/>
+                <w:szCs w:val="19"/>
+              </w:rPr>
+              <w:t xml:space="preserve">Lösung: </w:t>
+            </w:r>
+            <w:r>
+              <w:rPr>
+                <w:rFonts w:ascii="Calibri" w:cs="Calibri" w:eastAsia="Calibri" w:hAnsi="Calibri"/>
+                <w:color w:val="5B6B8C"/>
+                <w:sz w:val="19"/>
+                <w:szCs w:val="19"/>
+              </w:rPr>
+              <w:t xml:space="preserve">Schüler formulieren die Antworten selbst, die Lehrkraft notiert Stichworte. Abschlussfrage aus dem Gruppenpuzzle: Wie sicherte Ludwig XIV. seine Macht? (Er konzentriert möglichst viel Macht bei sich und stützt sie auf Verwaltung, Hof, Wirtschaft, Religion und Heer.)</w:t>
+            </w:r>
+          </w:p>
+        </w:tc>
+      </w:tr>
+    </w:tbl>
+    <w:p>
+      <w:pPr>
+        <w:spacing w:after="40" w:before="0"/>
+      </w:pPr>
+      <w:r>
+        <w:rPr>
+          <w:rFonts w:ascii="Calibri" w:cs="Calibri" w:eastAsia="Calibri" w:hAnsi="Calibri"/>
+          <w:color w:val="000000"/>
+          <w:sz w:val="22"/>
+          <w:szCs w:val="22"/>
+        </w:rPr>
+        <w:t xml:space="preserve"/>
+      </w:r>
+    </w:p>
+    <w:p>
+      <w:pPr>
+        <w:keepNext/>
+        <w:spacing w:after="100" w:before="200"/>
+      </w:pPr>
+      <w:r>
+        <w:rPr>
+          <w:rFonts w:ascii="Cambria" w:cs="Cambria" w:eastAsia="Cambria" w:hAnsi="Cambria"/>
+          <w:b/>
+          <w:bCs/>
+          <w:color w:val="D9534F"/>
+          <w:sz w:val="28"/>
+          <w:szCs w:val="28"/>
+        </w:rPr>
+        <w:t xml:space="preserve">2  </w:t>
       </w:r>
       <w:r>
         <w:rPr>
@@ -2384,7 +3606,7 @@
           <w:sz w:val="28"/>
           <w:szCs w:val="28"/>
         </w:rPr>
-        <w:t xml:space="preserve">2  </w:t>
+        <w:t xml:space="preserve">3  </w:t>
       </w:r>
       <w:r>
         <w:rPr>
@@ -2810,7 +4032,7 @@
                 <w:sz w:val="21"/>
                 <w:szCs w:val="21"/>
               </w:rPr>
-              <w:t xml:space="preserve">„Jetzt schreibt ihr von der Folie ab: Merksatz 1. Rahmt ihn rot ein.“</w:t>
+              <w:t xml:space="preserve">„Jetzt schreibt ihr von der Folie ab: Merksatz 2. Rahmt ihn rot ein.“</w:t>
             </w:r>
           </w:p>
           <w:tbl>
@@ -2863,7 +4085,7 @@
                       <w:sz w:val="16"/>
                       <w:szCs w:val="16"/>
                     </w:rPr>
-                    <w:t xml:space="preserve">FOLIE · Merksatz 1 – abschreiben, rot umrahmen</w:t>
+                    <w:t xml:space="preserve">FOLIE · Merksatz 2 – abschreiben, rot umrahmen</w:t>
                   </w:r>
                 </w:p>
               </w:tc>
@@ -3159,7 +4381,7 @@
                       <w:sz w:val="16"/>
                       <w:szCs w:val="16"/>
                     </w:rPr>
-                    <w:t xml:space="preserve">TAFEL · rechts · Ü1 Absolutismus – ja oder nein?</w:t>
+                    <w:t xml:space="preserve">TAFEL · rechts · Ü2 Absolutismus – ja oder nein?</w:t>
                   </w:r>
                 </w:p>
               </w:tc>
@@ -3210,7 +4432,7 @@
                       <w:sz w:val="21"/>
                       <w:szCs w:val="21"/>
                     </w:rPr>
-                    <w:t xml:space="preserve">Schreibe Ü1 an den Rand.</w:t>
+                    <w:t xml:space="preserve">Schreibe Ü2 an den Rand.</w:t>
                   </w:r>
                 </w:p>
                 <w:p>
@@ -3557,1228 +4779,6 @@
                 <w:szCs w:val="19"/>
               </w:rPr>
               <w:t xml:space="preserve">1 Absolutismus (niemand kontrolliert ihn) · 2 kein Absolutismus (das Parlament kann den König stoppen) · 3 Absolutismus (Beamte sind ihm zum Gehorsam verpflichtet, er kontrolliert sie) · 4 kein Absolutismus (Wahl = Macht ist begrenzt und auf Zeit).</w:t>
-            </w:r>
-          </w:p>
-        </w:tc>
-      </w:tr>
-    </w:tbl>
-    <w:p>
-      <w:pPr>
-        <w:spacing w:after="40" w:before="0"/>
-      </w:pPr>
-      <w:r>
-        <w:rPr>
-          <w:rFonts w:ascii="Calibri" w:cs="Calibri" w:eastAsia="Calibri" w:hAnsi="Calibri"/>
-          <w:color w:val="000000"/>
-          <w:sz w:val="22"/>
-          <w:szCs w:val="22"/>
-        </w:rPr>
-        <w:t xml:space="preserve"/>
-      </w:r>
-    </w:p>
-    <w:p>
-      <w:pPr>
-        <w:keepNext/>
-        <w:spacing w:after="100" w:before="200"/>
-      </w:pPr>
-      <w:r>
-        <w:rPr>
-          <w:rFonts w:ascii="Cambria" w:cs="Cambria" w:eastAsia="Cambria" w:hAnsi="Cambria"/>
-          <w:b/>
-          <w:bCs/>
-          <w:color w:val="D9534F"/>
-          <w:sz w:val="28"/>
-          <w:szCs w:val="28"/>
-        </w:rPr>
-        <w:t xml:space="preserve">3  </w:t>
-      </w:r>
-      <w:r>
-        <w:rPr>
-          <w:rFonts w:ascii="Cambria" w:cs="Cambria" w:eastAsia="Cambria" w:hAnsi="Cambria"/>
-          <w:b/>
-          <w:bCs/>
-          <w:color w:val="1E2761"/>
-          <w:sz w:val="28"/>
-          <w:szCs w:val="28"/>
-        </w:rPr>
-        <w:t xml:space="preserve">Die fünf Säulen</w:t>
-      </w:r>
-      <w:r>
-        <w:rPr>
-          <w:rFonts w:ascii="Calibri" w:cs="Calibri" w:eastAsia="Calibri" w:hAnsi="Calibri"/>
-          <w:b/>
-          <w:bCs/>
-          <w:color w:val="C77C12"/>
-          <w:sz w:val="20"/>
-          <w:szCs w:val="20"/>
-        </w:rPr>
-        <w:t xml:space="preserve">   11 Min.</w:t>
-      </w:r>
-    </w:p>
-    <w:tbl>
-      <w:tblPr>
-        <w:tblW w:type="dxa" w:w="10206"/>
-        <w:tblBorders>
-          <w:top w:val="single" w:color="auto" w:sz="4"/>
-          <w:left w:val="single" w:color="auto" w:sz="4"/>
-          <w:bottom w:val="single" w:color="auto" w:sz="4"/>
-          <w:right w:val="single" w:color="auto" w:sz="4"/>
-          <w:insideH w:val="single" w:color="auto" w:sz="4"/>
-          <w:insideV w:val="single" w:color="auto" w:sz="4"/>
-        </w:tblBorders>
-      </w:tblPr>
-      <w:tblGrid>
-        <w:gridCol w:w="1700"/>
-        <w:gridCol w:w="8506"/>
-      </w:tblGrid>
-      <w:tr>
-        <w:trPr>
-          <w:cantSplit/>
-        </w:trPr>
-        <w:tc>
-          <w:tcPr>
-            <w:tcW w:type="dxa" w:w="1700"/>
-            <w:tcBorders>
-              <w:top w:val="single" w:color="D5DDEE" w:sz="6"/>
-              <w:left w:val="single" w:color="D5DDEE" w:sz="6"/>
-              <w:bottom w:val="single" w:color="D5DDEE" w:sz="6"/>
-              <w:right w:val="single" w:color="D5DDEE" w:sz="6"/>
-            </w:tcBorders>
-            <w:shd w:fill="F4F7FD" w:color="auto" w:val="clear"/>
-            <w:tcMar>
-              <w:top w:type="dxa" w:w="100"/>
-              <w:left w:type="dxa" w:w="100"/>
-              <w:bottom w:type="dxa" w:w="100"/>
-              <w:right w:type="dxa" w:w="100"/>
-            </w:tcMar>
-            <w:vAlign w:val="top"/>
-          </w:tcPr>
-          <w:p>
-            <w:pPr>
-              <w:spacing w:after="10" w:before="0"/>
-            </w:pPr>
-            <w:r>
-              <w:rPr>
-                <w:rFonts w:ascii="Calibri" w:cs="Calibri" w:eastAsia="Calibri" w:hAnsi="Calibri"/>
-                <w:color w:val="5B6B8C"/>
-                <w:sz w:val="16"/>
-                <w:szCs w:val="16"/>
-              </w:rPr>
-              <w:t xml:space="preserve">Klasse</w:t>
-            </w:r>
-          </w:p>
-          <w:p>
-            <w:pPr>
-              <w:spacing w:after="0" w:before="0"/>
-            </w:pPr>
-            <w:r>
-              <w:rPr>
-                <w:rFonts w:ascii="Calibri" w:cs="Calibri" w:eastAsia="Calibri" w:hAnsi="Calibri"/>
-                <w:b/>
-                <w:bCs/>
-                <w:color w:val="1E2761"/>
-                <w:sz w:val="20"/>
-                <w:szCs w:val="20"/>
-              </w:rPr>
-              <w:t xml:space="preserve">schreibt ab</w:t>
-            </w:r>
-          </w:p>
-        </w:tc>
-        <w:tc>
-          <w:tcPr>
-            <w:tcW w:type="dxa" w:w="8506"/>
-            <w:tcBorders>
-              <w:top w:val="single" w:color="D5DDEE" w:sz="6"/>
-              <w:left w:val="single" w:color="D5DDEE" w:sz="6"/>
-              <w:bottom w:val="single" w:color="D5DDEE" w:sz="6"/>
-              <w:right w:val="single" w:color="D5DDEE" w:sz="6"/>
-            </w:tcBorders>
-            <w:tcMar>
-              <w:top w:type="dxa" w:w="100"/>
-              <w:left w:type="dxa" w:w="160"/>
-              <w:bottom w:type="dxa" w:w="100"/>
-              <w:right w:type="dxa" w:w="100"/>
-            </w:tcMar>
-            <w:vAlign w:val="top"/>
-          </w:tcPr>
-          <w:p>
-            <w:pPr>
-              <w:spacing w:after="60" w:before="0"/>
-            </w:pPr>
-            <w:r>
-              <w:rPr>
-                <w:rFonts w:ascii="Calibri" w:cs="Calibri" w:eastAsia="Calibri" w:hAnsi="Calibri"/>
-                <w:b/>
-                <w:bCs/>
-                <w:color w:val="D9534F"/>
-                <w:sz w:val="20"/>
-                <w:szCs w:val="20"/>
-              </w:rPr>
-              <w:t xml:space="preserve">Ansage: </w:t>
-            </w:r>
-            <w:r>
-              <w:rPr>
-                <w:rFonts w:ascii="Calibri" w:cs="Calibri" w:eastAsia="Calibri" w:hAnsi="Calibri"/>
-                <w:i/>
-                <w:iCs/>
-                <w:color w:val="000000"/>
-                <w:sz w:val="21"/>
-                <w:szCs w:val="21"/>
-              </w:rPr>
-              <w:t xml:space="preserve">„Jetzt schreibt ihr von der Folie ab: Merksatz 2. Rahmt ihn rot ein.“</w:t>
-            </w:r>
-          </w:p>
-          <w:p>
-            <w:pPr>
-              <w:spacing w:after="50" w:before="0"/>
-            </w:pPr>
-            <w:r>
-              <w:rPr>
-                <w:rFonts w:ascii="Calibri" w:cs="Calibri" w:eastAsia="Calibri" w:hAnsi="Calibri"/>
-                <w:color w:val="000000"/>
-                <w:sz w:val="21"/>
-                <w:szCs w:val="21"/>
-              </w:rPr>
-              <w:t xml:space="preserve">Kurz fragen: Wer hat welche Säule im Gruppenpuzzle bearbeitet? (Stärkt das Wiedererkennen.)</w:t>
-            </w:r>
-          </w:p>
-          <w:tbl>
-            <w:tblPr>
-              <w:tblW w:type="dxa" w:w="8166"/>
-              <w:tblBorders>
-                <w:top w:val="single" w:color="auto" w:sz="4"/>
-                <w:left w:val="single" w:color="auto" w:sz="4"/>
-                <w:bottom w:val="single" w:color="auto" w:sz="4"/>
-                <w:right w:val="single" w:color="auto" w:sz="4"/>
-                <w:insideH w:val="single" w:color="auto" w:sz="4"/>
-                <w:insideV w:val="single" w:color="auto" w:sz="4"/>
-              </w:tblBorders>
-            </w:tblPr>
-            <w:tblGrid>
-              <w:gridCol w:w="8166"/>
-            </w:tblGrid>
-            <w:tr>
-              <w:trPr>
-                <w:cantSplit/>
-              </w:trPr>
-              <w:tc>
-                <w:tcPr>
-                  <w:tcW w:type="dxa" w:w="8166"/>
-                  <w:tcBorders>
-                    <w:top w:val="single" w:color="1E2761" w:sz="12"/>
-                    <w:left w:val="single" w:color="1E2761" w:sz="12"/>
-                    <w:bottom w:val="single" w:color="1E2761" w:sz="12"/>
-                    <w:right w:val="single" w:color="1E2761" w:sz="12"/>
-                  </w:tcBorders>
-                  <w:shd w:fill="1E2761" w:color="auto" w:val="clear"/>
-                  <w:tcMar>
-                    <w:top w:type="dxa" w:w="30"/>
-                    <w:left w:type="dxa" w:w="100"/>
-                    <w:bottom w:type="dxa" w:w="30"/>
-                    <w:right w:type="dxa" w:w="100"/>
-                  </w:tcMar>
-                  <w:vAlign w:val="center"/>
-                </w:tcPr>
-                <w:p>
-                  <w:pPr>
-                    <w:spacing w:after="0" w:before="0"/>
-                  </w:pPr>
-                  <w:r>
-                    <w:rPr>
-                      <w:rFonts w:ascii="Calibri" w:cs="Calibri" w:eastAsia="Calibri" w:hAnsi="Calibri"/>
-                      <w:b/>
-                      <w:bCs/>
-                      <w:color w:val="FFFFFF"/>
-                      <w:sz w:val="16"/>
-                      <w:szCs w:val="16"/>
-                    </w:rPr>
-                    <w:t xml:space="preserve">FOLIE · Merksatz 2 – abschreiben, rot umrahmen</w:t>
-                  </w:r>
-                </w:p>
-              </w:tc>
-            </w:tr>
-            <w:tr>
-              <w:trPr>
-                <w:cantSplit/>
-              </w:trPr>
-              <w:tc>
-                <w:tcPr>
-                  <w:tcW w:type="dxa" w:w="8166"/>
-                  <w:tcBorders>
-                    <w:top w:val="single" w:color="1E2761" w:sz="12"/>
-                    <w:left w:val="single" w:color="1E2761" w:sz="12"/>
-                    <w:bottom w:val="single" w:color="1E2761" w:sz="12"/>
-                    <w:right w:val="single" w:color="1E2761" w:sz="12"/>
-                  </w:tcBorders>
-                  <w:shd w:fill="F4F7FD" w:color="auto" w:val="clear"/>
-                  <w:tcMar>
-                    <w:top w:type="dxa" w:w="100"/>
-                    <w:left w:type="dxa" w:w="160"/>
-                    <w:bottom w:type="dxa" w:w="100"/>
-                    <w:right w:type="dxa" w:w="100"/>
-                  </w:tcMar>
-                  <w:vAlign w:val="center"/>
-                </w:tcPr>
-                <w:p>
-                  <w:pPr>
-                    <w:spacing w:after="40" w:before="0"/>
-                  </w:pPr>
-                  <w:r>
-                    <w:rPr>
-                      <w:rFonts w:ascii="Cambria" w:cs="Cambria" w:eastAsia="Cambria" w:hAnsi="Cambria"/>
-                      <w:b/>
-                      <w:bCs/>
-                      <w:color w:val="D9534F"/>
-                      <w:sz w:val="22"/>
-                      <w:szCs w:val="22"/>
-                    </w:rPr>
-                    <w:t xml:space="preserve">Die fünf Säulen des Absolutismus</w:t>
-                  </w:r>
-                </w:p>
-                <w:p>
-                  <w:pPr>
-                    <w:spacing w:after="50" w:before="0"/>
-                  </w:pPr>
-                  <w:r>
-                    <w:rPr>
-                      <w:rFonts w:ascii="Cambria" w:cs="Cambria" w:eastAsia="Cambria" w:hAnsi="Cambria"/>
-                      <w:color w:val="000000"/>
-                      <w:sz w:val="22"/>
-                      <w:szCs w:val="22"/>
-                    </w:rPr>
-                    <w:t xml:space="preserve">Ludwig XIV. sicherte seine Macht auf fünf Säulen: 1 Verwaltung und Justiz · 2 Adel und Hof von Versailles · 3 Wirtschaft (Merkantilismus) · 4 Religion (Gottesgnadentum) · 5 Heer (stehendes Heer).</w:t>
-                  </w:r>
-                </w:p>
-                <w:p>
-                  <w:pPr>
-                    <w:spacing w:after="50" w:before="0"/>
-                  </w:pPr>
-                  <w:r>
-                    <w:rPr>
-                      <w:rFonts w:ascii="Cambria" w:cs="Cambria" w:eastAsia="Cambria" w:hAnsi="Cambria"/>
-                      <w:color w:val="5B6B8C"/>
-                      <w:sz w:val="20"/>
-                      <w:szCs w:val="20"/>
-                    </w:rPr>
-                    <w:t xml:space="preserve">Wofür? Im Test nennen und erklären.</w:t>
-                  </w:r>
-                </w:p>
-                <w:p>
-                  <w:pPr>
-                    <w:spacing w:after="0" w:before="0"/>
-                  </w:pPr>
-                  <w:r>
-                    <w:rPr>
-                      <w:rFonts w:ascii="Cambria" w:cs="Cambria" w:eastAsia="Cambria" w:hAnsi="Cambria"/>
-                      <w:color w:val="5B6B8C"/>
-                      <w:sz w:val="20"/>
-                      <w:szCs w:val="20"/>
-                    </w:rPr>
-                    <w:t xml:space="preserve">Test: Was sichert der König damit?</w:t>
-                  </w:r>
-                </w:p>
-              </w:tc>
-            </w:tr>
-          </w:tbl>
-          <w:p>
-            <w:pPr>
-              <w:spacing w:after="20" w:before="0"/>
-            </w:pPr>
-            <w:r>
-              <w:rPr>
-                <w:rFonts w:ascii="Calibri" w:cs="Calibri" w:eastAsia="Calibri" w:hAnsi="Calibri"/>
-                <w:color w:val="000000"/>
-                <w:sz w:val="22"/>
-                <w:szCs w:val="22"/>
-              </w:rPr>
-              <w:t xml:space="preserve"/>
-            </w:r>
-          </w:p>
-        </w:tc>
-      </w:tr>
-    </w:tbl>
-    <w:p>
-      <w:pPr>
-        <w:spacing w:after="40" w:before="0"/>
-      </w:pPr>
-      <w:r>
-        <w:rPr>
-          <w:rFonts w:ascii="Calibri" w:cs="Calibri" w:eastAsia="Calibri" w:hAnsi="Calibri"/>
-          <w:color w:val="000000"/>
-          <w:sz w:val="22"/>
-          <w:szCs w:val="22"/>
-        </w:rPr>
-        <w:t xml:space="preserve"/>
-      </w:r>
-    </w:p>
-    <w:tbl>
-      <w:tblPr>
-        <w:tblW w:type="dxa" w:w="10206"/>
-        <w:tblBorders>
-          <w:top w:val="single" w:color="auto" w:sz="4"/>
-          <w:left w:val="single" w:color="auto" w:sz="4"/>
-          <w:bottom w:val="single" w:color="auto" w:sz="4"/>
-          <w:right w:val="single" w:color="auto" w:sz="4"/>
-          <w:insideH w:val="single" w:color="auto" w:sz="4"/>
-          <w:insideV w:val="single" w:color="auto" w:sz="4"/>
-        </w:tblBorders>
-      </w:tblPr>
-      <w:tblGrid>
-        <w:gridCol w:w="1700"/>
-        <w:gridCol w:w="8506"/>
-      </w:tblGrid>
-      <w:tr>
-        <w:trPr>
-          <w:cantSplit/>
-        </w:trPr>
-        <w:tc>
-          <w:tcPr>
-            <w:tcW w:type="dxa" w:w="1700"/>
-            <w:tcBorders>
-              <w:top w:val="single" w:color="D5DDEE" w:sz="6"/>
-              <w:left w:val="single" w:color="D5DDEE" w:sz="6"/>
-              <w:bottom w:val="single" w:color="D5DDEE" w:sz="6"/>
-              <w:right w:val="single" w:color="D5DDEE" w:sz="6"/>
-            </w:tcBorders>
-            <w:shd w:fill="F4F7FD" w:color="auto" w:val="clear"/>
-            <w:tcMar>
-              <w:top w:type="dxa" w:w="100"/>
-              <w:left w:type="dxa" w:w="100"/>
-              <w:bottom w:type="dxa" w:w="100"/>
-              <w:right w:type="dxa" w:w="100"/>
-            </w:tcMar>
-            <w:vAlign w:val="top"/>
-          </w:tcPr>
-          <w:p>
-            <w:pPr>
-              <w:spacing w:after="10" w:before="0"/>
-            </w:pPr>
-            <w:r>
-              <w:rPr>
-                <w:rFonts w:ascii="Calibri" w:cs="Calibri" w:eastAsia="Calibri" w:hAnsi="Calibri"/>
-                <w:color w:val="5B6B8C"/>
-                <w:sz w:val="16"/>
-                <w:szCs w:val="16"/>
-              </w:rPr>
-              <w:t xml:space="preserve">Klasse</w:t>
-            </w:r>
-          </w:p>
-          <w:p>
-            <w:pPr>
-              <w:spacing w:after="0" w:before="0"/>
-            </w:pPr>
-            <w:r>
-              <w:rPr>
-                <w:rFonts w:ascii="Calibri" w:cs="Calibri" w:eastAsia="Calibri" w:hAnsi="Calibri"/>
-                <w:b/>
-                <w:bCs/>
-                <w:color w:val="1E2761"/>
-                <w:sz w:val="20"/>
-                <w:szCs w:val="20"/>
-              </w:rPr>
-              <w:t xml:space="preserve">arbeitet allein</w:t>
-            </w:r>
-          </w:p>
-        </w:tc>
-        <w:tc>
-          <w:tcPr>
-            <w:tcW w:type="dxa" w:w="8506"/>
-            <w:tcBorders>
-              <w:top w:val="single" w:color="D5DDEE" w:sz="6"/>
-              <w:left w:val="single" w:color="D5DDEE" w:sz="6"/>
-              <w:bottom w:val="single" w:color="D5DDEE" w:sz="6"/>
-              <w:right w:val="single" w:color="D5DDEE" w:sz="6"/>
-            </w:tcBorders>
-            <w:tcMar>
-              <w:top w:type="dxa" w:w="100"/>
-              <w:left w:type="dxa" w:w="160"/>
-              <w:bottom w:type="dxa" w:w="100"/>
-              <w:right w:type="dxa" w:w="100"/>
-            </w:tcMar>
-            <w:vAlign w:val="top"/>
-          </w:tcPr>
-          <w:p>
-            <w:pPr>
-              <w:spacing w:after="60" w:before="0"/>
-            </w:pPr>
-            <w:r>
-              <w:rPr>
-                <w:rFonts w:ascii="Calibri" w:cs="Calibri" w:eastAsia="Calibri" w:hAnsi="Calibri"/>
-                <w:b/>
-                <w:bCs/>
-                <w:color w:val="D9534F"/>
-                <w:sz w:val="20"/>
-                <w:szCs w:val="20"/>
-              </w:rPr>
-              <w:t xml:space="preserve">Ansage: </w:t>
-            </w:r>
-            <w:r>
-              <w:rPr>
-                <w:rFonts w:ascii="Calibri" w:cs="Calibri" w:eastAsia="Calibri" w:hAnsi="Calibri"/>
-                <w:i/>
-                <w:iCs/>
-                <w:color w:val="000000"/>
-                <w:sz w:val="21"/>
-                <w:szCs w:val="21"/>
-              </w:rPr>
-              <w:t xml:space="preserve">„Ich teile das Arbeitsblatt aus. Jetzt arbeitet ihr allein. Die Aufgabe steht rechts.“</w:t>
-            </w:r>
-          </w:p>
-          <w:p>
-            <w:pPr>
-              <w:spacing w:after="50" w:before="0"/>
-            </w:pPr>
-            <w:r>
-              <w:rPr>
-                <w:rFonts w:ascii="Calibri" w:cs="Calibri" w:eastAsia="Calibri" w:hAnsi="Calibri"/>
-                <w:color w:val="000000"/>
-                <w:sz w:val="21"/>
-                <w:szCs w:val="21"/>
-              </w:rPr>
-              <w:t xml:space="preserve">Schnelle: ★-Aufgabe auf dem Arbeitsblatt (wichtigste Säule in einem Satz begründen).</w:t>
-            </w:r>
-          </w:p>
-          <w:tbl>
-            <w:tblPr>
-              <w:tblW w:type="dxa" w:w="8166"/>
-              <w:tblBorders>
-                <w:top w:val="single" w:color="auto" w:sz="4"/>
-                <w:left w:val="single" w:color="auto" w:sz="4"/>
-                <w:bottom w:val="single" w:color="auto" w:sz="4"/>
-                <w:right w:val="single" w:color="auto" w:sz="4"/>
-                <w:insideH w:val="single" w:color="auto" w:sz="4"/>
-                <w:insideV w:val="single" w:color="auto" w:sz="4"/>
-              </w:tblBorders>
-            </w:tblPr>
-            <w:tblGrid>
-              <w:gridCol w:w="8166"/>
-            </w:tblGrid>
-            <w:tr>
-              <w:trPr>
-                <w:cantSplit/>
-              </w:trPr>
-              <w:tc>
-                <w:tcPr>
-                  <w:tcW w:type="dxa" w:w="8166"/>
-                  <w:tcBorders>
-                    <w:top w:val="single" w:color="3D4A3F" w:sz="12"/>
-                    <w:left w:val="single" w:color="3D4A3F" w:sz="12"/>
-                    <w:bottom w:val="single" w:color="3D4A3F" w:sz="12"/>
-                    <w:right w:val="single" w:color="3D4A3F" w:sz="12"/>
-                  </w:tcBorders>
-                  <w:shd w:fill="3D4A3F" w:color="auto" w:val="clear"/>
-                  <w:tcMar>
-                    <w:top w:type="dxa" w:w="30"/>
-                    <w:left w:type="dxa" w:w="100"/>
-                    <w:bottom w:type="dxa" w:w="30"/>
-                    <w:right w:type="dxa" w:w="100"/>
-                  </w:tcMar>
-                  <w:vAlign w:val="center"/>
-                </w:tcPr>
-                <w:p>
-                  <w:pPr>
-                    <w:spacing w:after="0" w:before="0"/>
-                  </w:pPr>
-                  <w:r>
-                    <w:rPr>
-                      <w:rFonts w:ascii="Calibri" w:cs="Calibri" w:eastAsia="Calibri" w:hAnsi="Calibri"/>
-                      <w:b/>
-                      <w:bCs/>
-                      <w:color w:val="FFFFFF"/>
-                      <w:sz w:val="16"/>
-                      <w:szCs w:val="16"/>
-                    </w:rPr>
-                    <w:t xml:space="preserve">TAFEL · rechts · Ü2 Lückentext: Die fünf Säulen</w:t>
-                  </w:r>
-                </w:p>
-              </w:tc>
-            </w:tr>
-            <w:tr>
-              <w:trPr>
-                <w:cantSplit/>
-              </w:trPr>
-              <w:tc>
-                <w:tcPr>
-                  <w:tcW w:type="dxa" w:w="8166"/>
-                  <w:tcBorders>
-                    <w:top w:val="single" w:color="3D4A3F" w:sz="12"/>
-                    <w:left w:val="single" w:color="3D4A3F" w:sz="12"/>
-                    <w:bottom w:val="single" w:color="3D4A3F" w:sz="12"/>
-                    <w:right w:val="single" w:color="3D4A3F" w:sz="12"/>
-                  </w:tcBorders>
-                  <w:shd w:fill="F3F6F1" w:color="auto" w:val="clear"/>
-                  <w:tcMar>
-                    <w:top w:type="dxa" w:w="100"/>
-                    <w:left w:type="dxa" w:w="160"/>
-                    <w:bottom w:type="dxa" w:w="100"/>
-                    <w:right w:type="dxa" w:w="100"/>
-                  </w:tcMar>
-                  <w:vAlign w:val="center"/>
-                </w:tcPr>
-                <w:p>
-                  <w:pPr>
-                    <w:spacing w:after="30" w:before="0"/>
-                  </w:pPr>
-                  <w:r>
-                    <w:rPr>
-                      <w:rFonts w:ascii="Calibri" w:cs="Calibri" w:eastAsia="Calibri" w:hAnsi="Calibri"/>
-                      <w:b/>
-                      <w:bCs/>
-                      <w:color w:val="1E2761"/>
-                      <w:sz w:val="21"/>
-                      <w:szCs w:val="21"/>
-                    </w:rPr>
-                    <w:t xml:space="preserve">1. </w:t>
-                  </w:r>
-                  <w:r>
-                    <w:rPr>
-                      <w:rFonts w:ascii="Calibri" w:cs="Calibri" w:eastAsia="Calibri" w:hAnsi="Calibri"/>
-                      <w:b/>
-                      <w:bCs/>
-                      <w:color w:val="1E2761"/>
-                      <w:sz w:val="21"/>
-                      <w:szCs w:val="21"/>
-                    </w:rPr>
-                    <w:t xml:space="preserve">Schreibe Ü2 oben auf das Arbeitsblatt.</w:t>
-                  </w:r>
-                </w:p>
-                <w:p>
-                  <w:pPr>
-                    <w:spacing w:after="30" w:before="0"/>
-                  </w:pPr>
-                  <w:r>
-                    <w:rPr>
-                      <w:rFonts w:ascii="Calibri" w:cs="Calibri" w:eastAsia="Calibri" w:hAnsi="Calibri"/>
-                      <w:b/>
-                      <w:bCs/>
-                      <w:color w:val="1E2761"/>
-                      <w:sz w:val="21"/>
-                      <w:szCs w:val="21"/>
-                    </w:rPr>
-                    <w:t xml:space="preserve">2. </w:t>
-                  </w:r>
-                  <w:r>
-                    <w:rPr>
-                      <w:rFonts w:ascii="Calibri" w:cs="Calibri" w:eastAsia="Calibri" w:hAnsi="Calibri"/>
-                      <w:b/>
-                      <w:bCs/>
-                      <w:color w:val="1E2761"/>
-                      <w:sz w:val="21"/>
-                      <w:szCs w:val="21"/>
-                    </w:rPr>
-                    <w:t xml:space="preserve">Lies den Text einmal ganz. Ergänze die 12 Lücken mit dem Wortspeicher.</w:t>
-                  </w:r>
-                </w:p>
-                <w:p>
-                  <w:pPr>
-                    <w:spacing w:after="30" w:before="0"/>
-                  </w:pPr>
-                  <w:r>
-                    <w:rPr>
-                      <w:rFonts w:ascii="Calibri" w:cs="Calibri" w:eastAsia="Calibri" w:hAnsi="Calibri"/>
-                      <w:b/>
-                      <w:bCs/>
-                      <w:color w:val="1E2761"/>
-                      <w:sz w:val="21"/>
-                      <w:szCs w:val="21"/>
-                    </w:rPr>
-                    <w:t xml:space="preserve">3. </w:t>
-                  </w:r>
-                  <w:r>
-                    <w:rPr>
-                      <w:rFonts w:ascii="Calibri" w:cs="Calibri" w:eastAsia="Calibri" w:hAnsi="Calibri"/>
-                      <w:b/>
-                      <w:bCs/>
-                      <w:color w:val="1E2761"/>
-                      <w:sz w:val="21"/>
-                      <w:szCs w:val="21"/>
-                    </w:rPr>
-                    <w:t xml:space="preserve">Streiche jedes benutzte Wort durch. Zwei Wörter passen nicht.</w:t>
-                  </w:r>
-                </w:p>
-                <w:p>
-                  <w:pPr>
-                    <w:spacing w:after="30" w:before="0"/>
-                  </w:pPr>
-                  <w:r>
-                    <w:rPr>
-                      <w:rFonts w:ascii="Calibri" w:cs="Calibri" w:eastAsia="Calibri" w:hAnsi="Calibri"/>
-                      <w:color w:val="000000"/>
-                      <w:sz w:val="22"/>
-                      <w:szCs w:val="22"/>
-                    </w:rPr>
-                    <w:t xml:space="preserve"/>
-                  </w:r>
-                </w:p>
-                <w:p>
-                  <w:pPr>
-                    <w:spacing w:after="0" w:before="0"/>
-                  </w:pPr>
-                  <w:r>
-                    <w:rPr>
-                      <w:rFonts w:ascii="Calibri" w:cs="Calibri" w:eastAsia="Calibri" w:hAnsi="Calibri"/>
-                      <w:b/>
-                      <w:bCs/>
-                      <w:color w:val="3D4A3F"/>
-                      <w:sz w:val="19"/>
-                      <w:szCs w:val="19"/>
-                    </w:rPr>
-                    <w:t xml:space="preserve">Zeit: </w:t>
-                  </w:r>
-                  <w:r>
-                    <w:rPr>
-                      <w:rFonts w:ascii="Calibri" w:cs="Calibri" w:eastAsia="Calibri" w:hAnsi="Calibri"/>
-                      <w:color w:val="3D4A3F"/>
-                      <w:sz w:val="19"/>
-                      <w:szCs w:val="19"/>
-                    </w:rPr>
-                    <w:t xml:space="preserve">6 Minuten · allein · leise</w:t>
-                  </w:r>
-                  <w:r>
-                    <w:rPr>
-                      <w:rFonts w:ascii="Calibri" w:cs="Calibri" w:eastAsia="Calibri" w:hAnsi="Calibri"/>
-                      <w:i/>
-                      <w:iCs/>
-                      <w:color w:val="3D4A3F"/>
-                      <w:sz w:val="19"/>
-                      <w:szCs w:val="19"/>
-                    </w:rPr>
-                    <w:t xml:space="preserve">     Fertig? Stift hinlegen und noch einmal durchlesen.</w:t>
-                  </w:r>
-                </w:p>
-              </w:tc>
-            </w:tr>
-          </w:tbl>
-          <w:p>
-            <w:pPr>
-              <w:spacing w:after="20" w:before="0"/>
-            </w:pPr>
-            <w:r>
-              <w:rPr>
-                <w:rFonts w:ascii="Calibri" w:cs="Calibri" w:eastAsia="Calibri" w:hAnsi="Calibri"/>
-                <w:color w:val="000000"/>
-                <w:sz w:val="22"/>
-                <w:szCs w:val="22"/>
-              </w:rPr>
-              <w:t xml:space="preserve"/>
-            </w:r>
-          </w:p>
-        </w:tc>
-      </w:tr>
-    </w:tbl>
-    <w:p>
-      <w:pPr>
-        <w:spacing w:after="40" w:before="0"/>
-      </w:pPr>
-      <w:r>
-        <w:rPr>
-          <w:rFonts w:ascii="Calibri" w:cs="Calibri" w:eastAsia="Calibri" w:hAnsi="Calibri"/>
-          <w:color w:val="000000"/>
-          <w:sz w:val="22"/>
-          <w:szCs w:val="22"/>
-        </w:rPr>
-        <w:t xml:space="preserve"/>
-      </w:r>
-    </w:p>
-    <w:tbl>
-      <w:tblPr>
-        <w:tblW w:type="dxa" w:w="10206"/>
-        <w:tblBorders>
-          <w:top w:val="single" w:color="auto" w:sz="4"/>
-          <w:left w:val="single" w:color="auto" w:sz="4"/>
-          <w:bottom w:val="single" w:color="auto" w:sz="4"/>
-          <w:right w:val="single" w:color="auto" w:sz="4"/>
-          <w:insideH w:val="single" w:color="auto" w:sz="4"/>
-          <w:insideV w:val="single" w:color="auto" w:sz="4"/>
-        </w:tblBorders>
-      </w:tblPr>
-      <w:tblGrid>
-        <w:gridCol w:w="1700"/>
-        <w:gridCol w:w="8506"/>
-      </w:tblGrid>
-      <w:tr>
-        <w:trPr>
-          <w:cantSplit/>
-        </w:trPr>
-        <w:tc>
-          <w:tcPr>
-            <w:tcW w:type="dxa" w:w="1700"/>
-            <w:tcBorders>
-              <w:top w:val="single" w:color="D5DDEE" w:sz="6"/>
-              <w:left w:val="single" w:color="D5DDEE" w:sz="6"/>
-              <w:bottom w:val="single" w:color="D5DDEE" w:sz="6"/>
-              <w:right w:val="single" w:color="D5DDEE" w:sz="6"/>
-            </w:tcBorders>
-            <w:shd w:fill="F4F7FD" w:color="auto" w:val="clear"/>
-            <w:tcMar>
-              <w:top w:type="dxa" w:w="100"/>
-              <w:left w:type="dxa" w:w="100"/>
-              <w:bottom w:type="dxa" w:w="100"/>
-              <w:right w:type="dxa" w:w="100"/>
-            </w:tcMar>
-            <w:vAlign w:val="top"/>
-          </w:tcPr>
-          <w:p>
-            <w:pPr>
-              <w:spacing w:after="10" w:before="0"/>
-            </w:pPr>
-            <w:r>
-              <w:rPr>
-                <w:rFonts w:ascii="Calibri" w:cs="Calibri" w:eastAsia="Calibri" w:hAnsi="Calibri"/>
-                <w:color w:val="5B6B8C"/>
-                <w:sz w:val="16"/>
-                <w:szCs w:val="16"/>
-              </w:rPr>
-              <w:t xml:space="preserve">Klasse</w:t>
-            </w:r>
-          </w:p>
-          <w:p>
-            <w:pPr>
-              <w:spacing w:after="0" w:before="0"/>
-            </w:pPr>
-            <w:r>
-              <w:rPr>
-                <w:rFonts w:ascii="Calibri" w:cs="Calibri" w:eastAsia="Calibri" w:hAnsi="Calibri"/>
-                <w:b/>
-                <w:bCs/>
-                <w:color w:val="1E2761"/>
-                <w:sz w:val="20"/>
-                <w:szCs w:val="20"/>
-              </w:rPr>
-              <w:t xml:space="preserve">kommt an die Tafel</w:t>
-            </w:r>
-          </w:p>
-        </w:tc>
-        <w:tc>
-          <w:tcPr>
-            <w:tcW w:type="dxa" w:w="8506"/>
-            <w:tcBorders>
-              <w:top w:val="single" w:color="D5DDEE" w:sz="6"/>
-              <w:left w:val="single" w:color="D5DDEE" w:sz="6"/>
-              <w:bottom w:val="single" w:color="D5DDEE" w:sz="6"/>
-              <w:right w:val="single" w:color="D5DDEE" w:sz="6"/>
-            </w:tcBorders>
-            <w:tcMar>
-              <w:top w:type="dxa" w:w="100"/>
-              <w:left w:type="dxa" w:w="160"/>
-              <w:bottom w:type="dxa" w:w="100"/>
-              <w:right w:type="dxa" w:w="100"/>
-            </w:tcMar>
-            <w:vAlign w:val="top"/>
-          </w:tcPr>
-          <w:p>
-            <w:pPr>
-              <w:spacing w:after="60" w:before="0"/>
-            </w:pPr>
-            <w:r>
-              <w:rPr>
-                <w:rFonts w:ascii="Calibri" w:cs="Calibri" w:eastAsia="Calibri" w:hAnsi="Calibri"/>
-                <w:b/>
-                <w:bCs/>
-                <w:color w:val="D9534F"/>
-                <w:sz w:val="20"/>
-                <w:szCs w:val="20"/>
-              </w:rPr>
-              <w:t xml:space="preserve">Ansage: </w:t>
-            </w:r>
-            <w:r>
-              <w:rPr>
-                <w:rFonts w:ascii="Calibri" w:cs="Calibri" w:eastAsia="Calibri" w:hAnsi="Calibri"/>
-                <w:i/>
-                <w:iCs/>
-                <w:color w:val="000000"/>
-                <w:sz w:val="21"/>
-                <w:szCs w:val="21"/>
-              </w:rPr>
-              <w:t xml:space="preserve">„Wer drankommt, liest einen Absatz vor. Alle prüfen mit. … Vergleicht und verbessert mit Grün.“</w:t>
-            </w:r>
-          </w:p>
-          <w:p>
-            <w:pPr>
-              <w:spacing w:after="50" w:before="0"/>
-            </w:pPr>
-            <w:r>
-              <w:rPr>
-                <w:rFonts w:ascii="Calibri" w:cs="Calibri" w:eastAsia="Calibri" w:hAnsi="Calibri"/>
-                <w:color w:val="000000"/>
-                <w:sz w:val="21"/>
-                <w:szCs w:val="21"/>
-              </w:rPr>
-              <w:t xml:space="preserve">Pro Säule eine Schülerin oder einen Schüler den Absatz vorlesen lassen. Bei Fehlern nach der Begründung fragen: „Welche Stelle im Text spricht dagegen?“</w:t>
-            </w:r>
-          </w:p>
-          <w:p>
-            <w:pPr>
-              <w:spacing w:after="0" w:before="0"/>
-            </w:pPr>
-            <w:r>
-              <w:rPr>
-                <w:rFonts w:ascii="Calibri" w:cs="Calibri" w:eastAsia="Calibri" w:hAnsi="Calibri"/>
-                <w:b/>
-                <w:bCs/>
-                <w:color w:val="5B6B8C"/>
-                <w:sz w:val="19"/>
-                <w:szCs w:val="19"/>
-              </w:rPr>
-              <w:t xml:space="preserve">Lösung: </w:t>
-            </w:r>
-            <w:r>
-              <w:rPr>
-                <w:rFonts w:ascii="Calibri" w:cs="Calibri" w:eastAsia="Calibri" w:hAnsi="Calibri"/>
-                <w:color w:val="5B6B8C"/>
-                <w:sz w:val="19"/>
-                <w:szCs w:val="19"/>
-              </w:rPr>
-              <w:t xml:space="preserve">1 absoluter · 2 Beamte · 3 Intendanten · 4 Steuerfreiheit · 5 Versailles · 6 Merkantilismus · 7 Zölle · 8 Gottesgnadentum · 9 Glaube · 10 stehendes · 11 400.000 · 12 Drittel. Nicht passend: Söldner (Ludwig verzichtete auf sie), Parlament (im Absolutismus kann niemand den König stoppen).</w:t>
-            </w:r>
-          </w:p>
-        </w:tc>
-      </w:tr>
-    </w:tbl>
-    <w:p>
-      <w:pPr>
-        <w:spacing w:after="40" w:before="0"/>
-      </w:pPr>
-      <w:r>
-        <w:rPr>
-          <w:rFonts w:ascii="Calibri" w:cs="Calibri" w:eastAsia="Calibri" w:hAnsi="Calibri"/>
-          <w:color w:val="000000"/>
-          <w:sz w:val="22"/>
-          <w:szCs w:val="22"/>
-        </w:rPr>
-        <w:t xml:space="preserve"/>
-      </w:r>
-    </w:p>
-    <w:tbl>
-      <w:tblPr>
-        <w:tblW w:type="dxa" w:w="10206"/>
-        <w:tblBorders>
-          <w:top w:val="single" w:color="auto" w:sz="4"/>
-          <w:left w:val="single" w:color="auto" w:sz="4"/>
-          <w:bottom w:val="single" w:color="auto" w:sz="4"/>
-          <w:right w:val="single" w:color="auto" w:sz="4"/>
-          <w:insideH w:val="single" w:color="auto" w:sz="4"/>
-          <w:insideV w:val="single" w:color="auto" w:sz="4"/>
-        </w:tblBorders>
-      </w:tblPr>
-      <w:tblGrid>
-        <w:gridCol w:w="1700"/>
-        <w:gridCol w:w="8506"/>
-      </w:tblGrid>
-      <w:tr>
-        <w:trPr>
-          <w:cantSplit/>
-        </w:trPr>
-        <w:tc>
-          <w:tcPr>
-            <w:tcW w:type="dxa" w:w="1700"/>
-            <w:tcBorders>
-              <w:top w:val="single" w:color="D5DDEE" w:sz="6"/>
-              <w:left w:val="single" w:color="D5DDEE" w:sz="6"/>
-              <w:bottom w:val="single" w:color="D5DDEE" w:sz="6"/>
-              <w:right w:val="single" w:color="D5DDEE" w:sz="6"/>
-            </w:tcBorders>
-            <w:shd w:fill="F4F7FD" w:color="auto" w:val="clear"/>
-            <w:tcMar>
-              <w:top w:type="dxa" w:w="100"/>
-              <w:left w:type="dxa" w:w="100"/>
-              <w:bottom w:type="dxa" w:w="100"/>
-              <w:right w:type="dxa" w:w="100"/>
-            </w:tcMar>
-            <w:vAlign w:val="top"/>
-          </w:tcPr>
-          <w:p>
-            <w:pPr>
-              <w:spacing w:after="10" w:before="0"/>
-            </w:pPr>
-            <w:r>
-              <w:rPr>
-                <w:rFonts w:ascii="Calibri" w:cs="Calibri" w:eastAsia="Calibri" w:hAnsi="Calibri"/>
-                <w:color w:val="5B6B8C"/>
-                <w:sz w:val="16"/>
-                <w:szCs w:val="16"/>
-              </w:rPr>
-              <w:t xml:space="preserve">Klasse</w:t>
-            </w:r>
-          </w:p>
-          <w:p>
-            <w:pPr>
-              <w:spacing w:after="0" w:before="0"/>
-            </w:pPr>
-            <w:r>
-              <w:rPr>
-                <w:rFonts w:ascii="Calibri" w:cs="Calibri" w:eastAsia="Calibri" w:hAnsi="Calibri"/>
-                <w:b/>
-                <w:bCs/>
-                <w:color w:val="1E2761"/>
-                <w:sz w:val="20"/>
-                <w:szCs w:val="20"/>
-              </w:rPr>
-              <w:t xml:space="preserve">macht mündlich mit</w:t>
-            </w:r>
-          </w:p>
-        </w:tc>
-        <w:tc>
-          <w:tcPr>
-            <w:tcW w:type="dxa" w:w="8506"/>
-            <w:tcBorders>
-              <w:top w:val="single" w:color="D5DDEE" w:sz="6"/>
-              <w:left w:val="single" w:color="D5DDEE" w:sz="6"/>
-              <w:bottom w:val="single" w:color="D5DDEE" w:sz="6"/>
-              <w:right w:val="single" w:color="D5DDEE" w:sz="6"/>
-            </w:tcBorders>
-            <w:tcMar>
-              <w:top w:type="dxa" w:w="100"/>
-              <w:left w:type="dxa" w:w="160"/>
-              <w:bottom w:type="dxa" w:w="100"/>
-              <w:right w:type="dxa" w:w="100"/>
-            </w:tcMar>
-            <w:vAlign w:val="top"/>
-          </w:tcPr>
-          <w:p>
-            <w:pPr>
-              <w:spacing w:after="60" w:before="0"/>
-            </w:pPr>
-            <w:r>
-              <w:rPr>
-                <w:rFonts w:ascii="Calibri" w:cs="Calibri" w:eastAsia="Calibri" w:hAnsi="Calibri"/>
-                <w:b/>
-                <w:bCs/>
-                <w:color w:val="D9534F"/>
-                <w:sz w:val="20"/>
-                <w:szCs w:val="20"/>
-              </w:rPr>
-              <w:t xml:space="preserve">Ansage: </w:t>
-            </w:r>
-            <w:r>
-              <w:rPr>
-                <w:rFonts w:ascii="Calibri" w:cs="Calibri" w:eastAsia="Calibri" w:hAnsi="Calibri"/>
-                <w:i/>
-                <w:iCs/>
-                <w:color w:val="000000"/>
-                <w:sz w:val="21"/>
-                <w:szCs w:val="21"/>
-              </w:rPr>
-              <w:t xml:space="preserve">„Meldet euch. Ihr schreibt noch nichts auf. Was sichert der König mit jeder Säule?“</w:t>
-            </w:r>
-          </w:p>
-          <w:p>
-            <w:pPr>
-              <w:spacing w:after="50" w:before="0"/>
-            </w:pPr>
-            <w:r>
-              <w:rPr>
-                <w:rFonts w:ascii="Calibri" w:cs="Calibri" w:eastAsia="Calibri" w:hAnsi="Calibri"/>
-                <w:color w:val="000000"/>
-                <w:sz w:val="21"/>
-                <w:szCs w:val="21"/>
-              </w:rPr>
-              <w:t xml:space="preserve">Das Tafelbild entsteht gemeinsam, nicht abzeichnen (steht schon im Merksatz und im Lückentext):</w:t>
-            </w:r>
-          </w:p>
-          <w:tbl>
-            <w:tblPr>
-              <w:tblW w:type="dxa" w:w="8166"/>
-              <w:tblBorders>
-                <w:top w:val="single" w:color="auto" w:sz="4"/>
-                <w:left w:val="single" w:color="auto" w:sz="4"/>
-                <w:bottom w:val="single" w:color="auto" w:sz="4"/>
-                <w:right w:val="single" w:color="auto" w:sz="4"/>
-                <w:insideH w:val="single" w:color="auto" w:sz="4"/>
-                <w:insideV w:val="single" w:color="auto" w:sz="4"/>
-              </w:tblBorders>
-            </w:tblPr>
-            <w:tblGrid>
-              <w:gridCol w:w="8166"/>
-            </w:tblGrid>
-            <w:tr>
-              <w:trPr>
-                <w:cantSplit/>
-              </w:trPr>
-              <w:tc>
-                <w:tcPr>
-                  <w:tcW w:type="dxa" w:w="8166"/>
-                  <w:tcBorders>
-                    <w:top w:val="single" w:color="3D4A3F" w:sz="12"/>
-                    <w:left w:val="single" w:color="3D4A3F" w:sz="12"/>
-                    <w:bottom w:val="single" w:color="3D4A3F" w:sz="12"/>
-                    <w:right w:val="single" w:color="3D4A3F" w:sz="12"/>
-                  </w:tcBorders>
-                  <w:shd w:fill="3D4A3F" w:color="auto" w:val="clear"/>
-                  <w:tcMar>
-                    <w:top w:type="dxa" w:w="30"/>
-                    <w:left w:type="dxa" w:w="100"/>
-                    <w:bottom w:type="dxa" w:w="30"/>
-                    <w:right w:type="dxa" w:w="100"/>
-                  </w:tcMar>
-                  <w:vAlign w:val="center"/>
-                </w:tcPr>
-                <w:p>
-                  <w:pPr>
-                    <w:spacing w:after="0" w:before="0"/>
-                  </w:pPr>
-                  <w:r>
-                    <w:rPr>
-                      <w:rFonts w:ascii="Calibri" w:cs="Calibri" w:eastAsia="Calibri" w:hAnsi="Calibri"/>
-                      <w:b/>
-                      <w:bCs/>
-                      <w:color w:val="FFFFFF"/>
-                      <w:sz w:val="16"/>
-                      <w:szCs w:val="16"/>
-                    </w:rPr>
-                    <w:t xml:space="preserve">TAFEL · Mitte · Säulen-Tafelbild</w:t>
-                  </w:r>
-                </w:p>
-              </w:tc>
-            </w:tr>
-            <w:tr>
-              <w:trPr>
-                <w:cantSplit/>
-              </w:trPr>
-              <w:tc>
-                <w:tcPr>
-                  <w:tcW w:type="dxa" w:w="8166"/>
-                  <w:tcBorders>
-                    <w:top w:val="single" w:color="3D4A3F" w:sz="12"/>
-                    <w:left w:val="single" w:color="3D4A3F" w:sz="12"/>
-                    <w:bottom w:val="single" w:color="3D4A3F" w:sz="12"/>
-                    <w:right w:val="single" w:color="3D4A3F" w:sz="12"/>
-                  </w:tcBorders>
-                  <w:shd w:fill="F3F6F1" w:color="auto" w:val="clear"/>
-                  <w:tcMar>
-                    <w:top w:type="dxa" w:w="100"/>
-                    <w:left w:type="dxa" w:w="160"/>
-                    <w:bottom w:type="dxa" w:w="100"/>
-                    <w:right w:type="dxa" w:w="100"/>
-                  </w:tcMar>
-                  <w:vAlign w:val="center"/>
-                </w:tcPr>
-                <w:p>
-                  <w:pPr>
-                    <w:spacing w:after="30" w:before="0"/>
-                  </w:pPr>
-                  <w:r>
-                    <w:rPr>
-                      <w:rFonts w:ascii="Cambria" w:cs="Cambria" w:eastAsia="Cambria" w:hAnsi="Cambria"/>
-                      <w:b/>
-                      <w:bCs/>
-                      <w:color w:val="1E2761"/>
-                      <w:sz w:val="22"/>
-                      <w:szCs w:val="22"/>
-                    </w:rPr>
-                    <w:t xml:space="preserve">Dach:  Absolute Herrschaft Ludwigs XIV.</w:t>
-                  </w:r>
-                </w:p>
-                <w:p>
-                  <w:pPr>
-                    <w:spacing w:after="30" w:before="0"/>
-                  </w:pPr>
-                  <w:r>
-                    <w:rPr>
-                      <w:rFonts w:ascii="Cambria" w:cs="Cambria" w:eastAsia="Cambria" w:hAnsi="Cambria"/>
-                      <w:color w:val="000000"/>
-                      <w:sz w:val="22"/>
-                      <w:szCs w:val="22"/>
-                    </w:rPr>
-                    <w:t xml:space="preserve">Säule 1 Verwaltung/Justiz  →  Kontrolle über das Land</w:t>
-                  </w:r>
-                </w:p>
-                <w:p>
-                  <w:pPr>
-                    <w:spacing w:after="30" w:before="0"/>
-                  </w:pPr>
-                  <w:r>
-                    <w:rPr>
-                      <w:rFonts w:ascii="Cambria" w:cs="Cambria" w:eastAsia="Cambria" w:hAnsi="Cambria"/>
-                      <w:color w:val="000000"/>
-                      <w:sz w:val="22"/>
-                      <w:szCs w:val="22"/>
-                    </w:rPr>
-                    <w:t xml:space="preserve">Säule 2 Adel/Hof  →  kein adeliger Widerstand</w:t>
-                  </w:r>
-                </w:p>
-                <w:p>
-                  <w:pPr>
-                    <w:spacing w:after="30" w:before="0"/>
-                  </w:pPr>
-                  <w:r>
-                    <w:rPr>
-                      <w:rFonts w:ascii="Cambria" w:cs="Cambria" w:eastAsia="Cambria" w:hAnsi="Cambria"/>
-                      <w:color w:val="000000"/>
-                      <w:sz w:val="22"/>
-                      <w:szCs w:val="22"/>
-                    </w:rPr>
-                    <w:t xml:space="preserve">Säule 3 Wirtschaft  →  Geld für Hof, Beamte und Heer</w:t>
-                  </w:r>
-                </w:p>
-                <w:p>
-                  <w:pPr>
-                    <w:spacing w:after="30" w:before="0"/>
-                  </w:pPr>
-                  <w:r>
-                    <w:rPr>
-                      <w:rFonts w:ascii="Cambria" w:cs="Cambria" w:eastAsia="Cambria" w:hAnsi="Cambria"/>
-                      <w:color w:val="000000"/>
-                      <w:sz w:val="22"/>
-                      <w:szCs w:val="22"/>
-                    </w:rPr>
-                    <w:t xml:space="preserve">Säule 4 Religion  →  Herrschaft von Gott gewollt, ein Glaube</w:t>
-                  </w:r>
-                </w:p>
-                <w:p>
-                  <w:pPr>
-                    <w:spacing w:after="0" w:before="0"/>
-                  </w:pPr>
-                  <w:r>
-                    <w:rPr>
-                      <w:rFonts w:ascii="Cambria" w:cs="Cambria" w:eastAsia="Cambria" w:hAnsi="Cambria"/>
-                      <w:color w:val="000000"/>
-                      <w:sz w:val="22"/>
-                      <w:szCs w:val="22"/>
-                    </w:rPr>
-                    <w:t xml:space="preserve">Säule 5 Heer  →  Macht nach innen und außen durchsetzen</w:t>
-                  </w:r>
-                </w:p>
-              </w:tc>
-            </w:tr>
-          </w:tbl>
-          <w:p>
-            <w:pPr>
-              <w:spacing w:after="20" w:before="0"/>
-            </w:pPr>
-            <w:r>
-              <w:rPr>
-                <w:rFonts w:ascii="Calibri" w:cs="Calibri" w:eastAsia="Calibri" w:hAnsi="Calibri"/>
-                <w:color w:val="000000"/>
-                <w:sz w:val="22"/>
-                <w:szCs w:val="22"/>
-              </w:rPr>
-              <w:t xml:space="preserve"/>
-            </w:r>
-          </w:p>
-          <w:p>
-            <w:pPr>
-              <w:spacing w:after="0" w:before="0"/>
-            </w:pPr>
-            <w:r>
-              <w:rPr>
-                <w:rFonts w:ascii="Calibri" w:cs="Calibri" w:eastAsia="Calibri" w:hAnsi="Calibri"/>
-                <w:b/>
-                <w:bCs/>
-                <w:color w:val="5B6B8C"/>
-                <w:sz w:val="19"/>
-                <w:szCs w:val="19"/>
-              </w:rPr>
-              <w:t xml:space="preserve">Lösung: </w:t>
-            </w:r>
-            <w:r>
-              <w:rPr>
-                <w:rFonts w:ascii="Calibri" w:cs="Calibri" w:eastAsia="Calibri" w:hAnsi="Calibri"/>
-                <w:color w:val="5B6B8C"/>
-                <w:sz w:val="19"/>
-                <w:szCs w:val="19"/>
-              </w:rPr>
-              <w:t xml:space="preserve">Schüler formulieren die Antworten selbst, die Lehrkraft notiert Stichworte. Abschlussfrage aus dem Gruppenpuzzle: Wie sicherte Ludwig XIV. seine Macht? (Er konzentriert möglichst viel Macht bei sich und stützt sie auf Verwaltung, Hof, Wirtschaft, Religion und Heer.)</w:t>
             </w:r>
           </w:p>
         </w:tc>
@@ -7460,7 +7460,7 @@
                 <w:sz w:val="20"/>
                 <w:szCs w:val="20"/>
               </w:rPr>
-              <w:t xml:space="preserve">Absolutismus: Definition, Beispiel Ludwig XIV., Wofür, Test – rot umrahmt</w:t>
+              <w:t xml:space="preserve">Die fünf Säulen – rot umrahmt (Lückentext liegt als Arbeitsblatt dabei, eingeklebt)</w:t>
             </w:r>
           </w:p>
         </w:tc>
@@ -7497,11 +7497,11 @@
                 <w:rFonts w:ascii="Calibri" w:cs="Calibri" w:eastAsia="Calibri" w:hAnsi="Calibri"/>
                 <w:b/>
                 <w:bCs/>
-                <w:color w:val="1E2761"/>
+                <w:color w:val="D9534F"/>
                 <w:sz w:val="20"/>
                 <w:szCs w:val="20"/>
               </w:rPr>
-              <w:t xml:space="preserve">Ü1</w:t>
+              <w:t xml:space="preserve">Merksatz 2</w:t>
             </w:r>
           </w:p>
         </w:tc>
@@ -7533,7 +7533,7 @@
                 <w:sz w:val="20"/>
                 <w:szCs w:val="20"/>
               </w:rPr>
-              <w:t xml:space="preserve">4 Zeilen: Nummer + Absolutismus/kein Absolutismus + Begründung</w:t>
+              <w:t xml:space="preserve">Absolutismus: Definition, Beispiel Ludwig XIV., Wofür, Test – rot umrahmt</w:t>
             </w:r>
           </w:p>
         </w:tc>
@@ -7570,11 +7570,11 @@
                 <w:rFonts w:ascii="Calibri" w:cs="Calibri" w:eastAsia="Calibri" w:hAnsi="Calibri"/>
                 <w:b/>
                 <w:bCs/>
-                <w:color w:val="D9534F"/>
+                <w:color w:val="1E2761"/>
                 <w:sz w:val="20"/>
                 <w:szCs w:val="20"/>
               </w:rPr>
-              <w:t xml:space="preserve">Merksatz 2</w:t>
+              <w:t xml:space="preserve">Ü2</w:t>
             </w:r>
           </w:p>
         </w:tc>
@@ -7606,7 +7606,7 @@
                 <w:sz w:val="20"/>
                 <w:szCs w:val="20"/>
               </w:rPr>
-              <w:t xml:space="preserve">Die fünf Säulen – rot umrahmt (Lückentext liegt als Arbeitsblatt dabei, eingeklebt)</w:t>
+              <w:t xml:space="preserve">4 Zeilen: Nummer + Absolutismus/kein Absolutismus + Begründung</w:t>
             </w:r>
           </w:p>
         </w:tc>

</xml_diff>

<commit_message>
Geschichte 8: Wahr/falsch einzeln, Säulen-Einstieg, Karikatur bei Ü4, Wofür gestrichen
Co-Authored-By: Claude Sonnet 5.5 <noreply@anthropic.com>
Claude-Session: https://claude.ai/code/session_01CtRuNVyt8v9M882BKEmgNb
</commit_message>
<xml_diff>
--- a/Geschichte_8/Absolutismus_Wiederholung/Tafelskript_Absolutismus_Wiederholung.docx
+++ b/Geschichte_8/Absolutismus_Wiederholung/Tafelskript_Absolutismus_Wiederholung.docx
@@ -442,7 +442,7 @@
                 <w:sz w:val="20"/>
                 <w:szCs w:val="20"/>
               </w:rPr>
-              <w:t xml:space="preserve">11</w:t>
+              <w:t xml:space="preserve">12</w:t>
             </w:r>
           </w:p>
         </w:tc>
@@ -476,7 +476,7 @@
                 <w:sz w:val="20"/>
                 <w:szCs w:val="20"/>
               </w:rPr>
-              <w:t xml:space="preserve">1  Fünf Säulen: Merksatz 1 + Lückentext (Ü1)</w:t>
+              <w:t xml:space="preserve">1  Fünf Säulen: Leitfrage, Erinnern, Merksatz 1, Lückentext (Ü1)</w:t>
             </w:r>
           </w:p>
         </w:tc>
@@ -510,7 +510,7 @@
                 <w:sz w:val="20"/>
                 <w:szCs w:val="20"/>
               </w:rPr>
-              <w:t xml:space="preserve">Folie 3–4, Arbeitsblatt</w:t>
+              <w:t xml:space="preserve">Folie 3–6, Arbeitsblatt</w:t>
             </w:r>
           </w:p>
         </w:tc>
@@ -544,7 +544,7 @@
                 <w:sz w:val="20"/>
                 <w:szCs w:val="20"/>
               </w:rPr>
-              <w:t xml:space="preserve">abschreiben, allein, Kontrolle</w:t>
+              <w:t xml:space="preserve">gemeinsam, abschreiben, allein</w:t>
             </w:r>
           </w:p>
         </w:tc>
@@ -584,7 +584,7 @@
                 <w:sz w:val="20"/>
                 <w:szCs w:val="20"/>
               </w:rPr>
-              <w:t xml:space="preserve">4</w:t>
+              <w:t xml:space="preserve">5</w:t>
             </w:r>
           </w:p>
         </w:tc>
@@ -618,7 +618,7 @@
                 <w:sz w:val="20"/>
                 <w:szCs w:val="20"/>
               </w:rPr>
-              <w:t xml:space="preserve">2  Wahr oder falsch?</w:t>
+              <w:t xml:space="preserve">2  Wahr oder falsch? (vier Aussagen einzeln)</w:t>
             </w:r>
           </w:p>
         </w:tc>
@@ -652,7 +652,7 @@
                 <w:sz w:val="20"/>
                 <w:szCs w:val="20"/>
               </w:rPr>
-              <w:t xml:space="preserve">Folie 5</w:t>
+              <w:t xml:space="preserve">Folie 7–14</w:t>
             </w:r>
           </w:p>
         </w:tc>
@@ -726,7 +726,7 @@
                 <w:sz w:val="20"/>
                 <w:szCs w:val="20"/>
               </w:rPr>
-              <w:t xml:space="preserve">7</w:t>
+              <w:t xml:space="preserve">6</w:t>
             </w:r>
           </w:p>
         </w:tc>
@@ -794,7 +794,7 @@
                 <w:sz w:val="20"/>
                 <w:szCs w:val="20"/>
               </w:rPr>
-              <w:t xml:space="preserve">Folie 6–7</w:t>
+              <w:t xml:space="preserve">Folie 15–16</w:t>
             </w:r>
           </w:p>
         </w:tc>
@@ -936,7 +936,7 @@
                 <w:sz w:val="20"/>
                 <w:szCs w:val="20"/>
               </w:rPr>
-              <w:t xml:space="preserve">Folie 8–9, Tafelbild</w:t>
+              <w:t xml:space="preserve">Folie 17–18, Tafelbild</w:t>
             </w:r>
           </w:p>
         </w:tc>
@@ -1010,7 +1010,7 @@
                 <w:sz w:val="20"/>
                 <w:szCs w:val="20"/>
               </w:rPr>
-              <w:t xml:space="preserve">9</w:t>
+              <w:t xml:space="preserve">8</w:t>
             </w:r>
           </w:p>
         </w:tc>
@@ -1078,7 +1078,7 @@
                 <w:sz w:val="20"/>
                 <w:szCs w:val="20"/>
               </w:rPr>
-              <w:t xml:space="preserve">Folie 10–11</w:t>
+              <w:t xml:space="preserve">Folie 19–20</w:t>
             </w:r>
           </w:p>
         </w:tc>
@@ -1220,7 +1220,7 @@
                 <w:sz w:val="20"/>
                 <w:szCs w:val="20"/>
               </w:rPr>
-              <w:t xml:space="preserve">Folie 12</w:t>
+              <w:t xml:space="preserve">Folie 21</w:t>
             </w:r>
           </w:p>
         </w:tc>
@@ -1273,7 +1273,7 @@
           <w:sz w:val="21"/>
           <w:szCs w:val="21"/>
         </w:rPr>
-        <w:t xml:space="preserve">Zeitpuffer: Wird es knapp, die Kontrolle zu Ü2 auf zwei Sätze kürzen (schon eingeplant) und bei Ü4 nur zwei Schüler vorlesen lassen. Gibt es eine Doppelstunde, Ü3 als Partnerquiz verlängern.</w:t>
+        <w:t xml:space="preserve">Zeitpuffer: Wird es knapp, Ü2 auf die Begründung von zwei Sätzen kürzen und bei Ü4 nur zwei Schüler vorlesen lassen; die Wahr-oder-falsch-Aussagen 3 und 4 lassen sich auch gemeinsam in einer Minute abhaken. Gibt es eine Doppelstunde, Ü3 als Partnerquiz verlängern.</w:t>
       </w:r>
     </w:p>
     <w:p>
@@ -2034,7 +2034,7 @@
           <w:sz w:val="20"/>
           <w:szCs w:val="20"/>
         </w:rPr>
-        <w:t xml:space="preserve">   11 Min.</w:t>
+        <w:t xml:space="preserve">   12 Min.</w:t>
       </w:r>
     </w:p>
     <w:tbl>
@@ -2102,7 +2102,7 @@
                 <w:sz w:val="20"/>
                 <w:szCs w:val="20"/>
               </w:rPr>
-              <w:t xml:space="preserve">schreibt ab</w:t>
+              <w:t xml:space="preserve">macht mündlich mit</w:t>
             </w:r>
           </w:p>
         </w:tc>
@@ -2147,7 +2147,7 @@
                 <w:sz w:val="21"/>
                 <w:szCs w:val="21"/>
               </w:rPr>
-              <w:t xml:space="preserve">„Jetzt schreibt ihr von der Folie ab: Merksatz 1. Rahmt ihn rot ein.“</w:t>
+              <w:t xml:space="preserve">„Stifte liegen. Ihr schreibt noch nichts auf. Meldet euch. Wie kann ein König ein ganzes Land regieren?“</w:t>
             </w:r>
           </w:p>
           <w:p>
@@ -2161,7 +2161,500 @@
                 <w:sz w:val="21"/>
                 <w:szCs w:val="21"/>
               </w:rPr>
-              <w:t xml:space="preserve">Kurz fragen: Wer hat welche Säule im Gruppenpuzzle bearbeitet? (Stärkt das Wiedererkennen.)</w:t>
+              <w:t xml:space="preserve">Folie 3 zeigen. Ideen der Klasse sammeln, noch nicht bewerten (Beamte, Soldaten, Geld, Gesetze, Religion …).</w:t>
+            </w:r>
+          </w:p>
+          <w:p>
+            <w:pPr>
+              <w:spacing w:after="50" w:before="0"/>
+            </w:pPr>
+            <w:r>
+              <w:rPr>
+                <w:rFonts w:ascii="Calibri" w:cs="Calibri" w:eastAsia="Calibri" w:hAnsi="Calibri"/>
+                <w:color w:val="000000"/>
+                <w:sz w:val="21"/>
+                <w:szCs w:val="21"/>
+              </w:rPr>
+              <w:t xml:space="preserve">Überleitung: „Ihr erinnert euch: Es gab fünf Säulen. Welche waren das?“ (Folie 4)</w:t>
+            </w:r>
+          </w:p>
+        </w:tc>
+      </w:tr>
+    </w:tbl>
+    <w:p>
+      <w:pPr>
+        <w:spacing w:after="40" w:before="0"/>
+      </w:pPr>
+      <w:r>
+        <w:rPr>
+          <w:rFonts w:ascii="Calibri" w:cs="Calibri" w:eastAsia="Calibri" w:hAnsi="Calibri"/>
+          <w:color w:val="000000"/>
+          <w:sz w:val="22"/>
+          <w:szCs w:val="22"/>
+        </w:rPr>
+        <w:t xml:space="preserve"/>
+      </w:r>
+    </w:p>
+    <w:tbl>
+      <w:tblPr>
+        <w:tblW w:type="dxa" w:w="10206"/>
+        <w:tblBorders>
+          <w:top w:val="single" w:color="auto" w:sz="4"/>
+          <w:left w:val="single" w:color="auto" w:sz="4"/>
+          <w:bottom w:val="single" w:color="auto" w:sz="4"/>
+          <w:right w:val="single" w:color="auto" w:sz="4"/>
+          <w:insideH w:val="single" w:color="auto" w:sz="4"/>
+          <w:insideV w:val="single" w:color="auto" w:sz="4"/>
+        </w:tblBorders>
+      </w:tblPr>
+      <w:tblGrid>
+        <w:gridCol w:w="1700"/>
+        <w:gridCol w:w="8506"/>
+      </w:tblGrid>
+      <w:tr>
+        <w:trPr>
+          <w:cantSplit/>
+        </w:trPr>
+        <w:tc>
+          <w:tcPr>
+            <w:tcW w:type="dxa" w:w="1700"/>
+            <w:tcBorders>
+              <w:top w:val="single" w:color="D5DDEE" w:sz="6"/>
+              <w:left w:val="single" w:color="D5DDEE" w:sz="6"/>
+              <w:bottom w:val="single" w:color="D5DDEE" w:sz="6"/>
+              <w:right w:val="single" w:color="D5DDEE" w:sz="6"/>
+            </w:tcBorders>
+            <w:shd w:fill="F4F7FD" w:color="auto" w:val="clear"/>
+            <w:tcMar>
+              <w:top w:type="dxa" w:w="100"/>
+              <w:left w:type="dxa" w:w="100"/>
+              <w:bottom w:type="dxa" w:w="100"/>
+              <w:right w:type="dxa" w:w="100"/>
+            </w:tcMar>
+            <w:vAlign w:val="top"/>
+          </w:tcPr>
+          <w:p>
+            <w:pPr>
+              <w:spacing w:after="10" w:before="0"/>
+            </w:pPr>
+            <w:r>
+              <w:rPr>
+                <w:rFonts w:ascii="Calibri" w:cs="Calibri" w:eastAsia="Calibri" w:hAnsi="Calibri"/>
+                <w:color w:val="5B6B8C"/>
+                <w:sz w:val="16"/>
+                <w:szCs w:val="16"/>
+              </w:rPr>
+              <w:t xml:space="preserve">Klasse</w:t>
+            </w:r>
+          </w:p>
+          <w:p>
+            <w:pPr>
+              <w:spacing w:after="0" w:before="0"/>
+            </w:pPr>
+            <w:r>
+              <w:rPr>
+                <w:rFonts w:ascii="Calibri" w:cs="Calibri" w:eastAsia="Calibri" w:hAnsi="Calibri"/>
+                <w:b/>
+                <w:bCs/>
+                <w:color w:val="1E2761"/>
+                <w:sz w:val="20"/>
+                <w:szCs w:val="20"/>
+              </w:rPr>
+              <w:t xml:space="preserve">macht mündlich mit</w:t>
+            </w:r>
+          </w:p>
+        </w:tc>
+        <w:tc>
+          <w:tcPr>
+            <w:tcW w:type="dxa" w:w="8506"/>
+            <w:tcBorders>
+              <w:top w:val="single" w:color="D5DDEE" w:sz="6"/>
+              <w:left w:val="single" w:color="D5DDEE" w:sz="6"/>
+              <w:bottom w:val="single" w:color="D5DDEE" w:sz="6"/>
+              <w:right w:val="single" w:color="D5DDEE" w:sz="6"/>
+            </w:tcBorders>
+            <w:tcMar>
+              <w:top w:type="dxa" w:w="100"/>
+              <w:left w:type="dxa" w:w="160"/>
+              <w:bottom w:type="dxa" w:w="100"/>
+              <w:right w:type="dxa" w:w="100"/>
+            </w:tcMar>
+            <w:vAlign w:val="top"/>
+          </w:tcPr>
+          <w:p>
+            <w:pPr>
+              <w:spacing w:after="60" w:before="0"/>
+            </w:pPr>
+            <w:r>
+              <w:rPr>
+                <w:rFonts w:ascii="Calibri" w:cs="Calibri" w:eastAsia="Calibri" w:hAnsi="Calibri"/>
+                <w:b/>
+                <w:bCs/>
+                <w:color w:val="D9534F"/>
+                <w:sz w:val="20"/>
+                <w:szCs w:val="20"/>
+              </w:rPr>
+              <w:t xml:space="preserve">Ansage: </w:t>
+            </w:r>
+            <w:r>
+              <w:rPr>
+                <w:rFonts w:ascii="Calibri" w:cs="Calibri" w:eastAsia="Calibri" w:hAnsi="Calibri"/>
+                <w:i/>
+                <w:iCs/>
+                <w:color w:val="000000"/>
+                <w:sz w:val="21"/>
+                <w:szCs w:val="21"/>
+              </w:rPr>
+              <w:t xml:space="preserve">„Meldet euch. Ihr schreibt noch nichts auf. Welche fünf Säulen waren das, und wie hilft jede dem König?“</w:t>
+            </w:r>
+          </w:p>
+          <w:p>
+            <w:pPr>
+              <w:spacing w:after="50" w:before="0"/>
+            </w:pPr>
+            <w:r>
+              <w:rPr>
+                <w:rFonts w:ascii="Calibri" w:cs="Calibri" w:eastAsia="Calibri" w:hAnsi="Calibri"/>
+                <w:color w:val="000000"/>
+                <w:sz w:val="21"/>
+                <w:szCs w:val="21"/>
+              </w:rPr>
+              <w:t xml:space="preserve">Tafelbild entsteht gemeinsam, nicht abzeichnen. Was fehlt, wird im Lückentext ergänzt.</w:t>
+            </w:r>
+          </w:p>
+          <w:tbl>
+            <w:tblPr>
+              <w:tblW w:type="dxa" w:w="8166"/>
+              <w:tblBorders>
+                <w:top w:val="single" w:color="auto" w:sz="4"/>
+                <w:left w:val="single" w:color="auto" w:sz="4"/>
+                <w:bottom w:val="single" w:color="auto" w:sz="4"/>
+                <w:right w:val="single" w:color="auto" w:sz="4"/>
+                <w:insideH w:val="single" w:color="auto" w:sz="4"/>
+                <w:insideV w:val="single" w:color="auto" w:sz="4"/>
+              </w:tblBorders>
+            </w:tblPr>
+            <w:tblGrid>
+              <w:gridCol w:w="8166"/>
+            </w:tblGrid>
+            <w:tr>
+              <w:trPr>
+                <w:cantSplit/>
+              </w:trPr>
+              <w:tc>
+                <w:tcPr>
+                  <w:tcW w:type="dxa" w:w="8166"/>
+                  <w:tcBorders>
+                    <w:top w:val="single" w:color="3D4A3F" w:sz="12"/>
+                    <w:left w:val="single" w:color="3D4A3F" w:sz="12"/>
+                    <w:bottom w:val="single" w:color="3D4A3F" w:sz="12"/>
+                    <w:right w:val="single" w:color="3D4A3F" w:sz="12"/>
+                  </w:tcBorders>
+                  <w:shd w:fill="3D4A3F" w:color="auto" w:val="clear"/>
+                  <w:tcMar>
+                    <w:top w:type="dxa" w:w="30"/>
+                    <w:left w:type="dxa" w:w="100"/>
+                    <w:bottom w:type="dxa" w:w="30"/>
+                    <w:right w:type="dxa" w:w="100"/>
+                  </w:tcMar>
+                  <w:vAlign w:val="center"/>
+                </w:tcPr>
+                <w:p>
+                  <w:pPr>
+                    <w:spacing w:after="0" w:before="0"/>
+                  </w:pPr>
+                  <w:r>
+                    <w:rPr>
+                      <w:rFonts w:ascii="Calibri" w:cs="Calibri" w:eastAsia="Calibri" w:hAnsi="Calibri"/>
+                      <w:b/>
+                      <w:bCs/>
+                      <w:color w:val="FFFFFF"/>
+                      <w:sz w:val="16"/>
+                      <w:szCs w:val="16"/>
+                    </w:rPr>
+                    <w:t xml:space="preserve">TAFEL · Mitte · Säulen-Tafelbild</w:t>
+                  </w:r>
+                </w:p>
+              </w:tc>
+            </w:tr>
+            <w:tr>
+              <w:trPr>
+                <w:cantSplit/>
+              </w:trPr>
+              <w:tc>
+                <w:tcPr>
+                  <w:tcW w:type="dxa" w:w="8166"/>
+                  <w:tcBorders>
+                    <w:top w:val="single" w:color="3D4A3F" w:sz="12"/>
+                    <w:left w:val="single" w:color="3D4A3F" w:sz="12"/>
+                    <w:bottom w:val="single" w:color="3D4A3F" w:sz="12"/>
+                    <w:right w:val="single" w:color="3D4A3F" w:sz="12"/>
+                  </w:tcBorders>
+                  <w:shd w:fill="F3F6F1" w:color="auto" w:val="clear"/>
+                  <w:tcMar>
+                    <w:top w:type="dxa" w:w="100"/>
+                    <w:left w:type="dxa" w:w="160"/>
+                    <w:bottom w:type="dxa" w:w="100"/>
+                    <w:right w:type="dxa" w:w="100"/>
+                  </w:tcMar>
+                  <w:vAlign w:val="center"/>
+                </w:tcPr>
+                <w:p>
+                  <w:pPr>
+                    <w:spacing w:after="30" w:before="0"/>
+                  </w:pPr>
+                  <w:r>
+                    <w:rPr>
+                      <w:rFonts w:ascii="Cambria" w:cs="Cambria" w:eastAsia="Cambria" w:hAnsi="Cambria"/>
+                      <w:b/>
+                      <w:bCs/>
+                      <w:color w:val="1E2761"/>
+                      <w:sz w:val="22"/>
+                      <w:szCs w:val="22"/>
+                    </w:rPr>
+                    <w:t xml:space="preserve">Dach:  Absolute Herrschaft Ludwigs XIV.</w:t>
+                  </w:r>
+                </w:p>
+                <w:p>
+                  <w:pPr>
+                    <w:spacing w:after="30" w:before="0"/>
+                  </w:pPr>
+                  <w:r>
+                    <w:rPr>
+                      <w:rFonts w:ascii="Cambria" w:cs="Cambria" w:eastAsia="Cambria" w:hAnsi="Cambria"/>
+                      <w:color w:val="000000"/>
+                      <w:sz w:val="22"/>
+                      <w:szCs w:val="22"/>
+                    </w:rPr>
+                    <w:t xml:space="preserve">Säule 1 Verwaltung/Justiz  →  Kontrolle über das Land</w:t>
+                  </w:r>
+                </w:p>
+                <w:p>
+                  <w:pPr>
+                    <w:spacing w:after="30" w:before="0"/>
+                  </w:pPr>
+                  <w:r>
+                    <w:rPr>
+                      <w:rFonts w:ascii="Cambria" w:cs="Cambria" w:eastAsia="Cambria" w:hAnsi="Cambria"/>
+                      <w:color w:val="000000"/>
+                      <w:sz w:val="22"/>
+                      <w:szCs w:val="22"/>
+                    </w:rPr>
+                    <w:t xml:space="preserve">Säule 2 Adel/Hof  →  kein adeliger Widerstand</w:t>
+                  </w:r>
+                </w:p>
+                <w:p>
+                  <w:pPr>
+                    <w:spacing w:after="30" w:before="0"/>
+                  </w:pPr>
+                  <w:r>
+                    <w:rPr>
+                      <w:rFonts w:ascii="Cambria" w:cs="Cambria" w:eastAsia="Cambria" w:hAnsi="Cambria"/>
+                      <w:color w:val="000000"/>
+                      <w:sz w:val="22"/>
+                      <w:szCs w:val="22"/>
+                    </w:rPr>
+                    <w:t xml:space="preserve">Säule 3 Wirtschaft  →  Geld für Hof, Beamte und Heer</w:t>
+                  </w:r>
+                </w:p>
+                <w:p>
+                  <w:pPr>
+                    <w:spacing w:after="30" w:before="0"/>
+                  </w:pPr>
+                  <w:r>
+                    <w:rPr>
+                      <w:rFonts w:ascii="Cambria" w:cs="Cambria" w:eastAsia="Cambria" w:hAnsi="Cambria"/>
+                      <w:color w:val="000000"/>
+                      <w:sz w:val="22"/>
+                      <w:szCs w:val="22"/>
+                    </w:rPr>
+                    <w:t xml:space="preserve">Säule 4 Religion  →  Herrschaft von Gott gewollt, ein Glaube</w:t>
+                  </w:r>
+                </w:p>
+                <w:p>
+                  <w:pPr>
+                    <w:spacing w:after="0" w:before="0"/>
+                  </w:pPr>
+                  <w:r>
+                    <w:rPr>
+                      <w:rFonts w:ascii="Cambria" w:cs="Cambria" w:eastAsia="Cambria" w:hAnsi="Cambria"/>
+                      <w:color w:val="000000"/>
+                      <w:sz w:val="22"/>
+                      <w:szCs w:val="22"/>
+                    </w:rPr>
+                    <w:t xml:space="preserve">Säule 5 Heer  →  Macht nach innen und außen durchsetzen</w:t>
+                  </w:r>
+                </w:p>
+              </w:tc>
+            </w:tr>
+          </w:tbl>
+          <w:p>
+            <w:pPr>
+              <w:spacing w:after="20" w:before="0"/>
+            </w:pPr>
+            <w:r>
+              <w:rPr>
+                <w:rFonts w:ascii="Calibri" w:cs="Calibri" w:eastAsia="Calibri" w:hAnsi="Calibri"/>
+                <w:color w:val="000000"/>
+                <w:sz w:val="22"/>
+                <w:szCs w:val="22"/>
+              </w:rPr>
+              <w:t xml:space="preserve"/>
+            </w:r>
+          </w:p>
+          <w:p>
+            <w:pPr>
+              <w:spacing w:after="0" w:before="0"/>
+            </w:pPr>
+            <w:r>
+              <w:rPr>
+                <w:rFonts w:ascii="Calibri" w:cs="Calibri" w:eastAsia="Calibri" w:hAnsi="Calibri"/>
+                <w:b/>
+                <w:bCs/>
+                <w:color w:val="5B6B8C"/>
+                <w:sz w:val="19"/>
+                <w:szCs w:val="19"/>
+              </w:rPr>
+              <w:t xml:space="preserve">Lösung: </w:t>
+            </w:r>
+            <w:r>
+              <w:rPr>
+                <w:rFonts w:ascii="Calibri" w:cs="Calibri" w:eastAsia="Calibri" w:hAnsi="Calibri"/>
+                <w:color w:val="5B6B8C"/>
+                <w:sz w:val="19"/>
+                <w:szCs w:val="19"/>
+              </w:rPr>
+              <w:t xml:space="preserve">Schüler formulieren die Antworten selbst, die Lehrkraft notiert Stichworte. Abschlussfrage aus dem Gruppenpuzzle: Wie sicherte Ludwig XIV. seine Macht? (Er konzentriert möglichst viel Macht bei sich und stützt sie auf Verwaltung, Hof, Wirtschaft, Religion und Heer.)</w:t>
+            </w:r>
+          </w:p>
+        </w:tc>
+      </w:tr>
+    </w:tbl>
+    <w:p>
+      <w:pPr>
+        <w:spacing w:after="40" w:before="0"/>
+      </w:pPr>
+      <w:r>
+        <w:rPr>
+          <w:rFonts w:ascii="Calibri" w:cs="Calibri" w:eastAsia="Calibri" w:hAnsi="Calibri"/>
+          <w:color w:val="000000"/>
+          <w:sz w:val="22"/>
+          <w:szCs w:val="22"/>
+        </w:rPr>
+        <w:t xml:space="preserve"/>
+      </w:r>
+    </w:p>
+    <w:tbl>
+      <w:tblPr>
+        <w:tblW w:type="dxa" w:w="10206"/>
+        <w:tblBorders>
+          <w:top w:val="single" w:color="auto" w:sz="4"/>
+          <w:left w:val="single" w:color="auto" w:sz="4"/>
+          <w:bottom w:val="single" w:color="auto" w:sz="4"/>
+          <w:right w:val="single" w:color="auto" w:sz="4"/>
+          <w:insideH w:val="single" w:color="auto" w:sz="4"/>
+          <w:insideV w:val="single" w:color="auto" w:sz="4"/>
+        </w:tblBorders>
+      </w:tblPr>
+      <w:tblGrid>
+        <w:gridCol w:w="1700"/>
+        <w:gridCol w:w="8506"/>
+      </w:tblGrid>
+      <w:tr>
+        <w:trPr>
+          <w:cantSplit/>
+        </w:trPr>
+        <w:tc>
+          <w:tcPr>
+            <w:tcW w:type="dxa" w:w="1700"/>
+            <w:tcBorders>
+              <w:top w:val="single" w:color="D5DDEE" w:sz="6"/>
+              <w:left w:val="single" w:color="D5DDEE" w:sz="6"/>
+              <w:bottom w:val="single" w:color="D5DDEE" w:sz="6"/>
+              <w:right w:val="single" w:color="D5DDEE" w:sz="6"/>
+            </w:tcBorders>
+            <w:shd w:fill="F4F7FD" w:color="auto" w:val="clear"/>
+            <w:tcMar>
+              <w:top w:type="dxa" w:w="100"/>
+              <w:left w:type="dxa" w:w="100"/>
+              <w:bottom w:type="dxa" w:w="100"/>
+              <w:right w:type="dxa" w:w="100"/>
+            </w:tcMar>
+            <w:vAlign w:val="top"/>
+          </w:tcPr>
+          <w:p>
+            <w:pPr>
+              <w:spacing w:after="10" w:before="0"/>
+            </w:pPr>
+            <w:r>
+              <w:rPr>
+                <w:rFonts w:ascii="Calibri" w:cs="Calibri" w:eastAsia="Calibri" w:hAnsi="Calibri"/>
+                <w:color w:val="5B6B8C"/>
+                <w:sz w:val="16"/>
+                <w:szCs w:val="16"/>
+              </w:rPr>
+              <w:t xml:space="preserve">Klasse</w:t>
+            </w:r>
+          </w:p>
+          <w:p>
+            <w:pPr>
+              <w:spacing w:after="0" w:before="0"/>
+            </w:pPr>
+            <w:r>
+              <w:rPr>
+                <w:rFonts w:ascii="Calibri" w:cs="Calibri" w:eastAsia="Calibri" w:hAnsi="Calibri"/>
+                <w:b/>
+                <w:bCs/>
+                <w:color w:val="1E2761"/>
+                <w:sz w:val="20"/>
+                <w:szCs w:val="20"/>
+              </w:rPr>
+              <w:t xml:space="preserve">schreibt ab</w:t>
+            </w:r>
+          </w:p>
+        </w:tc>
+        <w:tc>
+          <w:tcPr>
+            <w:tcW w:type="dxa" w:w="8506"/>
+            <w:tcBorders>
+              <w:top w:val="single" w:color="D5DDEE" w:sz="6"/>
+              <w:left w:val="single" w:color="D5DDEE" w:sz="6"/>
+              <w:bottom w:val="single" w:color="D5DDEE" w:sz="6"/>
+              <w:right w:val="single" w:color="D5DDEE" w:sz="6"/>
+            </w:tcBorders>
+            <w:tcMar>
+              <w:top w:type="dxa" w:w="100"/>
+              <w:left w:type="dxa" w:w="160"/>
+              <w:bottom w:type="dxa" w:w="100"/>
+              <w:right w:type="dxa" w:w="100"/>
+            </w:tcMar>
+            <w:vAlign w:val="top"/>
+          </w:tcPr>
+          <w:p>
+            <w:pPr>
+              <w:spacing w:after="60" w:before="0"/>
+            </w:pPr>
+            <w:r>
+              <w:rPr>
+                <w:rFonts w:ascii="Calibri" w:cs="Calibri" w:eastAsia="Calibri" w:hAnsi="Calibri"/>
+                <w:b/>
+                <w:bCs/>
+                <w:color w:val="D9534F"/>
+                <w:sz w:val="20"/>
+                <w:szCs w:val="20"/>
+              </w:rPr>
+              <w:t xml:space="preserve">Ansage: </w:t>
+            </w:r>
+            <w:r>
+              <w:rPr>
+                <w:rFonts w:ascii="Calibri" w:cs="Calibri" w:eastAsia="Calibri" w:hAnsi="Calibri"/>
+                <w:i/>
+                <w:iCs/>
+                <w:color w:val="000000"/>
+                <w:sz w:val="21"/>
+                <w:szCs w:val="21"/>
+              </w:rPr>
+              <w:t xml:space="preserve">„Jetzt schreibt ihr von der Folie ab: Merksatz 1. Rahmt ihn rot ein.“</w:t>
             </w:r>
           </w:p>
           <w:tbl>
@@ -2269,20 +2762,6 @@
                       <w:szCs w:val="22"/>
                     </w:rPr>
                     <w:t xml:space="preserve">Ludwig XIV. sicherte seine Macht auf fünf Säulen: 1 Verwaltung und Justiz · 2 Adel und Hof von Versailles · 3 Wirtschaft (Merkantilismus) · 4 Religion (Gottesgnadentum) · 5 Heer (stehendes Heer).</w:t>
-                  </w:r>
-                </w:p>
-                <w:p>
-                  <w:pPr>
-                    <w:spacing w:after="50" w:before="0"/>
-                  </w:pPr>
-                  <w:r>
-                    <w:rPr>
-                      <w:rFonts w:ascii="Cambria" w:cs="Cambria" w:eastAsia="Cambria" w:hAnsi="Cambria"/>
-                      <w:color w:val="5B6B8C"/>
-                      <w:sz w:val="20"/>
-                      <w:szCs w:val="20"/>
-                    </w:rPr>
-                    <w:t xml:space="preserve">Wofür? Im Test nennen und erklären.</w:t>
                   </w:r>
                 </w:p>
                 <w:p>
@@ -2654,7 +3133,7 @@
                       <w:sz w:val="19"/>
                       <w:szCs w:val="19"/>
                     </w:rPr>
-                    <w:t xml:space="preserve">6 Minuten · allein · leise</w:t>
+                    <w:t xml:space="preserve">5 Minuten · allein · leise</w:t>
                   </w:r>
                   <w:r>
                     <w:rPr>
@@ -2871,6 +3350,61 @@
         <w:t xml:space="preserve"/>
       </w:r>
     </w:p>
+    <w:p>
+      <w:pPr>
+        <w:keepNext/>
+        <w:spacing w:after="100" w:before="200"/>
+      </w:pPr>
+      <w:r>
+        <w:rPr>
+          <w:rFonts w:ascii="Cambria" w:cs="Cambria" w:eastAsia="Cambria" w:hAnsi="Cambria"/>
+          <w:b/>
+          <w:bCs/>
+          <w:color w:val="D9534F"/>
+          <w:sz w:val="28"/>
+          <w:szCs w:val="28"/>
+        </w:rPr>
+        <w:t xml:space="preserve">2  </w:t>
+      </w:r>
+      <w:r>
+        <w:rPr>
+          <w:rFonts w:ascii="Cambria" w:cs="Cambria" w:eastAsia="Cambria" w:hAnsi="Cambria"/>
+          <w:b/>
+          <w:bCs/>
+          <w:color w:val="1E2761"/>
+          <w:sz w:val="28"/>
+          <w:szCs w:val="28"/>
+        </w:rPr>
+        <w:t xml:space="preserve">Wahr oder falsch?</w:t>
+      </w:r>
+      <w:r>
+        <w:rPr>
+          <w:rFonts w:ascii="Calibri" w:cs="Calibri" w:eastAsia="Calibri" w:hAnsi="Calibri"/>
+          <w:b/>
+          <w:bCs/>
+          <w:color w:val="C77C12"/>
+          <w:sz w:val="20"/>
+          <w:szCs w:val="20"/>
+        </w:rPr>
+        <w:t xml:space="preserve">   5 Min.</w:t>
+      </w:r>
+    </w:p>
+    <w:p>
+      <w:pPr>
+        <w:spacing w:after="60" w:before="0"/>
+      </w:pPr>
+      <w:r>
+        <w:rPr>
+          <w:rFonts w:ascii="Calibri" w:cs="Calibri" w:eastAsia="Calibri" w:hAnsi="Calibri"/>
+          <w:i/>
+          <w:iCs/>
+          <w:color w:val="5B6B8C"/>
+          <w:sz w:val="21"/>
+          <w:szCs w:val="21"/>
+        </w:rPr>
+        <w:t xml:space="preserve">Vier Aussagen, jede einzeln: Aussage zeigen → Unterrichtsgespräch (Entscheidung und Begründung) → erst dann die Antwortfolie zeigen. Je Aussage etwa eine Minute.</w:t>
+      </w:r>
+    </w:p>
     <w:tbl>
       <w:tblPr>
         <w:tblW w:type="dxa" w:w="10206"/>
@@ -2981,7 +3515,7 @@
                 <w:sz w:val="21"/>
                 <w:szCs w:val="21"/>
               </w:rPr>
-              <w:t xml:space="preserve">„Meldet euch. Ihr schreibt noch nichts auf. Was sichert der König mit jeder Säule?“</w:t>
+              <w:t xml:space="preserve">„Stifte liegen. Ihr schreibt noch nichts auf. Entscheidet still: wahr oder falsch? Dann meldet ihr euch und begründet. Bei „falsch“ verbessert ihr die Aussage.“</w:t>
             </w:r>
           </w:p>
           <w:p>
@@ -2995,7 +3529,7 @@
                 <w:sz w:val="21"/>
                 <w:szCs w:val="21"/>
               </w:rPr>
-              <w:t xml:space="preserve">Das Tafelbild entsteht gemeinsam, nicht abzeichnen (steht schon im Merksatz und im Lückentext):</w:t>
+              <w:t xml:space="preserve">Folie 7, 9, 11, 13: Aussage. Folie 8, 10, 12, 14: Antwort mit Begründung.</w:t>
             </w:r>
           </w:p>
           <w:tbl>
@@ -3048,409 +3582,7 @@
                       <w:sz w:val="16"/>
                       <w:szCs w:val="16"/>
                     </w:rPr>
-                    <w:t xml:space="preserve">TAFEL · Mitte · Säulen-Tafelbild</w:t>
-                  </w:r>
-                </w:p>
-              </w:tc>
-            </w:tr>
-            <w:tr>
-              <w:trPr>
-                <w:cantSplit/>
-              </w:trPr>
-              <w:tc>
-                <w:tcPr>
-                  <w:tcW w:type="dxa" w:w="8166"/>
-                  <w:tcBorders>
-                    <w:top w:val="single" w:color="3D4A3F" w:sz="12"/>
-                    <w:left w:val="single" w:color="3D4A3F" w:sz="12"/>
-                    <w:bottom w:val="single" w:color="3D4A3F" w:sz="12"/>
-                    <w:right w:val="single" w:color="3D4A3F" w:sz="12"/>
-                  </w:tcBorders>
-                  <w:shd w:fill="F3F6F1" w:color="auto" w:val="clear"/>
-                  <w:tcMar>
-                    <w:top w:type="dxa" w:w="100"/>
-                    <w:left w:type="dxa" w:w="160"/>
-                    <w:bottom w:type="dxa" w:w="100"/>
-                    <w:right w:type="dxa" w:w="100"/>
-                  </w:tcMar>
-                  <w:vAlign w:val="center"/>
-                </w:tcPr>
-                <w:p>
-                  <w:pPr>
-                    <w:spacing w:after="30" w:before="0"/>
-                  </w:pPr>
-                  <w:r>
-                    <w:rPr>
-                      <w:rFonts w:ascii="Cambria" w:cs="Cambria" w:eastAsia="Cambria" w:hAnsi="Cambria"/>
-                      <w:b/>
-                      <w:bCs/>
-                      <w:color w:val="1E2761"/>
-                      <w:sz w:val="22"/>
-                      <w:szCs w:val="22"/>
-                    </w:rPr>
-                    <w:t xml:space="preserve">Dach:  Absolute Herrschaft Ludwigs XIV.</w:t>
-                  </w:r>
-                </w:p>
-                <w:p>
-                  <w:pPr>
-                    <w:spacing w:after="30" w:before="0"/>
-                  </w:pPr>
-                  <w:r>
-                    <w:rPr>
-                      <w:rFonts w:ascii="Cambria" w:cs="Cambria" w:eastAsia="Cambria" w:hAnsi="Cambria"/>
-                      <w:color w:val="000000"/>
-                      <w:sz w:val="22"/>
-                      <w:szCs w:val="22"/>
-                    </w:rPr>
-                    <w:t xml:space="preserve">Säule 1 Verwaltung/Justiz  →  Kontrolle über das Land</w:t>
-                  </w:r>
-                </w:p>
-                <w:p>
-                  <w:pPr>
-                    <w:spacing w:after="30" w:before="0"/>
-                  </w:pPr>
-                  <w:r>
-                    <w:rPr>
-                      <w:rFonts w:ascii="Cambria" w:cs="Cambria" w:eastAsia="Cambria" w:hAnsi="Cambria"/>
-                      <w:color w:val="000000"/>
-                      <w:sz w:val="22"/>
-                      <w:szCs w:val="22"/>
-                    </w:rPr>
-                    <w:t xml:space="preserve">Säule 2 Adel/Hof  →  kein adeliger Widerstand</w:t>
-                  </w:r>
-                </w:p>
-                <w:p>
-                  <w:pPr>
-                    <w:spacing w:after="30" w:before="0"/>
-                  </w:pPr>
-                  <w:r>
-                    <w:rPr>
-                      <w:rFonts w:ascii="Cambria" w:cs="Cambria" w:eastAsia="Cambria" w:hAnsi="Cambria"/>
-                      <w:color w:val="000000"/>
-                      <w:sz w:val="22"/>
-                      <w:szCs w:val="22"/>
-                    </w:rPr>
-                    <w:t xml:space="preserve">Säule 3 Wirtschaft  →  Geld für Hof, Beamte und Heer</w:t>
-                  </w:r>
-                </w:p>
-                <w:p>
-                  <w:pPr>
-                    <w:spacing w:after="30" w:before="0"/>
-                  </w:pPr>
-                  <w:r>
-                    <w:rPr>
-                      <w:rFonts w:ascii="Cambria" w:cs="Cambria" w:eastAsia="Cambria" w:hAnsi="Cambria"/>
-                      <w:color w:val="000000"/>
-                      <w:sz w:val="22"/>
-                      <w:szCs w:val="22"/>
-                    </w:rPr>
-                    <w:t xml:space="preserve">Säule 4 Religion  →  Herrschaft von Gott gewollt, ein Glaube</w:t>
-                  </w:r>
-                </w:p>
-                <w:p>
-                  <w:pPr>
-                    <w:spacing w:after="0" w:before="0"/>
-                  </w:pPr>
-                  <w:r>
-                    <w:rPr>
-                      <w:rFonts w:ascii="Cambria" w:cs="Cambria" w:eastAsia="Cambria" w:hAnsi="Cambria"/>
-                      <w:color w:val="000000"/>
-                      <w:sz w:val="22"/>
-                      <w:szCs w:val="22"/>
-                    </w:rPr>
-                    <w:t xml:space="preserve">Säule 5 Heer  →  Macht nach innen und außen durchsetzen</w:t>
-                  </w:r>
-                </w:p>
-              </w:tc>
-            </w:tr>
-          </w:tbl>
-          <w:p>
-            <w:pPr>
-              <w:spacing w:after="20" w:before="0"/>
-            </w:pPr>
-            <w:r>
-              <w:rPr>
-                <w:rFonts w:ascii="Calibri" w:cs="Calibri" w:eastAsia="Calibri" w:hAnsi="Calibri"/>
-                <w:color w:val="000000"/>
-                <w:sz w:val="22"/>
-                <w:szCs w:val="22"/>
-              </w:rPr>
-              <w:t xml:space="preserve"/>
-            </w:r>
-          </w:p>
-          <w:p>
-            <w:pPr>
-              <w:spacing w:after="0" w:before="0"/>
-            </w:pPr>
-            <w:r>
-              <w:rPr>
-                <w:rFonts w:ascii="Calibri" w:cs="Calibri" w:eastAsia="Calibri" w:hAnsi="Calibri"/>
-                <w:b/>
-                <w:bCs/>
-                <w:color w:val="5B6B8C"/>
-                <w:sz w:val="19"/>
-                <w:szCs w:val="19"/>
-              </w:rPr>
-              <w:t xml:space="preserve">Lösung: </w:t>
-            </w:r>
-            <w:r>
-              <w:rPr>
-                <w:rFonts w:ascii="Calibri" w:cs="Calibri" w:eastAsia="Calibri" w:hAnsi="Calibri"/>
-                <w:color w:val="5B6B8C"/>
-                <w:sz w:val="19"/>
-                <w:szCs w:val="19"/>
-              </w:rPr>
-              <w:t xml:space="preserve">Schüler formulieren die Antworten selbst, die Lehrkraft notiert Stichworte. Abschlussfrage aus dem Gruppenpuzzle: Wie sicherte Ludwig XIV. seine Macht? (Er konzentriert möglichst viel Macht bei sich und stützt sie auf Verwaltung, Hof, Wirtschaft, Religion und Heer.)</w:t>
-            </w:r>
-          </w:p>
-        </w:tc>
-      </w:tr>
-    </w:tbl>
-    <w:p>
-      <w:pPr>
-        <w:spacing w:after="40" w:before="0"/>
-      </w:pPr>
-      <w:r>
-        <w:rPr>
-          <w:rFonts w:ascii="Calibri" w:cs="Calibri" w:eastAsia="Calibri" w:hAnsi="Calibri"/>
-          <w:color w:val="000000"/>
-          <w:sz w:val="22"/>
-          <w:szCs w:val="22"/>
-        </w:rPr>
-        <w:t xml:space="preserve"/>
-      </w:r>
-    </w:p>
-    <w:p>
-      <w:pPr>
-        <w:keepNext/>
-        <w:spacing w:after="100" w:before="200"/>
-      </w:pPr>
-      <w:r>
-        <w:rPr>
-          <w:rFonts w:ascii="Cambria" w:cs="Cambria" w:eastAsia="Cambria" w:hAnsi="Cambria"/>
-          <w:b/>
-          <w:bCs/>
-          <w:color w:val="D9534F"/>
-          <w:sz w:val="28"/>
-          <w:szCs w:val="28"/>
-        </w:rPr>
-        <w:t xml:space="preserve">2  </w:t>
-      </w:r>
-      <w:r>
-        <w:rPr>
-          <w:rFonts w:ascii="Cambria" w:cs="Cambria" w:eastAsia="Cambria" w:hAnsi="Cambria"/>
-          <w:b/>
-          <w:bCs/>
-          <w:color w:val="1E2761"/>
-          <w:sz w:val="28"/>
-          <w:szCs w:val="28"/>
-        </w:rPr>
-        <w:t xml:space="preserve">Einstieg: Wahr oder falsch?</w:t>
-      </w:r>
-      <w:r>
-        <w:rPr>
-          <w:rFonts w:ascii="Calibri" w:cs="Calibri" w:eastAsia="Calibri" w:hAnsi="Calibri"/>
-          <w:b/>
-          <w:bCs/>
-          <w:color w:val="C77C12"/>
-          <w:sz w:val="20"/>
-          <w:szCs w:val="20"/>
-        </w:rPr>
-        <w:t xml:space="preserve">   4 Min.</w:t>
-      </w:r>
-    </w:p>
-    <w:tbl>
-      <w:tblPr>
-        <w:tblW w:type="dxa" w:w="10206"/>
-        <w:tblBorders>
-          <w:top w:val="single" w:color="auto" w:sz="4"/>
-          <w:left w:val="single" w:color="auto" w:sz="4"/>
-          <w:bottom w:val="single" w:color="auto" w:sz="4"/>
-          <w:right w:val="single" w:color="auto" w:sz="4"/>
-          <w:insideH w:val="single" w:color="auto" w:sz="4"/>
-          <w:insideV w:val="single" w:color="auto" w:sz="4"/>
-        </w:tblBorders>
-      </w:tblPr>
-      <w:tblGrid>
-        <w:gridCol w:w="1700"/>
-        <w:gridCol w:w="8506"/>
-      </w:tblGrid>
-      <w:tr>
-        <w:trPr>
-          <w:cantSplit/>
-        </w:trPr>
-        <w:tc>
-          <w:tcPr>
-            <w:tcW w:type="dxa" w:w="1700"/>
-            <w:tcBorders>
-              <w:top w:val="single" w:color="D5DDEE" w:sz="6"/>
-              <w:left w:val="single" w:color="D5DDEE" w:sz="6"/>
-              <w:bottom w:val="single" w:color="D5DDEE" w:sz="6"/>
-              <w:right w:val="single" w:color="D5DDEE" w:sz="6"/>
-            </w:tcBorders>
-            <w:shd w:fill="F4F7FD" w:color="auto" w:val="clear"/>
-            <w:tcMar>
-              <w:top w:type="dxa" w:w="100"/>
-              <w:left w:type="dxa" w:w="100"/>
-              <w:bottom w:type="dxa" w:w="100"/>
-              <w:right w:type="dxa" w:w="100"/>
-            </w:tcMar>
-            <w:vAlign w:val="top"/>
-          </w:tcPr>
-          <w:p>
-            <w:pPr>
-              <w:spacing w:after="10" w:before="0"/>
-            </w:pPr>
-            <w:r>
-              <w:rPr>
-                <w:rFonts w:ascii="Calibri" w:cs="Calibri" w:eastAsia="Calibri" w:hAnsi="Calibri"/>
-                <w:color w:val="5B6B8C"/>
-                <w:sz w:val="16"/>
-                <w:szCs w:val="16"/>
-              </w:rPr>
-              <w:t xml:space="preserve">Klasse</w:t>
-            </w:r>
-          </w:p>
-          <w:p>
-            <w:pPr>
-              <w:spacing w:after="0" w:before="0"/>
-            </w:pPr>
-            <w:r>
-              <w:rPr>
-                <w:rFonts w:ascii="Calibri" w:cs="Calibri" w:eastAsia="Calibri" w:hAnsi="Calibri"/>
-                <w:b/>
-                <w:bCs/>
-                <w:color w:val="1E2761"/>
-                <w:sz w:val="20"/>
-                <w:szCs w:val="20"/>
-              </w:rPr>
-              <w:t xml:space="preserve">macht mündlich mit</w:t>
-            </w:r>
-          </w:p>
-        </w:tc>
-        <w:tc>
-          <w:tcPr>
-            <w:tcW w:type="dxa" w:w="8506"/>
-            <w:tcBorders>
-              <w:top w:val="single" w:color="D5DDEE" w:sz="6"/>
-              <w:left w:val="single" w:color="D5DDEE" w:sz="6"/>
-              <w:bottom w:val="single" w:color="D5DDEE" w:sz="6"/>
-              <w:right w:val="single" w:color="D5DDEE" w:sz="6"/>
-            </w:tcBorders>
-            <w:tcMar>
-              <w:top w:type="dxa" w:w="100"/>
-              <w:left w:type="dxa" w:w="160"/>
-              <w:bottom w:type="dxa" w:w="100"/>
-              <w:right w:type="dxa" w:w="100"/>
-            </w:tcMar>
-            <w:vAlign w:val="top"/>
-          </w:tcPr>
-          <w:p>
-            <w:pPr>
-              <w:spacing w:after="60" w:before="0"/>
-            </w:pPr>
-            <w:r>
-              <w:rPr>
-                <w:rFonts w:ascii="Calibri" w:cs="Calibri" w:eastAsia="Calibri" w:hAnsi="Calibri"/>
-                <w:b/>
-                <w:bCs/>
-                <w:color w:val="D9534F"/>
-                <w:sz w:val="20"/>
-                <w:szCs w:val="20"/>
-              </w:rPr>
-              <w:t xml:space="preserve">Ansage: </w:t>
-            </w:r>
-            <w:r>
-              <w:rPr>
-                <w:rFonts w:ascii="Calibri" w:cs="Calibri" w:eastAsia="Calibri" w:hAnsi="Calibri"/>
-                <w:i/>
-                <w:iCs/>
-                <w:color w:val="000000"/>
-                <w:sz w:val="21"/>
-                <w:szCs w:val="21"/>
-              </w:rPr>
-              <w:t xml:space="preserve">„Stifte liegen. Ihr schreibt noch nichts auf. Entscheidet still: wahr oder falsch? Dann meldet ihr euch und begründet.“</w:t>
-            </w:r>
-          </w:p>
-          <w:p>
-            <w:pPr>
-              <w:spacing w:after="50" w:before="0"/>
-            </w:pPr>
-            <w:r>
-              <w:rPr>
-                <w:rFonts w:ascii="Calibri" w:cs="Calibri" w:eastAsia="Calibri" w:hAnsi="Calibri"/>
-                <w:color w:val="000000"/>
-                <w:sz w:val="21"/>
-                <w:szCs w:val="21"/>
-              </w:rPr>
-              <w:t xml:space="preserve">Die vier Behauptungen stehen auf Folie 3 (oder vorher an der Tafel). Pro Behauptung eine Antwort mit Begründung, bei „falsch“ wird die Aussage verbessert.</w:t>
-            </w:r>
-          </w:p>
-          <w:p>
-            <w:pPr>
-              <w:spacing w:after="50" w:before="0"/>
-            </w:pPr>
-            <w:r>
-              <w:rPr>
-                <w:rFonts w:ascii="Calibri" w:cs="Calibri" w:eastAsia="Calibri" w:hAnsi="Calibri"/>
-                <w:color w:val="000000"/>
-                <w:sz w:val="21"/>
-                <w:szCs w:val="21"/>
-              </w:rPr>
-              <w:t xml:space="preserve">Die Antworten zeigen, was schon sitzt. Nicht ausführlich erklären: Was unsicher ist, kommt in den folgenden Phasen.</w:t>
-            </w:r>
-          </w:p>
-          <w:tbl>
-            <w:tblPr>
-              <w:tblW w:type="dxa" w:w="8166"/>
-              <w:tblBorders>
-                <w:top w:val="single" w:color="auto" w:sz="4"/>
-                <w:left w:val="single" w:color="auto" w:sz="4"/>
-                <w:bottom w:val="single" w:color="auto" w:sz="4"/>
-                <w:right w:val="single" w:color="auto" w:sz="4"/>
-                <w:insideH w:val="single" w:color="auto" w:sz="4"/>
-                <w:insideV w:val="single" w:color="auto" w:sz="4"/>
-              </w:tblBorders>
-            </w:tblPr>
-            <w:tblGrid>
-              <w:gridCol w:w="8166"/>
-            </w:tblGrid>
-            <w:tr>
-              <w:trPr>
-                <w:cantSplit/>
-              </w:trPr>
-              <w:tc>
-                <w:tcPr>
-                  <w:tcW w:type="dxa" w:w="8166"/>
-                  <w:tcBorders>
-                    <w:top w:val="single" w:color="3D4A3F" w:sz="12"/>
-                    <w:left w:val="single" w:color="3D4A3F" w:sz="12"/>
-                    <w:bottom w:val="single" w:color="3D4A3F" w:sz="12"/>
-                    <w:right w:val="single" w:color="3D4A3F" w:sz="12"/>
-                  </w:tcBorders>
-                  <w:shd w:fill="3D4A3F" w:color="auto" w:val="clear"/>
-                  <w:tcMar>
-                    <w:top w:type="dxa" w:w="30"/>
-                    <w:left w:type="dxa" w:w="100"/>
-                    <w:bottom w:type="dxa" w:w="30"/>
-                    <w:right w:type="dxa" w:w="100"/>
-                  </w:tcMar>
-                  <w:vAlign w:val="center"/>
-                </w:tcPr>
-                <w:p>
-                  <w:pPr>
-                    <w:spacing w:after="0" w:before="0"/>
-                  </w:pPr>
-                  <w:r>
-                    <w:rPr>
-                      <w:rFonts w:ascii="Calibri" w:cs="Calibri" w:eastAsia="Calibri" w:hAnsi="Calibri"/>
-                      <w:b/>
-                      <w:bCs/>
-                      <w:color w:val="FFFFFF"/>
-                      <w:sz w:val="16"/>
-                      <w:szCs w:val="16"/>
-                    </w:rPr>
-                    <w:t xml:space="preserve">TAFEL · Mitte · Behauptungen</w:t>
+                    <w:t xml:space="preserve">TAFEL · Folien · Aussagen und Antworten</w:t>
                   </w:r>
                 </w:p>
               </w:tc>
@@ -3488,7 +3620,7 @@
                       <w:sz w:val="22"/>
                       <w:szCs w:val="22"/>
                     </w:rPr>
-                    <w:t xml:space="preserve">1  Der Dritte Stand war mit Abstand der größte Stand.</w:t>
+                    <w:t xml:space="preserve">1  Der Dritte Stand (Bauern und Bürger) war mit Abstand der größte Stand.  →  WAHR: ca. 20 Mio. gegenüber ca. 500 000 Adligen und ca. 150 000 Geistlichen.</w:t>
                   </w:r>
                 </w:p>
                 <w:p>
@@ -3502,7 +3634,7 @@
                       <w:sz w:val="22"/>
                       <w:szCs w:val="22"/>
                     </w:rPr>
-                    <w:t xml:space="preserve">2  Der Adel musste hohe Steuern an den König zahlen.</w:t>
+                    <w:t xml:space="preserve">2  Der Adel musste hohe Steuern an den König zahlen.  →  FALSCH: Der Adel war steuerfrei (Vorrecht). Steuern zahlte der Dritte Stand (Bauern und Bürger).</w:t>
                   </w:r>
                 </w:p>
                 <w:p>
@@ -3516,7 +3648,7 @@
                       <w:sz w:val="22"/>
                       <w:szCs w:val="22"/>
                     </w:rPr>
-                    <w:t xml:space="preserve">3  Ludwig XIV. verzichtete auf Söldner und baute ein stehendes Heer auf.</w:t>
+                    <w:t xml:space="preserve">3  Ludwig XIV. verzichtete auf Söldner und baute ein stehendes Heer auf.  →  WAHR: Säule Heer, bis zu 400 000 Mann.</w:t>
                   </w:r>
                 </w:p>
                 <w:p>
@@ -3530,7 +3662,7 @@
                       <w:sz w:val="22"/>
                       <w:szCs w:val="22"/>
                     </w:rPr>
-                    <w:t xml:space="preserve">4  Ludwig XIV. erlaubte den Protestanten die freie Religionsausübung.</w:t>
+                    <w:t xml:space="preserve">4  Ludwig XIV. erlaubte den Protestanten die freie Religionsausübung.  →  FALSCH: 1685 beendete er die religiöse Toleranz (ein König, ein Glaube).</w:t>
                   </w:r>
                 </w:p>
               </w:tc>
@@ -3572,7 +3704,7 @@
                 <w:sz w:val="19"/>
                 <w:szCs w:val="19"/>
               </w:rPr>
-              <w:t xml:space="preserve">1 wahr (ca. 20 Millionen von gut 20,6 Millionen) · 2 falsch: Der Adel musste keine Steuern zahlen (Vorrecht) · 3 wahr (Säule Heer) · 4 falsch: 1685 beendete er die religiöse Toleranz, ein König, ein Glaube (Säule Religion).</w:t>
+              <w:t xml:space="preserve">Nicht ausführlich erklären: Was unsicher bleibt, kommt in den folgenden Phasen. Impulse im Gespräch: zu 1 Wer gehört zum Dritten Stand? · zu 2 Welche weiteren Vorrechte kennt ihr? · zu 3 Was kostet ein solches Heer? (ein Drittel des Staatshaushalts in Friedenszeiten) · zu 4 Wie passt das zum Gottesgnadentum?</w:t>
             </w:r>
           </w:p>
         </w:tc>
@@ -3628,7 +3760,7 @@
           <w:sz w:val="20"/>
           <w:szCs w:val="20"/>
         </w:rPr>
-        <w:t xml:space="preserve">   7 Min.</w:t>
+        <w:t xml:space="preserve">   6 Min.</w:t>
       </w:r>
     </w:p>
     <w:tbl>
@@ -4154,20 +4286,6 @@
                       <w:szCs w:val="20"/>
                     </w:rPr>
                     <w:t xml:space="preserve">Beispiel: Ludwig XIV. verkündet 1661: „Ich regiere jetzt selbst.“</w:t>
-                  </w:r>
-                </w:p>
-                <w:p>
-                  <w:pPr>
-                    <w:spacing w:after="50" w:before="0"/>
-                  </w:pPr>
-                  <w:r>
-                    <w:rPr>
-                      <w:rFonts w:ascii="Cambria" w:cs="Cambria" w:eastAsia="Cambria" w:hAnsi="Cambria"/>
-                      <w:color w:val="5B6B8C"/>
-                      <w:sz w:val="20"/>
-                      <w:szCs w:val="20"/>
-                    </w:rPr>
-                    <w:t xml:space="preserve">Wofür? Den Begriff einordnen – Grundlage für den Test.</w:t>
                   </w:r>
                 </w:p>
                 <w:p>
@@ -4595,7 +4713,7 @@
                       <w:sz w:val="19"/>
                       <w:szCs w:val="19"/>
                     </w:rPr>
-                    <w:t xml:space="preserve">4 Minuten · allein · leise</w:t>
+                    <w:t xml:space="preserve">3 Minuten · allein · leise</w:t>
                   </w:r>
                   <w:r>
                     <w:rPr>
@@ -6225,7 +6343,7 @@
                       <w:sz w:val="22"/>
                       <w:szCs w:val="22"/>
                     </w:rPr>
-                    <w:t xml:space="preserve">In der Ständegesellschaft gehört jeder Mensch durch Geburt zu einem von drei Ständen: Klerus (ca. 150 000), Adel (ca. 500 000) und Dritter Stand (ca. 20 000 000). Klerus und Adel haben Vorrechte. Der Dritte Stand zahlt Steuern und Abgaben und ist von der politischen Mitbestimmung ausgeschlossen.</w:t>
+                    <w:t xml:space="preserve">In der Ständegesellschaft gehört jeder Mensch durch Geburt zu einem von drei Ständen: Klerus (ca. 150 000), Adel (ca. 500 000) und Dritter Stand (Bauern und Bürger, ca. 20 000 000). Klerus und Adel haben Vorrechte. Der Dritte Stand zahlt Steuern und Abgaben und ist von der politischen Mitbestimmung ausgeschlossen.</w:t>
                   </w:r>
                 </w:p>
                 <w:p>
@@ -6240,20 +6358,6 @@
                       <w:szCs w:val="20"/>
                     </w:rPr>
                     <w:t xml:space="preserve">Beispiel: Adel: alleiniges Jagdrecht · Klerus: Kirchenzehnt · Dritter Stand: hohe Abgaben.</w:t>
-                  </w:r>
-                </w:p>
-                <w:p>
-                  <w:pPr>
-                    <w:spacing w:after="50" w:before="0"/>
-                  </w:pPr>
-                  <w:r>
-                    <w:rPr>
-                      <w:rFonts w:ascii="Cambria" w:cs="Cambria" w:eastAsia="Cambria" w:hAnsi="Cambria"/>
-                      <w:color w:val="5B6B8C"/>
-                      <w:sz w:val="20"/>
-                      <w:szCs w:val="20"/>
-                    </w:rPr>
-                    <w:t xml:space="preserve">Wofür? Erklären, warum Ludwig den Adel bei Laune hält und warum der Dritte Stand die Last trägt.</w:t>
                   </w:r>
                 </w:p>
                 <w:p>
@@ -6340,7 +6444,7 @@
           <w:sz w:val="20"/>
           <w:szCs w:val="20"/>
         </w:rPr>
-        <w:t xml:space="preserve">   9 Min.</w:t>
+        <w:t xml:space="preserve">   8 Min.</w:t>
       </w:r>
     </w:p>
     <w:tbl>
@@ -6454,6 +6558,20 @@
                 <w:szCs w:val="21"/>
               </w:rPr>
               <w:t xml:space="preserve">„Jetzt arbeitet ihr allein. Die Aufgabe steht rechts.“</w:t>
+            </w:r>
+          </w:p>
+          <w:p>
+            <w:pPr>
+              <w:spacing w:after="50" w:before="0"/>
+            </w:pPr>
+            <w:r>
+              <w:rPr>
+                <w:rFonts w:ascii="Calibri" w:cs="Calibri" w:eastAsia="Calibri" w:hAnsi="Calibri"/>
+                <w:color w:val="000000"/>
+                <w:sz w:val="21"/>
+                <w:szCs w:val="21"/>
+              </w:rPr>
+              <w:t xml:space="preserve">Folie 19 zeigen: Die Karikatur gibt Hinweise auf Vorrechte und Lasten der Stände (aktuell: Karikatur „Drei Stände“ von 1789; die Karikatur mit Sprechblasen kann die Bilddatei in quellcode/praesentation.js ersetzen).</w:t>
             </w:r>
           </w:p>
           <w:tbl>
@@ -6557,7 +6675,7 @@
                       <w:sz w:val="21"/>
                       <w:szCs w:val="21"/>
                     </w:rPr>
-                    <w:t xml:space="preserve">Schreibe Ü4 an den Rand und wähle einen Stand.</w:t>
+                    <w:t xml:space="preserve">Schreibe Ü4 an den Rand. Betrachte die Karikatur.</w:t>
                   </w:r>
                 </w:p>
                 <w:p>
@@ -6584,7 +6702,7 @@
                       <w:sz w:val="21"/>
                       <w:szCs w:val="21"/>
                     </w:rPr>
-                    <w:t xml:space="preserve">Schreibe den Satz ab und beende ihn: „Im Absolutismus fühle ich mich …, weil …“</w:t>
+                    <w:t xml:space="preserve">Wähle einen Stand und beende den Satz: „Im Absolutismus fühle ich mich …, weil …“</w:t>
                   </w:r>
                 </w:p>
                 <w:p>
@@ -6611,7 +6729,7 @@
                       <w:sz w:val="21"/>
                       <w:szCs w:val="21"/>
                     </w:rPr>
-                    <w:t xml:space="preserve">Nenne mindestens ein Recht und eine Pflicht deines Standes.</w:t>
+                    <w:t xml:space="preserve">Nenne ein Recht und eine Pflicht deines Standes.</w:t>
                   </w:r>
                 </w:p>
                 <w:p>
@@ -6641,7 +6759,7 @@
                       <w:sz w:val="22"/>
                       <w:szCs w:val="22"/>
                     </w:rPr>
-                    <w:t xml:space="preserve">Hilfe:  </w:t>
+                    <w:t xml:space="preserve">Stände:  </w:t>
                   </w:r>
                   <w:r>
                     <w:rPr>
@@ -6650,7 +6768,7 @@
                       <w:sz w:val="22"/>
                       <w:szCs w:val="22"/>
                     </w:rPr>
-                    <w:t xml:space="preserve">privilegiert · sicher · zufrieden · ausgenutzt · benachteiligt · machtlos · überlastet</w:t>
+                    <w:t xml:space="preserve">Klerus (Geistliche) · Adel · Dritter Stand (Bauern und Bürger)</w:t>
                   </w:r>
                 </w:p>
                 <w:p>
@@ -6689,7 +6807,7 @@
                       <w:sz w:val="19"/>
                       <w:szCs w:val="19"/>
                     </w:rPr>
-                    <w:t xml:space="preserve">6 Minuten · allein · leise</w:t>
+                    <w:t xml:space="preserve">5 Minuten · allein · leise</w:t>
                   </w:r>
                   <w:r>
                     <w:rPr>
@@ -6914,7 +7032,7 @@
                 <w:sz w:val="21"/>
                 <w:szCs w:val="21"/>
               </w:rPr>
-              <w:t xml:space="preserve">Typische Fehler: Adel zahlt Steuern · Klerus leistet Wehrdienst (ist befreit) · Dritter Stand hat Vorrechte.</w:t>
+              <w:t xml:space="preserve">Typische Fehler: Adel zahlt Steuern · Klerus leistet Wehrdienst (ist befreit) · Dritter Stand (Bauern und Bürger) hat Vorrechte.</w:t>
             </w:r>
           </w:p>
           <w:p>
@@ -7083,7 +7201,7 @@
                 <w:sz w:val="21"/>
                 <w:szCs w:val="21"/>
               </w:rPr>
-              <w:t xml:space="preserve">Wer möchte, ergänzt seine Begründung um einen Fachbegriff aus der Liste.</w:t>
+              <w:t xml:space="preserve">Wer möchte, ergänzt seine Begründung um einen Fachbegriff (Vorrechte, Steuerfreiheit, Jagdrecht, Kirchenzehnt, Pachtgebühren, Mitbestimmung).</w:t>
             </w:r>
           </w:p>
         </w:tc>
@@ -7266,7 +7384,7 @@
                 <w:sz w:val="21"/>
                 <w:szCs w:val="21"/>
               </w:rPr>
-              <w:t xml:space="preserve">Folie 12 zeigen, Testtermin noch einmal nennen, Fragen zum Test beantworten.</w:t>
+              <w:t xml:space="preserve">Folie 21 zeigen, Testtermin noch einmal nennen, Fragen zum Test beantworten.</w:t>
             </w:r>
           </w:p>
         </w:tc>
@@ -7533,7 +7651,7 @@
                 <w:sz w:val="20"/>
                 <w:szCs w:val="20"/>
               </w:rPr>
-              <w:t xml:space="preserve">Absolutismus: Definition, Beispiel Ludwig XIV., Wofür, Test – rot umrahmt</w:t>
+              <w:t xml:space="preserve">Absolutismus: Definition, Beispiel Ludwig XIV., Test – rot umrahmt</w:t>
             </w:r>
           </w:p>
         </w:tc>

</xml_diff>